<commit_message>
Align report with the lecturer's format and script output
Answer each sub-question directly in the template's order and show only
output printed by the provided R script, under the script's own commands.
Remove the supplementary analyses (summary tables, partial F-test, CV
comparison, correlations/VIFs, search-path table). LASSO estimates stay
at lambda.min as the assignment requires.

Co-Authored-By: Claude Opus 5.5 <noreply@anthropic.com>
Claude-Session: https://claude.ai/code/session_01FKnFsXW2bsaJK9HyqPLTfn
</commit_message>
<xml_diff>
--- a/output/Final_Project_STA6166_Completed.docx
+++ b/output/Final_Project_STA6166_Completed.docx
@@ -2164,10 +2164,6 @@
         <w:ind w:left="288"/>
       </w:pPr>
       <w:r>
-        <w:rPr/>
-        <w:t xml:space="preserve">The full model explains about 65% of the variation in Y: </w:t>
-      </w:r>
-      <w:r>
         <w:rPr>
           <w:b/>
         </w:rPr>
@@ -2185,17 +2181,7 @@
       </w:r>
       <w:r>
         <w:rPr/>
-        <w:t>. It is highly significant overall (F = 10.43 on 15 and 84 df, p = 1.442e-13). Five slopes are significant at the 5% level (</w:t>
-      </w:r>
-      <w:r>
-        <w:rPr>
-          <w:b/>
-        </w:rPr>
-        <w:t>X1, X4, X10, X13, X14</w:t>
-      </w:r>
-      <w:r>
-        <w:rPr/>
-        <w:t>). X7 is borderline (p = 0.057), and the other nine predictors are not significant. The intercept is 1.5842 (SE = 0.7122, t = 2.224, p = 0.0288).</w:t>
+        <w:t>. The overall F-test is highly significant (F = 10.43 on 15 and 84 DF, p-value = 1.442e-13). At the 5% level, X1, X4, X10, X13 and X14 are significant predictors; X7 is borderline (p = 0.057121).</w:t>
       </w:r>
     </w:p>
     <w:p>
@@ -2300,7 +2286,7 @@
       </w:r>
       <w:r>
         <w:rPr/>
-        <w:t xml:space="preserve"> the error variance is constant, Var(εᵢ | Xᵢ) = σ² for all i (homoscedasticity).</w:t>
+        <w:t xml:space="preserve"> the error variance is constant (homoscedasticity), Var(εᵢ) = σ² for all i.</w:t>
       </w:r>
     </w:p>
     <w:p>
@@ -2319,7 +2305,7 @@
       </w:r>
       <w:r>
         <w:rPr/>
-        <w:t xml:space="preserve"> the error variance depends on the predictors X₁, …, X₁₅ (heteroscedasticity).</w:t>
+        <w:t xml:space="preserve"> the error variance is not constant; it depends on the predictors (heteroscedasticity).</w:t>
       </w:r>
     </w:p>
     <w:p>
@@ -2341,6 +2327,10 @@
         <w:ind w:left="288"/>
       </w:pPr>
       <w:r>
+        <w:rPr/>
+        <w:t xml:space="preserve">Test statistic </w:t>
+      </w:r>
+      <w:r>
         <w:rPr>
           <w:b/>
         </w:rPr>
@@ -2348,7 +2338,7 @@
       </w:r>
       <w:r>
         <w:rPr/>
-        <w:t xml:space="preserve"> on 15 df, </w:t>
+        <w:t xml:space="preserve"> (df = 15); </w:t>
       </w:r>
       <w:r>
         <w:rPr>
@@ -2374,7 +2364,7 @@
           <w:color w:val="2F5496"/>
           <w:sz w:val="17"/>
         </w:rPr>
-        <w:t>&gt; bptest(full_model)</w:t>
+        <w:t>&gt; print(bp_result)</w:t>
       </w:r>
     </w:p>
     <w:p>
@@ -2463,7 +2453,7 @@
       </w:r>
       <w:r>
         <w:rPr/>
-        <w:t xml:space="preserve"> Since p = 0.2802 &gt; 0.05, we fail to reject H₀. There is no significant evidence of unequal error variances, so the constant-variance assumption is reasonable.</w:t>
+        <w:t xml:space="preserve"> Since p-value = 0.2802 &gt; 0.05, we fail to reject H₀. There is not enough evidence of unequal error variances.</w:t>
       </w:r>
     </w:p>
     <w:p>
@@ -2507,7 +2497,7 @@
       </w:r>
       <w:r>
         <w:rPr/>
-        <w:t xml:space="preserve"> the regression errors are normally distributed.</w:t>
+        <w:t xml:space="preserve"> the residuals come from a normal distribution.</w:t>
       </w:r>
     </w:p>
     <w:p>
@@ -2526,7 +2516,7 @@
       </w:r>
       <w:r>
         <w:rPr/>
-        <w:t xml:space="preserve"> the regression errors are not normally distributed.</w:t>
+        <w:t xml:space="preserve"> the residuals do not come from a normal distribution.</w:t>
       </w:r>
     </w:p>
     <w:p>
@@ -2548,6 +2538,10 @@
         <w:ind w:left="288"/>
       </w:pPr>
       <w:r>
+        <w:rPr/>
+        <w:t xml:space="preserve">Test statistic </w:t>
+      </w:r>
+      <w:r>
         <w:rPr>
           <w:b/>
         </w:rPr>
@@ -2555,7 +2549,7 @@
       </w:r>
       <w:r>
         <w:rPr/>
-        <w:t xml:space="preserve">, </w:t>
+        <w:t xml:space="preserve">; </w:t>
       </w:r>
       <w:r>
         <w:rPr>
@@ -2581,7 +2575,7 @@
           <w:color w:val="2F5496"/>
           <w:sz w:val="17"/>
         </w:rPr>
-        <w:t>&gt; shapiro.test(residuals(full_model))</w:t>
+        <w:t>&gt; print(shapiro_result)</w:t>
       </w:r>
     </w:p>
     <w:p>
@@ -2670,7 +2664,7 @@
       </w:r>
       <w:r>
         <w:rPr/>
-        <w:t xml:space="preserve"> Since p = 0.7795 &gt; 0.05, we fail to reject H₀. The residuals show no evidence of non-normality. (OLS residuals are slightly correlated and have unequal variances, so this p-value is a descriptive check rather than an exact test.)</w:t>
+        <w:t xml:space="preserve"> Since p-value = 0.7795 &gt; 0.05, we fail to reject H₀. There is not enough evidence that the residuals depart from normality.</w:t>
       </w:r>
     </w:p>
     <w:p>
@@ -2754,11 +2748,21 @@
         <w:rPr>
           <w:b/>
         </w:rPr>
-        <w:t>(a) Residuals vs fitted.</w:t>
+        <w:t>(a) Residuals vs fitted:</w:t>
       </w:r>
       <w:r>
         <w:rPr/>
-        <w:t xml:space="preserve"> The points scatter randomly around zero, with roughly constant spread across the fitted values and no funnel shape. The red smoother dips at both ends, but only because of a few points at extreme fitted values (e.g., observation 76), not a systematic curve. This supports constant variance and agrees with the Breusch–Pagan test.</w:t>
+        <w:t xml:space="preserve"> the residuals are scattered randomly around zero with roughly the same spread across all fitted values, and there is no funnel shape. The slight bend in the red line at the ends comes from a few extreme points (e.g., observation 76), not a systematic pattern. This is consistent with </w:t>
+      </w:r>
+      <w:r>
+        <w:rPr>
+          <w:b/>
+        </w:rPr>
+        <w:t>constant error variance</w:t>
+      </w:r>
+      <w:r>
+        <w:rPr/>
+        <w:t>.</w:t>
       </w:r>
     </w:p>
     <w:p>
@@ -2773,11 +2777,21 @@
         <w:rPr>
           <w:b/>
         </w:rPr>
-        <w:t>(b) Normal Q–Q.</w:t>
+        <w:t>(b) Normal Q–Q:</w:t>
       </w:r>
       <w:r>
         <w:rPr/>
-        <w:t xml:space="preserve"> The standardized residuals follow the reference line closely, with only small departures in the tails (observations 39, 76 and 4). This supports normal errors and agrees with the Shapiro–Wilk test.</w:t>
+        <w:t xml:space="preserve"> the points lie close to the reference line, with only small deviations in the tails (observations 39, 76 and 4). This is consistent with </w:t>
+      </w:r>
+      <w:r>
+        <w:rPr>
+          <w:b/>
+        </w:rPr>
+        <w:t>normality</w:t>
+      </w:r>
+      <w:r>
+        <w:rPr/>
+        <w:t>.</w:t>
       </w:r>
     </w:p>
     <w:p>
@@ -2789,14 +2803,8 @@
         <w:ind w:left="288"/>
       </w:pPr>
       <w:r>
-        <w:rPr>
-          <w:b/>
-        </w:rPr>
-        <w:t>Conclusion:</w:t>
-      </w:r>
-      <w:r>
         <w:rPr/>
-        <w:t xml:space="preserve"> the constant-variance and normality assumptions of the full model are reasonable.</w:t>
+        <w:t>Both plots agree with the Breusch–Pagan and Shapiro–Wilk results.</w:t>
       </w:r>
     </w:p>
     <w:p>
@@ -2847,7 +2855,7 @@
         <w:rPr>
           <w:b/>
         </w:rPr>
-        <w:t>Chosen procedure: bidirectional stepwise selection.</w:t>
+        <w:t>I chose bidirectional stepwise selection.</w:t>
       </w:r>
     </w:p>
     <w:p>
@@ -2860,14 +2868,8 @@
         <w:ind w:left="648" w:hanging="288"/>
       </w:pPr>
       <w:r>
-        <w:rPr>
-          <w:b/>
-        </w:rPr>
-        <w:t>Start:</w:t>
-      </w:r>
-      <w:r>
         <w:rPr/>
-        <w:t xml:space="preserve"> the intercept-only model, Y ~ 1.</w:t>
+        <w:t>It starts from the intercept-only model (Y ~ 1).</w:t>
       </w:r>
     </w:p>
     <w:p>
@@ -2880,34 +2882,8 @@
         <w:ind w:left="648" w:hanging="288"/>
       </w:pPr>
       <w:r>
-        <w:rPr>
-          <w:b/>
-        </w:rPr>
-        <w:t>Each step:</w:t>
-      </w:r>
-      <w:r>
         <w:rPr/>
-        <w:t xml:space="preserve"> try every single </w:t>
-      </w:r>
-      <w:r>
-        <w:rPr>
-          <w:b/>
-        </w:rPr>
-        <w:t>addition</w:t>
-      </w:r>
-      <w:r>
-        <w:rPr/>
-        <w:t xml:space="preserve"> of a predictor not in the model and every single </w:t>
-      </w:r>
-      <w:r>
-        <w:rPr>
-          <w:b/>
-        </w:rPr>
-        <w:t>removal</w:t>
-      </w:r>
-      <w:r>
-        <w:rPr/>
-        <w:t xml:space="preserve"> of a predictor in the model, then make the move that lowers the criterion most.</w:t>
+        <w:t>At each step it considers adding each predictor not yet in the model and removing each predictor already in the model, and it makes the one move that improves the criterion most.</w:t>
       </w:r>
     </w:p>
     <w:p>
@@ -2920,14 +2896,8 @@
         <w:ind w:left="648" w:hanging="288"/>
       </w:pPr>
       <w:r>
-        <w:rPr>
-          <w:b/>
-        </w:rPr>
-        <w:t>Why both directions:</w:t>
-      </w:r>
-      <w:r>
         <w:rPr/>
-        <w:t xml:space="preserve"> a predictor added early can be dropped later if others make it redundant, which pure forward selection cannot do.</w:t>
+        <w:t>Because removal is allowed at every step, a predictor added earlier can be dropped later if it is no longer useful.</w:t>
       </w:r>
     </w:p>
     <w:p>
@@ -2940,14 +2910,79 @@
         <w:ind w:left="648" w:hanging="288"/>
       </w:pPr>
       <w:r>
+        <w:rPr/>
+        <w:t>It stops when no single addition or removal improves the criterion.</w:t>
+      </w:r>
+    </w:p>
+    <w:p>
+      <w:pPr>
+        <w:keepNext/>
+        <w:spacing w:before="280"/>
+      </w:pPr>
+      <w:r>
         <w:rPr>
           <w:b/>
         </w:rPr>
-        <w:t>Stop:</w:t>
-      </w:r>
+        <w:t xml:space="preserve">Question 6. Choose one selection criterion (5 points). </w:t>
+      </w:r>
+      <w:r>
+        <w:t>Choose exactly one criterion: AIC, BIC, Mallows’ Cₚ, or adjusted R². Explain what the criterion measures and why you chose it. Once selected, keep this criterion fixed throughout Part 2; do not switch criteria after seeing the results.</w:t>
+      </w:r>
+    </w:p>
+    <w:p>
+      <w:r>
+        <w:t>For AIC or BIC, you may use stats::step() with forward, backward, or bidirectional search. For Cₚ or adjusted R², you may use leaps::regsubsets() with forward or backward search. The seqrep method in regsubsets() is sequential replacement, not bidirectional stepwise regression. If you choose an unsupported combination, you must implement and document the search algorithm yourself. You may revise your initial choice of search procedure before running the analysis to use one of the supported combinations.</w:t>
+      </w:r>
+    </w:p>
+    <w:p>
+      <w:pPr>
+        <w:pBdr>
+          <w:left w:val="single" w:sz="18" w:space="8" w:color="2F5496"/>
+        </w:pBdr>
+        <w:spacing w:after="100" w:before="0"/>
+        <w:ind w:left="288"/>
+      </w:pPr>
+      <w:r>
+        <w:rPr>
+          <w:b/>
+        </w:rPr>
+        <w:t>I chose BIC (Bayesian Information Criterion).</w:t>
+      </w:r>
+    </w:p>
+    <w:p>
+      <w:pPr>
+        <w:pBdr>
+          <w:left w:val="single" w:sz="18" w:space="8" w:color="2F5496"/>
+        </w:pBdr>
+        <w:spacing w:after="100" w:before="0"/>
+        <w:ind w:left="288"/>
+      </w:pPr>
       <w:r>
         <w:rPr/>
-        <w:t xml:space="preserve"> when no single addition or removal improves the criterion.</w:t>
+        <w:t xml:space="preserve">BIC = −2 log L + p·log(N), where L is the maximized likelihood, p the number of parameters and N the sample size. It measures how well the model fits, with a penalty for every extra parameter; the model with the </w:t>
+      </w:r>
+      <w:r>
+        <w:rPr>
+          <w:b/>
+        </w:rPr>
+        <w:t>smallest BIC</w:t>
+      </w:r>
+      <w:r>
+        <w:rPr/>
+        <w:t xml:space="preserve"> is preferred.</w:t>
+      </w:r>
+    </w:p>
+    <w:p>
+      <w:pPr>
+        <w:pBdr>
+          <w:left w:val="single" w:sz="18" w:space="8" w:color="2F5496"/>
+        </w:pBdr>
+        <w:spacing w:after="100" w:before="0"/>
+        <w:ind w:left="288"/>
+      </w:pPr>
+      <w:r>
+        <w:rPr/>
+        <w:t>I chose BIC because its penalty, log(100) ≈ 4.61 per parameter, is heavier than AIC's 2, so it favours simpler models. This suits the project, where only 5 of the 15 predictors are truly nonzero. BIC with bidirectional search is supported by stats::step(), using k = log(N).</w:t>
       </w:r>
     </w:p>
     <w:p>
@@ -2963,7 +2998,7 @@
           <w:color w:val="2F5496"/>
           <w:sz w:val="17"/>
         </w:rPr>
-        <w:t>&gt; step(null_model,</w:t>
+        <w:t>&gt; stepwise_BIC &lt;- step(null_model,</w:t>
       </w:r>
     </w:p>
     <w:p>
@@ -2978,7 +3013,22 @@
           <w:rFonts w:ascii="Consolas" w:hAnsi="Consolas" w:eastAsia="Consolas" w:cs="Consolas"/>
           <w:sz w:val="17"/>
         </w:rPr>
-        <w:t>+      scope = list(lower = formula(null_model), upper = formula(full_model)),</w:t>
+        <w:t>+   scope = list(lower = formula(null_model), upper = formula(full_model)),</w:t>
+      </w:r>
+    </w:p>
+    <w:p>
+      <w:pPr>
+        <w:keepNext/>
+        <w:shd w:val="clear" w:color="auto" w:fill="F2F2F2"/>
+        <w:spacing w:before="0" w:after="0" w:line="240" w:lineRule="auto"/>
+        <w:ind w:left="504" w:right="144"/>
+      </w:pPr>
+      <w:r>
+        <w:rPr>
+          <w:rFonts w:ascii="Consolas" w:hAnsi="Consolas" w:eastAsia="Consolas" w:cs="Consolas"/>
+          <w:sz w:val="17"/>
+        </w:rPr>
+        <w:t>+   direction = "both",</w:t>
       </w:r>
     </w:p>
     <w:p>
@@ -2993,7 +3043,7 @@
           <w:rFonts w:ascii="Consolas" w:hAnsi="Consolas" w:eastAsia="Consolas" w:cs="Consolas"/>
           <w:sz w:val="17"/>
         </w:rPr>
-        <w:t>+      direction = "both", k = log(N), trace = 0)</w:t>
+        <w:t>+   k = log(N), trace = 0)</w:t>
       </w:r>
     </w:p>
     <w:p>
@@ -3005,15 +3055,20 @@
         <w:rPr>
           <w:b/>
         </w:rPr>
-        <w:t xml:space="preserve">Question 6. Choose one selection criterion (5 points). </w:t>
-      </w:r>
-      <w:r>
-        <w:t>Choose exactly one criterion: AIC, BIC, Mallows’ Cₚ, or adjusted R². Explain what the criterion measures and why you chose it. Once selected, keep this criterion fixed throughout Part 2; do not switch criteria after seeing the results.</w:t>
+        <w:t xml:space="preserve">Question 7. Select predictors (10 points). </w:t>
+      </w:r>
+      <w:r>
+        <w:t>Apply the chosen search procedure and fixed criterion.</w:t>
       </w:r>
     </w:p>
     <w:p>
-      <w:r>
-        <w:t>For AIC or BIC, you may use stats::step() with forward, backward, or bidirectional search. For Cₚ or adjusted R², you may use leaps::regsubsets() with forward or backward search. The seqrep method in regsubsets() is sequential replacement, not bidirectional stepwise regression. If you choose an unsupported combination, you must implement and document the search algorithm yourself. You may revise your initial choice of search procedure before running the analysis to use one of the supported combinations.</w:t>
+      <w:pPr>
+        <w:keepNext/>
+        <w:spacing w:before="120"/>
+        <w:ind w:left="259"/>
+      </w:pPr>
+      <w:r>
+        <w:t>(a) List the predictors in the final selected model.</w:t>
       </w:r>
     </w:p>
     <w:p>
@@ -3028,7 +3083,17 @@
         <w:rPr>
           <w:b/>
         </w:rPr>
-        <w:t>Chosen criterion: BIC (Bayesian Information Criterion), minimized.</w:t>
+        <w:t>X1, X4, X10, X13 and X14.</w:t>
+      </w:r>
+    </w:p>
+    <w:p>
+      <w:pPr>
+        <w:keepNext/>
+        <w:spacing w:before="120"/>
+        <w:ind w:left="259"/>
+      </w:pPr>
+      <w:r>
+        <w:t>(b) Report the final model formula.</w:t>
       </w:r>
     </w:p>
     <w:p>
@@ -3040,177 +3105,10 @@
         <w:ind w:left="288"/>
       </w:pPr>
       <w:r>
-        <w:rPr/>
-        <w:t xml:space="preserve">BIC = −2 log L + p·log(N), where L is the maximized likelihood and p the number of parameters; for a Gaussian linear model this equals N·log(RSS/N) + p·log(N) plus a constant. The first term measures </w:t>
-      </w:r>
-      <w:r>
-        <w:rPr>
-          <w:b/>
-        </w:rPr>
-        <w:t>lack of fit</w:t>
-      </w:r>
-      <w:r>
-        <w:rPr/>
-        <w:t xml:space="preserve"> and the second penalizes </w:t>
-      </w:r>
-      <w:r>
-        <w:rPr>
-          <w:b/>
-        </w:rPr>
-        <w:t>complexity</w:t>
-      </w:r>
-      <w:r>
-        <w:rPr/>
-        <w:t>. A lower BIC means a better balance.</w:t>
-      </w:r>
-    </w:p>
-    <w:p>
-      <w:pPr>
-        <w:pBdr>
-          <w:left w:val="single" w:sz="18" w:space="8" w:color="2F5496"/>
-        </w:pBdr>
-        <w:spacing w:after="100" w:before="0"/>
-        <w:ind w:left="288"/>
-      </w:pPr>
-      <w:r>
-        <w:rPr>
-          <w:b/>
-        </w:rPr>
-        <w:t>Why BIC:</w:t>
-      </w:r>
-    </w:p>
-    <w:p>
-      <w:pPr>
-        <w:pStyle w:val="ListBullet"/>
-        <w:pBdr>
-          <w:left w:val="single" w:sz="18" w:space="8" w:color="2F5496"/>
-        </w:pBdr>
-        <w:spacing w:after="100" w:before="0"/>
-        <w:ind w:left="648" w:hanging="288"/>
-      </w:pPr>
-      <w:r>
-        <w:rPr/>
-        <w:t>Its penalty is log(100) ≈ 4.61 per parameter, more than twice AIC's 2, so it favours parsimonious models.</w:t>
-      </w:r>
-    </w:p>
-    <w:p>
-      <w:pPr>
-        <w:pStyle w:val="ListBullet"/>
-        <w:pBdr>
-          <w:left w:val="single" w:sz="18" w:space="8" w:color="2F5496"/>
-        </w:pBdr>
-        <w:spacing w:after="100" w:before="0"/>
-        <w:ind w:left="648" w:hanging="288"/>
-      </w:pPr>
-      <w:r>
-        <w:rPr/>
-        <w:t xml:space="preserve">It is </w:t>
-      </w:r>
-      <w:r>
-        <w:rPr>
-          <w:b/>
-        </w:rPr>
-        <w:t>consistent</w:t>
-      </w:r>
-      <w:r>
-        <w:rPr/>
-        <w:t>: if the true model is among the candidates, BIC picks it with probability approaching 1 as N grows. That suits this project, whose aim is to recover a sparse set of truly nonzero predictors.</w:t>
-      </w:r>
-    </w:p>
-    <w:p>
-      <w:pPr>
-        <w:pStyle w:val="ListBullet"/>
-        <w:pBdr>
-          <w:left w:val="single" w:sz="18" w:space="8" w:color="2F5496"/>
-        </w:pBdr>
-        <w:spacing w:after="100" w:before="0"/>
-        <w:ind w:left="648" w:hanging="288"/>
-      </w:pPr>
-      <w:r>
-        <w:rPr/>
-        <w:t>Bidirectional search with BIC is supported directly by stats::step(), so no custom algorithm is needed.</w:t>
-      </w:r>
-    </w:p>
-    <w:p>
-      <w:pPr>
-        <w:pBdr>
-          <w:left w:val="single" w:sz="18" w:space="8" w:color="2F5496"/>
-        </w:pBdr>
-        <w:spacing w:after="100" w:before="0"/>
-        <w:ind w:left="288"/>
-      </w:pPr>
-      <w:r>
-        <w:rPr/>
-        <w:t>The criterion was fixed before the analysis was run.</w:t>
-      </w:r>
-    </w:p>
-    <w:p>
-      <w:pPr>
-        <w:keepNext/>
-        <w:spacing w:before="280"/>
-      </w:pPr>
-      <w:r>
-        <w:rPr>
-          <w:b/>
-        </w:rPr>
-        <w:t xml:space="preserve">Question 7. Select predictors (10 points). </w:t>
-      </w:r>
-      <w:r>
-        <w:t>Apply the chosen search procedure and fixed criterion.</w:t>
-      </w:r>
-    </w:p>
-    <w:p>
-      <w:pPr>
-        <w:keepNext/>
-        <w:spacing w:before="120"/>
-        <w:ind w:left="259"/>
-      </w:pPr>
-      <w:r>
-        <w:t>(a) List the predictors in the final selected model.</w:t>
-      </w:r>
-    </w:p>
-    <w:p>
-      <w:pPr>
-        <w:pBdr>
-          <w:left w:val="single" w:sz="18" w:space="8" w:color="2F5496"/>
-        </w:pBdr>
-        <w:spacing w:after="100" w:before="0"/>
-        <w:ind w:left="288"/>
-      </w:pPr>
-      <w:r>
-        <w:rPr>
-          <w:b/>
-        </w:rPr>
-        <w:t>X1, X4, X10, X13 and X14.</w:t>
-      </w:r>
-    </w:p>
-    <w:p>
-      <w:pPr>
-        <w:keepNext/>
-        <w:spacing w:before="120"/>
-        <w:ind w:left="259"/>
-      </w:pPr>
-      <w:r>
-        <w:t>(b) Report the final model formula.</w:t>
-      </w:r>
-    </w:p>
-    <w:p>
-      <w:pPr>
-        <w:pBdr>
-          <w:left w:val="single" w:sz="18" w:space="8" w:color="2F5496"/>
-        </w:pBdr>
-        <w:spacing w:after="100" w:before="0"/>
-        <w:ind w:left="288"/>
-      </w:pPr>
-      <w:r>
         <w:rPr>
           <w:b/>
         </w:rPr>
         <w:t>Y ~ X10 + X4 + X13 + X14 + X1</w:t>
-      </w:r>
-      <w:r>
-        <w:rPr/>
-        <w:t xml:space="preserve"> (in order of entry), i.e.</w:t>
       </w:r>
     </w:p>
     <w:p>
@@ -3281,10 +3179,6 @@
         </w:rPr>
         <w:t>BIC = 680.8865</w:t>
       </w:r>
-      <w:r>
-        <w:rPr/>
-        <w:t>, down from 752.8193 for the intercept-only model.</w:t>
-      </w:r>
     </w:p>
     <w:p>
       <w:pPr>
@@ -3343,7 +3237,7 @@
       </w:r>
       <w:r>
         <w:rPr/>
-        <w:t xml:space="preserve"> (intercept excluded).</w:t>
+        <w:t xml:space="preserve"> (excluding the intercept).</w:t>
       </w:r>
     </w:p>
     <w:p>
@@ -3356,629 +3250,9 @@
       </w:pPr>
       <w:r>
         <w:rPr/>
-        <w:t xml:space="preserve">Starting from Y ~ 1, the search added </w:t>
-      </w:r>
-      <w:r>
-        <w:rPr>
-          <w:b/>
-        </w:rPr>
-        <w:t>X10 → X4 → X13 → X14 → X1</w:t>
-      </w:r>
-      <w:r>
-        <w:rPr/>
-        <w:t>, and the criterion fell at every step (BIC 752.82 → 693.19 → 689.44 → 686.18 → 682.27 → 680.89). At each step it also checked every removal, but none ever helped. At the final model, the best remaining addition (X7) and every removal would raise the criterion, so the search stopped there.</w:t>
+        <w:t>Starting from the intercept-only model, step() added the predictors one at a time in the order they appear in the formula: X10, X4, X13, X14 and then X1. At each step it also checked whether removing a predictor would lower BIC, but none was removed. The search stopped when no further addition or removal lowered BIC, and that model was taken as the final model. The forward and backward BIC searches (sections 6.4 and 6.5 of the code) gave the same five predictors.</w:t>
       </w:r>
     </w:p>
-    <w:p>
-      <w:pPr>
-        <w:keepNext/>
-        <w:shd w:val="clear" w:color="auto" w:fill="F2F2F2"/>
-        <w:spacing w:before="80" w:after="0" w:line="240" w:lineRule="auto"/>
-        <w:ind w:left="504" w:right="144"/>
-      </w:pPr>
-      <w:r>
-        <w:rPr>
-          <w:rFonts w:ascii="Consolas" w:hAnsi="Consolas" w:eastAsia="Consolas" w:cs="Consolas"/>
-          <w:color w:val="2F5496"/>
-          <w:sz w:val="17"/>
-        </w:rPr>
-        <w:t>&gt; stepwise_BIC$anova    # search path ("AIC" column is BIC here: k = log(N))</w:t>
-      </w:r>
-    </w:p>
-    <w:p>
-      <w:pPr>
-        <w:keepNext/>
-        <w:shd w:val="clear" w:color="auto" w:fill="F2F2F2"/>
-        <w:spacing w:before="0" w:after="0" w:line="240" w:lineRule="auto"/>
-        <w:ind w:left="504" w:right="144"/>
-      </w:pPr>
-      <w:r>
-        <w:rPr>
-          <w:rFonts w:ascii="Consolas" w:hAnsi="Consolas" w:eastAsia="Consolas" w:cs="Consolas"/>
-          <w:sz w:val="17"/>
-        </w:rPr>
-        <w:t xml:space="preserve">   Step Df  Deviance Resid. Df Resid. Dev      AIC</w:t>
-      </w:r>
-    </w:p>
-    <w:p>
-      <w:pPr>
-        <w:keepNext/>
-        <w:shd w:val="clear" w:color="auto" w:fill="F2F2F2"/>
-        <w:spacing w:before="0" w:after="0" w:line="240" w:lineRule="auto"/>
-        <w:ind w:left="504" w:right="144"/>
-      </w:pPr>
-      <w:r>
-        <w:rPr>
-          <w:rFonts w:ascii="Consolas" w:hAnsi="Consolas" w:eastAsia="Consolas" w:cs="Consolas"/>
-          <w:sz w:val="17"/>
-        </w:rPr>
-        <w:t>1       NA        NA        99   9930.664 464.4264</w:t>
-      </w:r>
-    </w:p>
-    <w:p>
-      <w:pPr>
-        <w:keepNext/>
-        <w:shd w:val="clear" w:color="auto" w:fill="F2F2F2"/>
-        <w:spacing w:before="0" w:after="0" w:line="240" w:lineRule="auto"/>
-        <w:ind w:left="504" w:right="144"/>
-      </w:pPr>
-      <w:r>
-        <w:rPr>
-          <w:rFonts w:ascii="Consolas" w:hAnsi="Consolas" w:eastAsia="Consolas" w:cs="Consolas"/>
-          <w:sz w:val="17"/>
-        </w:rPr>
-        <w:t>2 + X10 -1 4706.6253        98   5224.039 404.7959</w:t>
-      </w:r>
-    </w:p>
-    <w:p>
-      <w:pPr>
-        <w:keepNext/>
-        <w:shd w:val="clear" w:color="auto" w:fill="F2F2F2"/>
-        <w:spacing w:before="0" w:after="0" w:line="240" w:lineRule="auto"/>
-        <w:ind w:left="504" w:right="144"/>
-      </w:pPr>
-      <w:r>
-        <w:rPr>
-          <w:rFonts w:ascii="Consolas" w:hAnsi="Consolas" w:eastAsia="Consolas" w:cs="Consolas"/>
-          <w:sz w:val="17"/>
-        </w:rPr>
-        <w:t>3  + X4 -1  418.8081        97   4805.231 401.0445</w:t>
-      </w:r>
-    </w:p>
-    <w:p>
-      <w:pPr>
-        <w:keepNext/>
-        <w:shd w:val="clear" w:color="auto" w:fill="F2F2F2"/>
-        <w:spacing w:before="0" w:after="0" w:line="240" w:lineRule="auto"/>
-        <w:ind w:left="504" w:right="144"/>
-      </w:pPr>
-      <w:r>
-        <w:rPr>
-          <w:rFonts w:ascii="Consolas" w:hAnsi="Consolas" w:eastAsia="Consolas" w:cs="Consolas"/>
-          <w:sz w:val="17"/>
-        </w:rPr>
-        <w:t>4 + X13 -1  363.4433        96   4441.787 397.7849</w:t>
-      </w:r>
-    </w:p>
-    <w:p>
-      <w:pPr>
-        <w:keepNext/>
-        <w:shd w:val="clear" w:color="auto" w:fill="F2F2F2"/>
-        <w:spacing w:before="0" w:after="0" w:line="240" w:lineRule="auto"/>
-        <w:ind w:left="504" w:right="144"/>
-      </w:pPr>
-      <w:r>
-        <w:rPr>
-          <w:rFonts w:ascii="Consolas" w:hAnsi="Consolas" w:eastAsia="Consolas" w:cs="Consolas"/>
-          <w:sz w:val="17"/>
-        </w:rPr>
-        <w:t>5 + X14 -1  362.3603        95   4079.427 393.8800</w:t>
-      </w:r>
-    </w:p>
-    <w:p>
-      <w:pPr>
-        <w:keepNext w:val="0"/>
-        <w:shd w:val="clear" w:color="auto" w:fill="F2F2F2"/>
-        <w:spacing w:before="0" w:after="160" w:line="240" w:lineRule="auto"/>
-        <w:ind w:left="504" w:right="144"/>
-      </w:pPr>
-      <w:r>
-        <w:rPr>
-          <w:rFonts w:ascii="Consolas" w:hAnsi="Consolas" w:eastAsia="Consolas" w:cs="Consolas"/>
-          <w:sz w:val="17"/>
-        </w:rPr>
-        <w:t>6  + X1 -1  237.2439        94   3842.183 392.4936</w:t>
-      </w:r>
-    </w:p>
-    <w:p>
-      <w:pPr>
-        <w:pBdr>
-          <w:left w:val="single" w:sz="18" w:space="8" w:color="2F5496"/>
-        </w:pBdr>
-        <w:spacing w:after="100" w:before="0"/>
-        <w:ind w:left="288"/>
-      </w:pPr>
-      <w:r>
-        <w:rPr>
-          <w:b/>
-        </w:rPr>
-        <w:t>Robustness check.</w:t>
-      </w:r>
-      <w:r>
-        <w:rPr/>
-        <w:t xml:space="preserve"> The R script also ran every search direction with every criterion (code section 6). Forward, backward and bidirectional searches agree for each criterion, and BIC gives the smallest model:</w:t>
-      </w:r>
-    </w:p>
-    <w:p>
-      <w:pPr>
-        <w:keepNext/>
-        <w:spacing w:before="120" w:after="60"/>
-      </w:pPr>
-      <w:r>
-        <w:rPr>
-          <w:i/>
-          <w:sz w:val="19"/>
-        </w:rPr>
-        <w:t>Table A. Classical selection results for all 12 search/criterion combinations.</w:t>
-      </w:r>
-    </w:p>
-    <w:tbl>
-      <w:tblPr>
-        <w:tblStyle w:val="TableGrid"/>
-        <w:tblW w:type="auto" w:w="0"/>
-        <w:jc w:val="center"/>
-        <w:tblLayout w:type="fixed"/>
-        <w:tblLook w:firstColumn="1" w:firstRow="1" w:lastColumn="0" w:lastRow="0" w:noHBand="0" w:noVBand="1" w:val="04A0"/>
-      </w:tblPr>
-      <w:tblGrid>
-        <w:gridCol w:w="1728"/>
-        <w:gridCol w:w="4752"/>
-        <w:gridCol w:w="720"/>
-        <w:gridCol w:w="1296"/>
-      </w:tblGrid>
-      <w:tr>
-        <w:tc>
-          <w:tcPr>
-            <w:tcW w:type="dxa" w:w="1728"/>
-            <w:shd w:val="clear" w:color="auto" w:fill="EAF0F7"/>
-            <w:tcMar>
-              <w:top w:w="50" w:type="dxa"/>
-              <w:bottom w:w="50" w:type="dxa"/>
-            </w:tcMar>
-          </w:tcPr>
-          <w:p>
-            <w:pPr>
-              <w:spacing w:after="0"/>
-              <w:jc w:val="center"/>
-            </w:pPr>
-            <w:r>
-              <w:rPr>
-                <w:b/>
-                <w:sz w:val="19"/>
-              </w:rPr>
-              <w:t>Criterion</w:t>
-            </w:r>
-          </w:p>
-        </w:tc>
-        <w:tc>
-          <w:tcPr>
-            <w:tcW w:type="dxa" w:w="4752"/>
-            <w:shd w:val="clear" w:color="auto" w:fill="EAF0F7"/>
-            <w:tcMar>
-              <w:top w:w="50" w:type="dxa"/>
-              <w:bottom w:w="50" w:type="dxa"/>
-            </w:tcMar>
-          </w:tcPr>
-          <w:p>
-            <w:pPr>
-              <w:spacing w:after="0"/>
-              <w:jc w:val="center"/>
-            </w:pPr>
-            <w:r>
-              <w:rPr>
-                <w:b/>
-                <w:sz w:val="19"/>
-              </w:rPr>
-              <w:t>Selected predictors (forward = backward = stepwise)</w:t>
-            </w:r>
-          </w:p>
-        </w:tc>
-        <w:tc>
-          <w:tcPr>
-            <w:tcW w:type="dxa" w:w="720"/>
-            <w:shd w:val="clear" w:color="auto" w:fill="EAF0F7"/>
-            <w:tcMar>
-              <w:top w:w="50" w:type="dxa"/>
-              <w:bottom w:w="50" w:type="dxa"/>
-            </w:tcMar>
-          </w:tcPr>
-          <w:p>
-            <w:pPr>
-              <w:spacing w:after="0"/>
-              <w:jc w:val="center"/>
-            </w:pPr>
-            <w:r>
-              <w:rPr>
-                <w:b/>
-                <w:sz w:val="19"/>
-              </w:rPr>
-              <w:t>No.</w:t>
-            </w:r>
-          </w:p>
-        </w:tc>
-        <w:tc>
-          <w:tcPr>
-            <w:tcW w:type="dxa" w:w="1296"/>
-            <w:shd w:val="clear" w:color="auto" w:fill="EAF0F7"/>
-            <w:tcMar>
-              <w:top w:w="50" w:type="dxa"/>
-              <w:bottom w:w="50" w:type="dxa"/>
-            </w:tcMar>
-          </w:tcPr>
-          <w:p>
-            <w:pPr>
-              <w:spacing w:after="0"/>
-              <w:jc w:val="center"/>
-            </w:pPr>
-            <w:r>
-              <w:rPr>
-                <w:b/>
-                <w:sz w:val="19"/>
-              </w:rPr>
-              <w:t>Value</w:t>
-            </w:r>
-          </w:p>
-        </w:tc>
-      </w:tr>
-      <w:tr>
-        <w:tc>
-          <w:tcPr>
-            <w:tcW w:type="dxa" w:w="1728"/>
-            <w:tcMar>
-              <w:top w:w="50" w:type="dxa"/>
-              <w:bottom w:w="50" w:type="dxa"/>
-            </w:tcMar>
-          </w:tcPr>
-          <w:p>
-            <w:pPr>
-              <w:spacing w:after="0"/>
-              <w:jc w:val="left"/>
-            </w:pPr>
-            <w:r>
-              <w:rPr>
-                <w:sz w:val="19"/>
-              </w:rPr>
-              <w:t>AIC</w:t>
-            </w:r>
-          </w:p>
-        </w:tc>
-        <w:tc>
-          <w:tcPr>
-            <w:tcW w:type="dxa" w:w="4752"/>
-            <w:tcMar>
-              <w:top w:w="50" w:type="dxa"/>
-              <w:bottom w:w="50" w:type="dxa"/>
-            </w:tcMar>
-          </w:tcPr>
-          <w:p>
-            <w:pPr>
-              <w:spacing w:after="0"/>
-              <w:jc w:val="center"/>
-            </w:pPr>
-            <w:r>
-              <w:rPr>
-                <w:sz w:val="19"/>
-              </w:rPr>
-              <w:t>X1, X4, X5, X7, X10, X13, X14</w:t>
-            </w:r>
-          </w:p>
-        </w:tc>
-        <w:tc>
-          <w:tcPr>
-            <w:tcW w:type="dxa" w:w="720"/>
-            <w:tcMar>
-              <w:top w:w="50" w:type="dxa"/>
-              <w:bottom w:w="50" w:type="dxa"/>
-            </w:tcMar>
-          </w:tcPr>
-          <w:p>
-            <w:pPr>
-              <w:spacing w:after="0"/>
-              <w:jc w:val="center"/>
-            </w:pPr>
-            <w:r>
-              <w:rPr>
-                <w:sz w:val="19"/>
-              </w:rPr>
-              <w:t>7</w:t>
-            </w:r>
-          </w:p>
-        </w:tc>
-        <w:tc>
-          <w:tcPr>
-            <w:tcW w:type="dxa" w:w="1296"/>
-            <w:tcMar>
-              <w:top w:w="50" w:type="dxa"/>
-              <w:bottom w:w="50" w:type="dxa"/>
-            </w:tcMar>
-          </w:tcPr>
-          <w:p>
-            <w:pPr>
-              <w:spacing w:after="0"/>
-              <w:jc w:val="center"/>
-            </w:pPr>
-            <w:r>
-              <w:rPr>
-                <w:sz w:val="19"/>
-              </w:rPr>
-              <w:t>659.6584</w:t>
-            </w:r>
-          </w:p>
-        </w:tc>
-      </w:tr>
-      <w:tr>
-        <w:tc>
-          <w:tcPr>
-            <w:tcW w:type="dxa" w:w="1728"/>
-            <w:tcMar>
-              <w:top w:w="50" w:type="dxa"/>
-              <w:bottom w:w="50" w:type="dxa"/>
-            </w:tcMar>
-          </w:tcPr>
-          <w:p>
-            <w:pPr>
-              <w:spacing w:after="0"/>
-              <w:jc w:val="left"/>
-            </w:pPr>
-            <w:r>
-              <w:rPr>
-                <w:b/>
-                <w:sz w:val="19"/>
-              </w:rPr>
-              <w:t>BIC (chosen)</w:t>
-            </w:r>
-          </w:p>
-        </w:tc>
-        <w:tc>
-          <w:tcPr>
-            <w:tcW w:type="dxa" w:w="4752"/>
-            <w:tcMar>
-              <w:top w:w="50" w:type="dxa"/>
-              <w:bottom w:w="50" w:type="dxa"/>
-            </w:tcMar>
-          </w:tcPr>
-          <w:p>
-            <w:pPr>
-              <w:spacing w:after="0"/>
-              <w:jc w:val="center"/>
-            </w:pPr>
-            <w:r>
-              <w:rPr>
-                <w:b/>
-                <w:sz w:val="19"/>
-              </w:rPr>
-              <w:t>X1, X4, X10, X13, X14</w:t>
-            </w:r>
-          </w:p>
-        </w:tc>
-        <w:tc>
-          <w:tcPr>
-            <w:tcW w:type="dxa" w:w="720"/>
-            <w:tcMar>
-              <w:top w:w="50" w:type="dxa"/>
-              <w:bottom w:w="50" w:type="dxa"/>
-            </w:tcMar>
-          </w:tcPr>
-          <w:p>
-            <w:pPr>
-              <w:spacing w:after="0"/>
-              <w:jc w:val="center"/>
-            </w:pPr>
-            <w:r>
-              <w:rPr>
-                <w:b/>
-                <w:sz w:val="19"/>
-              </w:rPr>
-              <w:t>5</w:t>
-            </w:r>
-          </w:p>
-        </w:tc>
-        <w:tc>
-          <w:tcPr>
-            <w:tcW w:type="dxa" w:w="1296"/>
-            <w:tcMar>
-              <w:top w:w="50" w:type="dxa"/>
-              <w:bottom w:w="50" w:type="dxa"/>
-            </w:tcMar>
-          </w:tcPr>
-          <w:p>
-            <w:pPr>
-              <w:spacing w:after="0"/>
-              <w:jc w:val="center"/>
-            </w:pPr>
-            <w:r>
-              <w:rPr>
-                <w:b/>
-                <w:sz w:val="19"/>
-              </w:rPr>
-              <w:t>680.8865</w:t>
-            </w:r>
-          </w:p>
-        </w:tc>
-      </w:tr>
-      <w:tr>
-        <w:tc>
-          <w:tcPr>
-            <w:tcW w:type="dxa" w:w="1728"/>
-            <w:tcMar>
-              <w:top w:w="50" w:type="dxa"/>
-              <w:bottom w:w="50" w:type="dxa"/>
-            </w:tcMar>
-          </w:tcPr>
-          <w:p>
-            <w:pPr>
-              <w:spacing w:after="0"/>
-              <w:jc w:val="left"/>
-            </w:pPr>
-            <w:r>
-              <w:rPr>
-                <w:sz w:val="19"/>
-              </w:rPr>
-              <w:t>Mallows' Cp</w:t>
-            </w:r>
-          </w:p>
-        </w:tc>
-        <w:tc>
-          <w:tcPr>
-            <w:tcW w:type="dxa" w:w="4752"/>
-            <w:tcMar>
-              <w:top w:w="50" w:type="dxa"/>
-              <w:bottom w:w="50" w:type="dxa"/>
-            </w:tcMar>
-          </w:tcPr>
-          <w:p>
-            <w:pPr>
-              <w:spacing w:after="0"/>
-              <w:jc w:val="center"/>
-            </w:pPr>
-            <w:r>
-              <w:rPr>
-                <w:sz w:val="19"/>
-              </w:rPr>
-              <w:t>X1, X4, X5, X7, X10, X13, X14</w:t>
-            </w:r>
-          </w:p>
-        </w:tc>
-        <w:tc>
-          <w:tcPr>
-            <w:tcW w:type="dxa" w:w="720"/>
-            <w:tcMar>
-              <w:top w:w="50" w:type="dxa"/>
-              <w:bottom w:w="50" w:type="dxa"/>
-            </w:tcMar>
-          </w:tcPr>
-          <w:p>
-            <w:pPr>
-              <w:spacing w:after="0"/>
-              <w:jc w:val="center"/>
-            </w:pPr>
-            <w:r>
-              <w:rPr>
-                <w:sz w:val="19"/>
-              </w:rPr>
-              <w:t>7</w:t>
-            </w:r>
-          </w:p>
-        </w:tc>
-        <w:tc>
-          <w:tcPr>
-            <w:tcW w:type="dxa" w:w="1296"/>
-            <w:tcMar>
-              <w:top w:w="50" w:type="dxa"/>
-              <w:bottom w:w="50" w:type="dxa"/>
-            </w:tcMar>
-          </w:tcPr>
-          <w:p>
-            <w:pPr>
-              <w:spacing w:after="0"/>
-              <w:jc w:val="center"/>
-            </w:pPr>
-            <w:r>
-              <w:rPr>
-                <w:sz w:val="19"/>
-              </w:rPr>
-              <w:t>2.7414</w:t>
-            </w:r>
-          </w:p>
-        </w:tc>
-      </w:tr>
-      <w:tr>
-        <w:tc>
-          <w:tcPr>
-            <w:tcW w:type="dxa" w:w="1728"/>
-            <w:tcMar>
-              <w:top w:w="50" w:type="dxa"/>
-              <w:bottom w:w="50" w:type="dxa"/>
-            </w:tcMar>
-          </w:tcPr>
-          <w:p>
-            <w:pPr>
-              <w:spacing w:after="0"/>
-              <w:jc w:val="left"/>
-            </w:pPr>
-            <w:r>
-              <w:rPr>
-                <w:sz w:val="19"/>
-              </w:rPr>
-              <w:t>Adjusted R²</w:t>
-            </w:r>
-          </w:p>
-        </w:tc>
-        <w:tc>
-          <w:tcPr>
-            <w:tcW w:type="dxa" w:w="4752"/>
-            <w:tcMar>
-              <w:top w:w="50" w:type="dxa"/>
-              <w:bottom w:w="50" w:type="dxa"/>
-            </w:tcMar>
-          </w:tcPr>
-          <w:p>
-            <w:pPr>
-              <w:spacing w:after="0"/>
-              <w:jc w:val="center"/>
-            </w:pPr>
-            <w:r>
-              <w:rPr>
-                <w:sz w:val="19"/>
-              </w:rPr>
-              <w:t>X1, X4, X5, X6, X7, X10, X13, X14</w:t>
-            </w:r>
-          </w:p>
-        </w:tc>
-        <w:tc>
-          <w:tcPr>
-            <w:tcW w:type="dxa" w:w="720"/>
-            <w:tcMar>
-              <w:top w:w="50" w:type="dxa"/>
-              <w:bottom w:w="50" w:type="dxa"/>
-            </w:tcMar>
-          </w:tcPr>
-          <w:p>
-            <w:pPr>
-              <w:spacing w:after="0"/>
-              <w:jc w:val="center"/>
-            </w:pPr>
-            <w:r>
-              <w:rPr>
-                <w:sz w:val="19"/>
-              </w:rPr>
-              <w:t>8</w:t>
-            </w:r>
-          </w:p>
-        </w:tc>
-        <w:tc>
-          <w:tcPr>
-            <w:tcW w:type="dxa" w:w="1296"/>
-            <w:tcMar>
-              <w:top w:w="50" w:type="dxa"/>
-              <w:bottom w:w="50" w:type="dxa"/>
-            </w:tcMar>
-          </w:tcPr>
-          <w:p>
-            <w:pPr>
-              <w:spacing w:after="0"/>
-              <w:jc w:val="center"/>
-            </w:pPr>
-            <w:r>
-              <w:rPr>
-                <w:sz w:val="19"/>
-              </w:rPr>
-              <w:t>0.6130</w:t>
-            </w:r>
-          </w:p>
-        </w:tc>
-      </w:tr>
-    </w:tbl>
     <w:p>
       <w:pPr>
         <w:keepNext/>
@@ -5455,10 +4729,6 @@
         </w:rPr>
         <w:t>Adjusted R² = 0.5925</w:t>
       </w:r>
-      <w:r>
-        <w:rPr/>
-        <w:t xml:space="preserve"> (R² = 0.6131).</w:t>
-      </w:r>
     </w:p>
     <w:p>
       <w:pPr>
@@ -5542,384 +4812,39 @@
       </w:pPr>
       <w:r>
         <w:rPr/>
-        <w:t xml:space="preserve">The selected model's adjusted R² (0.5925) is </w:t>
+        <w:t>The selected model's adjusted R² (</w:t>
       </w:r>
       <w:r>
         <w:rPr>
           <w:b/>
         </w:rPr>
-        <w:t>slightly higher</w:t>
+        <w:t>0.5925</w:t>
       </w:r>
       <w:r>
         <w:rPr/>
-        <w:t xml:space="preserve"> than the full model's (0.5882), even though it uses 10 fewer predictors. R² itself falls from 0.6506 to 0.6131, as it always does when terms are removed. Once the cost of extra parameters is accounted for, however, the ten dropped predictors were not worth keeping.</w:t>
+        <w:t xml:space="preserve">) is slightly </w:t>
+      </w:r>
+      <w:r>
+        <w:rPr>
+          <w:b/>
+        </w:rPr>
+        <w:t>higher</w:t>
+      </w:r>
+      <w:r>
+        <w:rPr/>
+        <w:t xml:space="preserve"> than the full model's (</w:t>
+      </w:r>
+      <w:r>
+        <w:rPr>
+          <w:b/>
+        </w:rPr>
+        <w:t>0.5882</w:t>
+      </w:r>
+      <w:r>
+        <w:rPr/>
+        <w:t>), even though it uses 10 fewer predictors. The extra predictors in the full model did not improve the fit enough to justify their cost.</w:t>
       </w:r>
     </w:p>
-    <w:p>
-      <w:pPr>
-        <w:keepNext/>
-        <w:spacing w:before="120" w:after="60"/>
-      </w:pPr>
-      <w:r>
-        <w:rPr>
-          <w:i/>
-          <w:sz w:val="19"/>
-        </w:rPr>
-        <w:t>Table B. Full versus selected model.</w:t>
-      </w:r>
-    </w:p>
-    <w:tbl>
-      <w:tblPr>
-        <w:tblStyle w:val="TableGrid"/>
-        <w:tblW w:type="auto" w:w="0"/>
-        <w:jc w:val="center"/>
-        <w:tblLayout w:type="fixed"/>
-        <w:tblLook w:firstColumn="1" w:firstRow="1" w:lastColumn="0" w:lastRow="0" w:noHBand="0" w:noVBand="1" w:val="04A0"/>
-      </w:tblPr>
-      <w:tblGrid>
-        <w:gridCol w:w="2160"/>
-        <w:gridCol w:w="1440"/>
-        <w:gridCol w:w="1296"/>
-        <w:gridCol w:w="1584"/>
-        <w:gridCol w:w="2016"/>
-      </w:tblGrid>
-      <w:tr>
-        <w:tc>
-          <w:tcPr>
-            <w:tcW w:type="dxa" w:w="2160"/>
-            <w:shd w:val="clear" w:color="auto" w:fill="EAF0F7"/>
-            <w:tcMar>
-              <w:top w:w="50" w:type="dxa"/>
-              <w:bottom w:w="50" w:type="dxa"/>
-            </w:tcMar>
-          </w:tcPr>
-          <w:p>
-            <w:pPr>
-              <w:spacing w:after="0"/>
-              <w:jc w:val="center"/>
-            </w:pPr>
-            <w:r>
-              <w:rPr>
-                <w:b/>
-                <w:sz w:val="19"/>
-              </w:rPr>
-              <w:t>Model</w:t>
-            </w:r>
-          </w:p>
-        </w:tc>
-        <w:tc>
-          <w:tcPr>
-            <w:tcW w:type="dxa" w:w="1440"/>
-            <w:shd w:val="clear" w:color="auto" w:fill="EAF0F7"/>
-            <w:tcMar>
-              <w:top w:w="50" w:type="dxa"/>
-              <w:bottom w:w="50" w:type="dxa"/>
-            </w:tcMar>
-          </w:tcPr>
-          <w:p>
-            <w:pPr>
-              <w:spacing w:after="0"/>
-              <w:jc w:val="center"/>
-            </w:pPr>
-            <w:r>
-              <w:rPr>
-                <w:b/>
-                <w:sz w:val="19"/>
-              </w:rPr>
-              <w:t>Predictors</w:t>
-            </w:r>
-          </w:p>
-        </w:tc>
-        <w:tc>
-          <w:tcPr>
-            <w:tcW w:type="dxa" w:w="1296"/>
-            <w:shd w:val="clear" w:color="auto" w:fill="EAF0F7"/>
-            <w:tcMar>
-              <w:top w:w="50" w:type="dxa"/>
-              <w:bottom w:w="50" w:type="dxa"/>
-            </w:tcMar>
-          </w:tcPr>
-          <w:p>
-            <w:pPr>
-              <w:spacing w:after="0"/>
-              <w:jc w:val="center"/>
-            </w:pPr>
-            <w:r>
-              <w:rPr>
-                <w:b/>
-                <w:sz w:val="19"/>
-              </w:rPr>
-              <w:t>R²</w:t>
-            </w:r>
-          </w:p>
-        </w:tc>
-        <w:tc>
-          <w:tcPr>
-            <w:tcW w:type="dxa" w:w="1584"/>
-            <w:shd w:val="clear" w:color="auto" w:fill="EAF0F7"/>
-            <w:tcMar>
-              <w:top w:w="50" w:type="dxa"/>
-              <w:bottom w:w="50" w:type="dxa"/>
-            </w:tcMar>
-          </w:tcPr>
-          <w:p>
-            <w:pPr>
-              <w:spacing w:after="0"/>
-              <w:jc w:val="center"/>
-            </w:pPr>
-            <w:r>
-              <w:rPr>
-                <w:b/>
-                <w:sz w:val="19"/>
-              </w:rPr>
-              <w:t>Adjusted R²</w:t>
-            </w:r>
-          </w:p>
-        </w:tc>
-        <w:tc>
-          <w:tcPr>
-            <w:tcW w:type="dxa" w:w="2016"/>
-            <w:shd w:val="clear" w:color="auto" w:fill="EAF0F7"/>
-            <w:tcMar>
-              <w:top w:w="50" w:type="dxa"/>
-              <w:bottom w:w="50" w:type="dxa"/>
-            </w:tcMar>
-          </w:tcPr>
-          <w:p>
-            <w:pPr>
-              <w:spacing w:after="0"/>
-              <w:jc w:val="center"/>
-            </w:pPr>
-            <w:r>
-              <w:rPr>
-                <w:b/>
-                <w:sz w:val="19"/>
-              </w:rPr>
-              <w:t>Residual SE (df)</w:t>
-            </w:r>
-          </w:p>
-        </w:tc>
-      </w:tr>
-      <w:tr>
-        <w:tc>
-          <w:tcPr>
-            <w:tcW w:type="dxa" w:w="2160"/>
-            <w:tcMar>
-              <w:top w:w="50" w:type="dxa"/>
-              <w:bottom w:w="50" w:type="dxa"/>
-            </w:tcMar>
-          </w:tcPr>
-          <w:p>
-            <w:pPr>
-              <w:spacing w:after="0"/>
-              <w:jc w:val="left"/>
-            </w:pPr>
-            <w:r>
-              <w:rPr>
-                <w:sz w:val="19"/>
-              </w:rPr>
-              <w:t>Full model</w:t>
-            </w:r>
-          </w:p>
-        </w:tc>
-        <w:tc>
-          <w:tcPr>
-            <w:tcW w:type="dxa" w:w="1440"/>
-            <w:tcMar>
-              <w:top w:w="50" w:type="dxa"/>
-              <w:bottom w:w="50" w:type="dxa"/>
-            </w:tcMar>
-          </w:tcPr>
-          <w:p>
-            <w:pPr>
-              <w:spacing w:after="0"/>
-              <w:jc w:val="center"/>
-            </w:pPr>
-            <w:r>
-              <w:rPr>
-                <w:sz w:val="19"/>
-              </w:rPr>
-              <w:t>15</w:t>
-            </w:r>
-          </w:p>
-        </w:tc>
-        <w:tc>
-          <w:tcPr>
-            <w:tcW w:type="dxa" w:w="1296"/>
-            <w:tcMar>
-              <w:top w:w="50" w:type="dxa"/>
-              <w:bottom w:w="50" w:type="dxa"/>
-            </w:tcMar>
-          </w:tcPr>
-          <w:p>
-            <w:pPr>
-              <w:spacing w:after="0"/>
-              <w:jc w:val="center"/>
-            </w:pPr>
-            <w:r>
-              <w:rPr>
-                <w:sz w:val="19"/>
-              </w:rPr>
-              <w:t>0.6506</w:t>
-            </w:r>
-          </w:p>
-        </w:tc>
-        <w:tc>
-          <w:tcPr>
-            <w:tcW w:type="dxa" w:w="1584"/>
-            <w:tcMar>
-              <w:top w:w="50" w:type="dxa"/>
-              <w:bottom w:w="50" w:type="dxa"/>
-            </w:tcMar>
-          </w:tcPr>
-          <w:p>
-            <w:pPr>
-              <w:spacing w:after="0"/>
-              <w:jc w:val="center"/>
-            </w:pPr>
-            <w:r>
-              <w:rPr>
-                <w:sz w:val="19"/>
-              </w:rPr>
-              <w:t>0.5882</w:t>
-            </w:r>
-          </w:p>
-        </w:tc>
-        <w:tc>
-          <w:tcPr>
-            <w:tcW w:type="dxa" w:w="2016"/>
-            <w:tcMar>
-              <w:top w:w="50" w:type="dxa"/>
-              <w:bottom w:w="50" w:type="dxa"/>
-            </w:tcMar>
-          </w:tcPr>
-          <w:p>
-            <w:pPr>
-              <w:spacing w:after="0"/>
-              <w:jc w:val="center"/>
-            </w:pPr>
-            <w:r>
-              <w:rPr>
-                <w:sz w:val="19"/>
-              </w:rPr>
-              <w:t>6.427 (84)</w:t>
-            </w:r>
-          </w:p>
-        </w:tc>
-      </w:tr>
-      <w:tr>
-        <w:tc>
-          <w:tcPr>
-            <w:tcW w:type="dxa" w:w="2160"/>
-            <w:tcMar>
-              <w:top w:w="50" w:type="dxa"/>
-              <w:bottom w:w="50" w:type="dxa"/>
-            </w:tcMar>
-          </w:tcPr>
-          <w:p>
-            <w:pPr>
-              <w:spacing w:after="0"/>
-              <w:jc w:val="left"/>
-            </w:pPr>
-            <w:r>
-              <w:rPr>
-                <w:b/>
-                <w:sz w:val="19"/>
-              </w:rPr>
-              <w:t>Selected (BIC)</w:t>
-            </w:r>
-          </w:p>
-        </w:tc>
-        <w:tc>
-          <w:tcPr>
-            <w:tcW w:type="dxa" w:w="1440"/>
-            <w:tcMar>
-              <w:top w:w="50" w:type="dxa"/>
-              <w:bottom w:w="50" w:type="dxa"/>
-            </w:tcMar>
-          </w:tcPr>
-          <w:p>
-            <w:pPr>
-              <w:spacing w:after="0"/>
-              <w:jc w:val="center"/>
-            </w:pPr>
-            <w:r>
-              <w:rPr>
-                <w:b/>
-                <w:sz w:val="19"/>
-              </w:rPr>
-              <w:t>5</w:t>
-            </w:r>
-          </w:p>
-        </w:tc>
-        <w:tc>
-          <w:tcPr>
-            <w:tcW w:type="dxa" w:w="1296"/>
-            <w:tcMar>
-              <w:top w:w="50" w:type="dxa"/>
-              <w:bottom w:w="50" w:type="dxa"/>
-            </w:tcMar>
-          </w:tcPr>
-          <w:p>
-            <w:pPr>
-              <w:spacing w:after="0"/>
-              <w:jc w:val="center"/>
-            </w:pPr>
-            <w:r>
-              <w:rPr>
-                <w:b/>
-                <w:sz w:val="19"/>
-              </w:rPr>
-              <w:t>0.6131</w:t>
-            </w:r>
-          </w:p>
-        </w:tc>
-        <w:tc>
-          <w:tcPr>
-            <w:tcW w:type="dxa" w:w="1584"/>
-            <w:tcMar>
-              <w:top w:w="50" w:type="dxa"/>
-              <w:bottom w:w="50" w:type="dxa"/>
-            </w:tcMar>
-          </w:tcPr>
-          <w:p>
-            <w:pPr>
-              <w:spacing w:after="0"/>
-              <w:jc w:val="center"/>
-            </w:pPr>
-            <w:r>
-              <w:rPr>
-                <w:b/>
-                <w:sz w:val="19"/>
-              </w:rPr>
-              <w:t>0.5925</w:t>
-            </w:r>
-          </w:p>
-        </w:tc>
-        <w:tc>
-          <w:tcPr>
-            <w:tcW w:type="dxa" w:w="2016"/>
-            <w:tcMar>
-              <w:top w:w="50" w:type="dxa"/>
-              <w:bottom w:w="50" w:type="dxa"/>
-            </w:tcMar>
-          </w:tcPr>
-          <w:p>
-            <w:pPr>
-              <w:spacing w:after="0"/>
-              <w:jc w:val="center"/>
-            </w:pPr>
-            <w:r>
-              <w:rPr>
-                <w:b/>
-                <w:sz w:val="19"/>
-              </w:rPr>
-              <w:t>6.393 (94)</w:t>
-            </w:r>
-          </w:p>
-        </w:tc>
-      </w:tr>
-    </w:tbl>
     <w:p>
       <w:pPr>
         <w:keepNext/>
@@ -5942,11 +4867,11 @@
         <w:rPr>
           <w:b/>
         </w:rPr>
-        <w:t>Simpler:</w:t>
+        <w:t>Yes, the selected model is simpler:</w:t>
       </w:r>
       <w:r>
         <w:rPr/>
-        <w:t xml:space="preserve"> yes, 5 predictors instead of 15, and every retained coefficient is significant at 5% (largest p = 0.0179). The estimates barely change from the full model, and all five standard errors become slightly smaller.</w:t>
+        <w:t xml:space="preserve"> 5 predictors instead of 15, and all five are significant at the 5% level (largest p-value = 0.017936).</w:t>
       </w:r>
     </w:p>
     <w:p>
@@ -5961,72 +4886,11 @@
         <w:rPr>
           <w:b/>
         </w:rPr>
-        <w:t>What may be lost:</w:t>
+        <w:t>Information lost:</w:t>
       </w:r>
       <w:r>
         <w:rPr/>
-        <w:t xml:space="preserve"> the ten excluded predictors explained about 3.75 percentage points of R² (RSS rises from 3469.5 to 3842.2). A partial F-test shows this loss is not significant (F = 0.9023, p = 0.5349). Still, if an excluded predictor has a small real effect, that effect is now pushed into the error term and can no longer be estimated. X7 (p = 0.057 in the full model; kept by AIC and Cp) and X5 are the likeliest candidates. Because the predictors are only weakly correlated (largest |r| = 0.295; all VIFs &lt; 1.25), dropping them causes little bias in the remaining estimates.</w:t>
-      </w:r>
-    </w:p>
-    <w:p>
-      <w:pPr>
-        <w:keepNext/>
-        <w:shd w:val="clear" w:color="auto" w:fill="F2F2F2"/>
-        <w:spacing w:before="80" w:after="0" w:line="240" w:lineRule="auto"/>
-        <w:ind w:left="504" w:right="144"/>
-      </w:pPr>
-      <w:r>
-        <w:rPr>
-          <w:rFonts w:ascii="Consolas" w:hAnsi="Consolas" w:eastAsia="Consolas" w:cs="Consolas"/>
-          <w:color w:val="2F5496"/>
-          <w:sz w:val="17"/>
-        </w:rPr>
-        <w:t>&gt; anova(stepwise_BIC, full_model)     # additional check: partial F-test</w:t>
-      </w:r>
-    </w:p>
-    <w:p>
-      <w:pPr>
-        <w:keepNext/>
-        <w:shd w:val="clear" w:color="auto" w:fill="F2F2F2"/>
-        <w:spacing w:before="0" w:after="0" w:line="240" w:lineRule="auto"/>
-        <w:ind w:left="504" w:right="144"/>
-      </w:pPr>
-      <w:r>
-        <w:rPr>
-          <w:rFonts w:ascii="Consolas" w:hAnsi="Consolas" w:eastAsia="Consolas" w:cs="Consolas"/>
-          <w:sz w:val="17"/>
-        </w:rPr>
-        <w:t xml:space="preserve">  Res.Df    RSS Df Sum of Sq      F Pr(&gt;F)</w:t>
-      </w:r>
-    </w:p>
-    <w:p>
-      <w:pPr>
-        <w:keepNext/>
-        <w:shd w:val="clear" w:color="auto" w:fill="F2F2F2"/>
-        <w:spacing w:before="0" w:after="0" w:line="240" w:lineRule="auto"/>
-        <w:ind w:left="504" w:right="144"/>
-      </w:pPr>
-      <w:r>
-        <w:rPr>
-          <w:rFonts w:ascii="Consolas" w:hAnsi="Consolas" w:eastAsia="Consolas" w:cs="Consolas"/>
-          <w:sz w:val="17"/>
-        </w:rPr>
-        <w:t xml:space="preserve">1     94 3842.2                           </w:t>
-      </w:r>
-    </w:p>
-    <w:p>
-      <w:pPr>
-        <w:keepNext w:val="0"/>
-        <w:shd w:val="clear" w:color="auto" w:fill="F2F2F2"/>
-        <w:spacing w:before="0" w:after="160" w:line="240" w:lineRule="auto"/>
-        <w:ind w:left="504" w:right="144"/>
-      </w:pPr>
-      <w:r>
-        <w:rPr>
-          <w:rFonts w:ascii="Consolas" w:hAnsi="Consolas" w:eastAsia="Consolas" w:cs="Consolas"/>
-          <w:sz w:val="17"/>
-        </w:rPr>
-        <w:t>2     84 3469.5 10    372.69 0.9023 0.5349</w:t>
+        <w:t xml:space="preserve"> R² falls from 0.6506 to 0.6131, so the excluded predictors explained about 3.75% of the variation in Y. If any of them has a small real effect, it is no longer in the model. X7 (p = 0.057 in the full model) and X5 are the most likely examples, since AIC and Mallows' Cp kept both.</w:t>
       </w:r>
     </w:p>
     <w:p>
@@ -6513,7 +5377,7 @@
       </w:pPr>
       <w:r>
         <w:rPr/>
-        <w:t xml:space="preserve">λ ≥ 0 is the </w:t>
+        <w:t xml:space="preserve">λ is the </w:t>
       </w:r>
       <w:r>
         <w:rPr>
@@ -6523,7 +5387,7 @@
       </w:r>
       <w:r>
         <w:rPr/>
-        <w:t xml:space="preserve"> that sets the weight of the L1 penalty λ·Σ|βⱼ|, i.e. the trade-off between fitting the data and keeping coefficients small:</w:t>
+        <w:t xml:space="preserve"> that controls the strength of the penalty λ·Σ|βⱼ|.</w:t>
       </w:r>
     </w:p>
     <w:p>
@@ -6537,7 +5401,7 @@
       </w:pPr>
       <w:r>
         <w:rPr/>
-        <w:t>λ = 0 gives ordinary least squares.</w:t>
+        <w:t>When λ = 0 there is no penalty and LASSO gives the ordinary least-squares estimates.</w:t>
       </w:r>
     </w:p>
     <w:p>
@@ -6551,7 +5415,7 @@
       </w:pPr>
       <w:r>
         <w:rPr/>
-        <w:t>As λ increases, all coefficients shrink toward zero and more become exactly zero: lower variance, more bias.</w:t>
+        <w:t>As λ increases, the coefficients are shrunk more toward zero and more of them become exactly zero.</w:t>
       </w:r>
     </w:p>
     <w:p>
@@ -6565,17 +5429,7 @@
       </w:pPr>
       <w:r>
         <w:rPr/>
-        <w:t>For λ ≥ λ_max (≈ 6.86 here), every slope is zero and only the intercept remains.</w:t>
-      </w:r>
-    </w:p>
-    <w:p>
-      <w:pPr>
-        <w:keepNext/>
-        <w:spacing w:before="120"/>
-        <w:ind w:left="259"/>
-      </w:pPr>
-      <w:r>
-        <w:t>(b) Explain why LASSO can produce exactly zero coefficient estimates. The intercept is not penalized.</w:t>
+        <w:t>When λ is very large, all slope coefficients are zero.</w:t>
       </w:r>
     </w:p>
     <w:p>
@@ -6588,27 +5442,17 @@
       </w:pPr>
       <w:r>
         <w:rPr/>
-        <w:t xml:space="preserve">The absolute-value penalty has a </w:t>
-      </w:r>
-      <w:r>
-        <w:rPr>
-          <w:b/>
-        </w:rPr>
-        <w:t>corner at zero</w:t>
-      </w:r>
-      <w:r>
-        <w:rPr/>
-        <w:t xml:space="preserve"> (it is not differentiable there). With standardized predictors each coefficient is updated by </w:t>
-      </w:r>
-      <w:r>
-        <w:rPr>
-          <w:b/>
-        </w:rPr>
-        <w:t>soft-thresholding</w:t>
-      </w:r>
-      <w:r>
-        <w:rPr/>
-        <w:t>:</w:t>
+        <w:t>So λ balances fitting the data well against keeping the model simple.</w:t>
+      </w:r>
+    </w:p>
+    <w:p>
+      <w:pPr>
+        <w:keepNext/>
+        <w:spacing w:before="120"/>
+        <w:ind w:left="259"/>
+      </w:pPr>
+      <w:r>
+        <w:t>(b) Explain why LASSO can produce exactly zero coefficient estimates. The intercept is not penalized.</w:t>
       </w:r>
     </w:p>
     <w:p>
@@ -6621,20 +5465,7 @@
       </w:pPr>
       <w:r>
         <w:rPr/>
-        <w:t>estimate of βⱼ = sign(zⱼ)·max(|zⱼ| − λ, 0),   where zⱼ = (1/N)·Σᵢ xᵢⱼ·(partial residual)ᵢ.</w:t>
-      </w:r>
-    </w:p>
-    <w:p>
-      <w:pPr>
-        <w:pBdr>
-          <w:left w:val="single" w:sz="18" w:space="8" w:color="2F5496"/>
-        </w:pBdr>
-        <w:spacing w:after="100" w:before="0"/>
-        <w:ind w:left="288"/>
-      </w:pPr>
-      <w:r>
-        <w:rPr/>
-        <w:t>Whenever a predictor's association with the residual satisfies |zⱼ| ≤ λ, its estimate is exactly 0, not just small. Geometrically, the constraint region Σ|βⱼ| ≤ t is a diamond with corners on the axes, and the RSS contours usually touch it first at a corner, where some coefficients are zero. Ridge regression's round region has no corners, so it shrinks but never zeroes. The intercept β₀ is not penalized, so it is never shrunk.</w:t>
+        <w:t>The penalty uses absolute values |βⱼ|, which have a sharp corner at zero. Because of this corner, the best solution for a weak predictor is often exactly βⱼ = 0: if a predictor does not reduce the squared error by more than λ, its coefficient is set to zero rather than just made small. Geometrically, the LASSO constraint Σ|βⱼ| ≤ t is a diamond with corners on the axes, and the solution often falls on a corner, where some coefficients are zero. The intercept β₀ is not penalized, so it is never shrunk.</w:t>
       </w:r>
     </w:p>
     <w:p>
@@ -6713,7 +5544,7 @@
           <w:i/>
           <w:sz w:val="19"/>
         </w:rPr>
-        <w:t>Figure 2. 10-fold cross-validated MSE versus log(λ) (seed 6166). Bars show ±1 SE; dashed lines mark lambda.min (left) and lambda.1se (right); the top axis gives the number of nonzero coefficients.</w:t>
+        <w:t>Figure 2. 10-fold cross-validation MSE versus log(λ). The left dashed line marks lambda.min and the right one lambda.1se; the numbers on top are the number of nonzero coefficients.</w:t>
       </w:r>
     </w:p>
     <w:p>
@@ -6742,7 +5573,17 @@
       </w:r>
       <w:r>
         <w:rPr/>
-        <w:t xml:space="preserve"> (log λ ≈ −0.68), with minimum CV MSE = 44.2725 (SE = 5.628) and 8 nonzero coefficients.</w:t>
+        <w:t xml:space="preserve">, giving the smallest cross-validation MSE of </w:t>
+      </w:r>
+      <w:r>
+        <w:rPr>
+          <w:b/>
+        </w:rPr>
+        <w:t>44.2725</w:t>
+      </w:r>
+      <w:r>
+        <w:rPr/>
+        <w:t>.</w:t>
       </w:r>
     </w:p>
     <w:p>
@@ -6909,7 +5750,7 @@
           <w:color w:val="2F5496"/>
           <w:sz w:val="17"/>
         </w:rPr>
-        <w:t>&gt; cv_lasso$lambda.min</w:t>
+        <w:t>&gt; lambda_selected</w:t>
       </w:r>
     </w:p>
     <w:p>
@@ -6939,102 +5780,6 @@
     </w:p>
     <w:p>
       <w:pPr>
-        <w:pStyle w:val="ListBullet"/>
-        <w:pBdr>
-          <w:left w:val="single" w:sz="18" w:space="8" w:color="2F5496"/>
-        </w:pBdr>
-        <w:spacing w:after="100" w:before="0"/>
-        <w:ind w:left="648" w:hanging="288"/>
-      </w:pPr>
-      <w:r>
-        <w:rPr/>
-        <w:t>cv.glmnet() fits the LASSO path on a grid of λ values, decreasing from λ_max ≈ 6.86.</w:t>
-      </w:r>
-    </w:p>
-    <w:p>
-      <w:pPr>
-        <w:pStyle w:val="ListBullet"/>
-        <w:pBdr>
-          <w:left w:val="single" w:sz="18" w:space="8" w:color="2F5496"/>
-        </w:pBdr>
-        <w:spacing w:after="100" w:before="0"/>
-        <w:ind w:left="648" w:hanging="288"/>
-      </w:pPr>
-      <w:r>
-        <w:rPr/>
-        <w:t xml:space="preserve">With set.seed(6166), the 100 observations are randomly split into </w:t>
-      </w:r>
-      <w:r>
-        <w:rPr>
-          <w:b/>
-        </w:rPr>
-        <w:t>10 folds</w:t>
-      </w:r>
-      <w:r>
-        <w:rPr/>
-        <w:t>.</w:t>
-      </w:r>
-    </w:p>
-    <w:p>
-      <w:pPr>
-        <w:pStyle w:val="ListBullet"/>
-        <w:pBdr>
-          <w:left w:val="single" w:sz="18" w:space="8" w:color="2F5496"/>
-        </w:pBdr>
-        <w:spacing w:after="100" w:before="0"/>
-        <w:ind w:left="648" w:hanging="288"/>
-      </w:pPr>
-      <w:r>
-        <w:rPr/>
-        <w:t>For each fold, the model is fitted on the other 9 folds at every λ, and the squared prediction error is computed on the held-out fold.</w:t>
-      </w:r>
-    </w:p>
-    <w:p>
-      <w:pPr>
-        <w:pStyle w:val="ListBullet"/>
-        <w:pBdr>
-          <w:left w:val="single" w:sz="18" w:space="8" w:color="2F5496"/>
-        </w:pBdr>
-        <w:spacing w:after="100" w:before="0"/>
-        <w:ind w:left="648" w:hanging="288"/>
-      </w:pPr>
-      <w:r>
-        <w:rPr/>
-        <w:t xml:space="preserve">Averaging over the 10 folds gives </w:t>
-      </w:r>
-      <w:r>
-        <w:rPr>
-          <w:b/>
-        </w:rPr>
-        <w:t>CV(λ)</w:t>
-      </w:r>
-      <w:r>
-        <w:rPr/>
-        <w:t>, the estimated test MSE (red dots), with a standard error from the fold-to-fold variation (grey bars).</w:t>
-      </w:r>
-    </w:p>
-    <w:p>
-      <w:pPr>
-        <w:pStyle w:val="ListBullet"/>
-        <w:pBdr>
-          <w:left w:val="single" w:sz="18" w:space="8" w:color="2F5496"/>
-        </w:pBdr>
-        <w:spacing w:after="100" w:before="0"/>
-        <w:ind w:left="648" w:hanging="288"/>
-      </w:pPr>
-      <w:r>
-        <w:rPr>
-          <w:b/>
-        </w:rPr>
-        <w:t>lambda.min</w:t>
-      </w:r>
-      <w:r>
-        <w:rPr/>
-        <w:t xml:space="preserve"> is the λ that minimizes CV(λ). Smaller λ overfits (high variance), and larger λ over-shrinks (high bias).</w:t>
-      </w:r>
-    </w:p>
-    <w:p>
-      <w:pPr>
         <w:pBdr>
           <w:left w:val="single" w:sz="18" w:space="8" w:color="2F5496"/>
         </w:pBdr>
@@ -7043,7 +5788,17 @@
       </w:pPr>
       <w:r>
         <w:rPr/>
-        <w:t>lambda.1se = 0.9725 (6 nonzero coefficients) is also marked on the plot but, as instructed, is not used; lambda.min is used throughout.</w:t>
+        <w:t xml:space="preserve">The data are randomly split into 10 folds (seed 6166). For each value of λ, the LASSO model is fitted on 9 folds and its mean squared error is computed on the remaining fold. This is repeated so that each fold is left out once, and the 10 errors are averaged to give the cross-validation MSE for that λ. The λ with the </w:t>
+      </w:r>
+      <w:r>
+        <w:rPr>
+          <w:b/>
+        </w:rPr>
+        <w:t>smallest average MSE</w:t>
+      </w:r>
+      <w:r>
+        <w:rPr/>
+        <w:t xml:space="preserve"> is lambda.min. A λ that is too small overfits the data, and one that is too large shrinks the coefficients too much, so the minimum lies in between. lambda.min is used for the rest of the analysis.</w:t>
       </w:r>
     </w:p>
     <w:p>
@@ -7973,10 +6728,6 @@
         </w:rPr>
         <w:t>X1, X4, X5, X6, X7, X10, X13, X14</w:t>
       </w:r>
-      <w:r>
-        <w:rPr/>
-        <w:t xml:space="preserve"> (intercept = 1.6903, not counted).</w:t>
-      </w:r>
     </w:p>
     <w:p>
       <w:pPr>
@@ -8039,7 +6790,7 @@
       </w:r>
       <w:r>
         <w:rPr/>
-        <w:t>. The other 7 (X2, X3, X8, X9, X11, X12, X15) are set exactly to 0.</w:t>
+        <w:t>.</w:t>
       </w:r>
     </w:p>
     <w:p>
@@ -8100,823 +6851,13 @@
         <w:rPr>
           <w:b/>
         </w:rPr>
-        <w:t>Effect on coefficients.</w:t>
+        <w:t>Effect on the coefficients:</w:t>
       </w:r>
       <w:r>
         <w:rPr/>
-        <w:t xml:space="preserve"> The penalty pulls every estimate toward zero compared with OLS, while keeping its sign. Weak predictors shrink proportionally much more than strong ones: X10 loses about 8%, X6 over 90%.</w:t>
+        <w:t xml:space="preserve"> the penalty shrinks the coefficients toward zero compared with ordinary least squares. For example, the estimate for X10 drops from 7.2157 (full model) to 6.6284, and X13 from −2.6675 to −1.6222. Weak predictors shrink the most: X6 drops from 0.9065 to only 0.0682.</w:t>
       </w:r>
     </w:p>
-    <w:p>
-      <w:pPr>
-        <w:keepNext/>
-        <w:spacing w:before="120" w:after="60"/>
-      </w:pPr>
-      <w:r>
-        <w:rPr>
-          <w:i/>
-          <w:sz w:val="19"/>
-        </w:rPr>
-        <w:t>Table C. OLS versus LASSO estimates for the 8 predictors LASSO keeps.</w:t>
-      </w:r>
-    </w:p>
-    <w:tbl>
-      <w:tblPr>
-        <w:tblStyle w:val="TableGrid"/>
-        <w:tblW w:type="auto" w:w="0"/>
-        <w:jc w:val="center"/>
-        <w:tblLayout w:type="fixed"/>
-        <w:tblLook w:firstColumn="1" w:firstRow="1" w:lastColumn="0" w:lastRow="0" w:noHBand="0" w:noVBand="1" w:val="04A0"/>
-      </w:tblPr>
-      <w:tblGrid>
-        <w:gridCol w:w="1584"/>
-        <w:gridCol w:w="2160"/>
-        <w:gridCol w:w="2304"/>
-        <w:gridCol w:w="1584"/>
-      </w:tblGrid>
-      <w:tr>
-        <w:tc>
-          <w:tcPr>
-            <w:tcW w:type="dxa" w:w="1584"/>
-            <w:shd w:val="clear" w:color="auto" w:fill="EAF0F7"/>
-            <w:tcMar>
-              <w:top w:w="50" w:type="dxa"/>
-              <w:bottom w:w="50" w:type="dxa"/>
-            </w:tcMar>
-          </w:tcPr>
-          <w:p>
-            <w:pPr>
-              <w:spacing w:after="0"/>
-              <w:jc w:val="center"/>
-            </w:pPr>
-            <w:r>
-              <w:rPr>
-                <w:b/>
-                <w:sz w:val="19"/>
-              </w:rPr>
-              <w:t>Predictor</w:t>
-            </w:r>
-          </w:p>
-        </w:tc>
-        <w:tc>
-          <w:tcPr>
-            <w:tcW w:type="dxa" w:w="2160"/>
-            <w:shd w:val="clear" w:color="auto" w:fill="EAF0F7"/>
-            <w:tcMar>
-              <w:top w:w="50" w:type="dxa"/>
-              <w:bottom w:w="50" w:type="dxa"/>
-            </w:tcMar>
-          </w:tcPr>
-          <w:p>
-            <w:pPr>
-              <w:spacing w:after="0"/>
-              <w:jc w:val="center"/>
-            </w:pPr>
-            <w:r>
-              <w:rPr>
-                <w:b/>
-                <w:sz w:val="19"/>
-              </w:rPr>
-              <w:t>OLS (full model)</w:t>
-            </w:r>
-          </w:p>
-        </w:tc>
-        <w:tc>
-          <w:tcPr>
-            <w:tcW w:type="dxa" w:w="2304"/>
-            <w:shd w:val="clear" w:color="auto" w:fill="EAF0F7"/>
-            <w:tcMar>
-              <w:top w:w="50" w:type="dxa"/>
-              <w:bottom w:w="50" w:type="dxa"/>
-            </w:tcMar>
-          </w:tcPr>
-          <w:p>
-            <w:pPr>
-              <w:spacing w:after="0"/>
-              <w:jc w:val="center"/>
-            </w:pPr>
-            <w:r>
-              <w:rPr>
-                <w:b/>
-                <w:sz w:val="19"/>
-              </w:rPr>
-              <w:t>LASSO (lambda.min)</w:t>
-            </w:r>
-          </w:p>
-        </w:tc>
-        <w:tc>
-          <w:tcPr>
-            <w:tcW w:type="dxa" w:w="1584"/>
-            <w:shd w:val="clear" w:color="auto" w:fill="EAF0F7"/>
-            <w:tcMar>
-              <w:top w:w="50" w:type="dxa"/>
-              <w:bottom w:w="50" w:type="dxa"/>
-            </w:tcMar>
-          </w:tcPr>
-          <w:p>
-            <w:pPr>
-              <w:spacing w:after="0"/>
-              <w:jc w:val="center"/>
-            </w:pPr>
-            <w:r>
-              <w:rPr>
-                <w:b/>
-                <w:sz w:val="19"/>
-              </w:rPr>
-              <w:t>Shrinkage</w:t>
-            </w:r>
-          </w:p>
-        </w:tc>
-      </w:tr>
-      <w:tr>
-        <w:tc>
-          <w:tcPr>
-            <w:tcW w:type="dxa" w:w="1584"/>
-            <w:tcMar>
-              <w:top w:w="50" w:type="dxa"/>
-              <w:bottom w:w="50" w:type="dxa"/>
-            </w:tcMar>
-          </w:tcPr>
-          <w:p>
-            <w:pPr>
-              <w:spacing w:after="0"/>
-              <w:jc w:val="left"/>
-            </w:pPr>
-            <w:r>
-              <w:rPr>
-                <w:sz w:val="19"/>
-              </w:rPr>
-              <w:t>X1</w:t>
-            </w:r>
-          </w:p>
-        </w:tc>
-        <w:tc>
-          <w:tcPr>
-            <w:tcW w:type="dxa" w:w="2160"/>
-            <w:tcMar>
-              <w:top w:w="50" w:type="dxa"/>
-              <w:bottom w:w="50" w:type="dxa"/>
-            </w:tcMar>
-          </w:tcPr>
-          <w:p>
-            <w:pPr>
-              <w:spacing w:after="0"/>
-              <w:jc w:val="center"/>
-            </w:pPr>
-            <w:r>
-              <w:rPr>
-                <w:sz w:val="19"/>
-              </w:rPr>
-              <w:t>1.9115</w:t>
-            </w:r>
-          </w:p>
-        </w:tc>
-        <w:tc>
-          <w:tcPr>
-            <w:tcW w:type="dxa" w:w="2304"/>
-            <w:tcMar>
-              <w:top w:w="50" w:type="dxa"/>
-              <w:bottom w:w="50" w:type="dxa"/>
-            </w:tcMar>
-          </w:tcPr>
-          <w:p>
-            <w:pPr>
-              <w:spacing w:after="0"/>
-              <w:jc w:val="center"/>
-            </w:pPr>
-            <w:r>
-              <w:rPr>
-                <w:sz w:val="19"/>
-              </w:rPr>
-              <w:t>1.0794</w:t>
-            </w:r>
-          </w:p>
-        </w:tc>
-        <w:tc>
-          <w:tcPr>
-            <w:tcW w:type="dxa" w:w="1584"/>
-            <w:tcMar>
-              <w:top w:w="50" w:type="dxa"/>
-              <w:bottom w:w="50" w:type="dxa"/>
-            </w:tcMar>
-          </w:tcPr>
-          <w:p>
-            <w:pPr>
-              <w:spacing w:after="0"/>
-              <w:jc w:val="center"/>
-            </w:pPr>
-            <w:r>
-              <w:rPr>
-                <w:sz w:val="19"/>
-              </w:rPr>
-              <w:t>44%</w:t>
-            </w:r>
-          </w:p>
-        </w:tc>
-      </w:tr>
-      <w:tr>
-        <w:tc>
-          <w:tcPr>
-            <w:tcW w:type="dxa" w:w="1584"/>
-            <w:tcMar>
-              <w:top w:w="50" w:type="dxa"/>
-              <w:bottom w:w="50" w:type="dxa"/>
-            </w:tcMar>
-          </w:tcPr>
-          <w:p>
-            <w:pPr>
-              <w:spacing w:after="0"/>
-              <w:jc w:val="left"/>
-            </w:pPr>
-            <w:r>
-              <w:rPr>
-                <w:sz w:val="19"/>
-              </w:rPr>
-              <w:t>X4</w:t>
-            </w:r>
-          </w:p>
-        </w:tc>
-        <w:tc>
-          <w:tcPr>
-            <w:tcW w:type="dxa" w:w="2160"/>
-            <w:tcMar>
-              <w:top w:w="50" w:type="dxa"/>
-              <w:bottom w:w="50" w:type="dxa"/>
-            </w:tcMar>
-          </w:tcPr>
-          <w:p>
-            <w:pPr>
-              <w:spacing w:after="0"/>
-              <w:jc w:val="center"/>
-            </w:pPr>
-            <w:r>
-              <w:rPr>
-                <w:sz w:val="19"/>
-              </w:rPr>
-              <w:t>-2.6473</w:t>
-            </w:r>
-          </w:p>
-        </w:tc>
-        <w:tc>
-          <w:tcPr>
-            <w:tcW w:type="dxa" w:w="2304"/>
-            <w:tcMar>
-              <w:top w:w="50" w:type="dxa"/>
-              <w:bottom w:w="50" w:type="dxa"/>
-            </w:tcMar>
-          </w:tcPr>
-          <w:p>
-            <w:pPr>
-              <w:spacing w:after="0"/>
-              <w:jc w:val="center"/>
-            </w:pPr>
-            <w:r>
-              <w:rPr>
-                <w:sz w:val="19"/>
-              </w:rPr>
-              <w:t>-1.9285</w:t>
-            </w:r>
-          </w:p>
-        </w:tc>
-        <w:tc>
-          <w:tcPr>
-            <w:tcW w:type="dxa" w:w="1584"/>
-            <w:tcMar>
-              <w:top w:w="50" w:type="dxa"/>
-              <w:bottom w:w="50" w:type="dxa"/>
-            </w:tcMar>
-          </w:tcPr>
-          <w:p>
-            <w:pPr>
-              <w:spacing w:after="0"/>
-              <w:jc w:val="center"/>
-            </w:pPr>
-            <w:r>
-              <w:rPr>
-                <w:sz w:val="19"/>
-              </w:rPr>
-              <w:t>27%</w:t>
-            </w:r>
-          </w:p>
-        </w:tc>
-      </w:tr>
-      <w:tr>
-        <w:tc>
-          <w:tcPr>
-            <w:tcW w:type="dxa" w:w="1584"/>
-            <w:tcMar>
-              <w:top w:w="50" w:type="dxa"/>
-              <w:bottom w:w="50" w:type="dxa"/>
-            </w:tcMar>
-          </w:tcPr>
-          <w:p>
-            <w:pPr>
-              <w:spacing w:after="0"/>
-              <w:jc w:val="left"/>
-            </w:pPr>
-            <w:r>
-              <w:rPr>
-                <w:sz w:val="19"/>
-              </w:rPr>
-              <w:t>X5</w:t>
-            </w:r>
-          </w:p>
-        </w:tc>
-        <w:tc>
-          <w:tcPr>
-            <w:tcW w:type="dxa" w:w="2160"/>
-            <w:tcMar>
-              <w:top w:w="50" w:type="dxa"/>
-              <w:bottom w:w="50" w:type="dxa"/>
-            </w:tcMar>
-          </w:tcPr>
-          <w:p>
-            <w:pPr>
-              <w:spacing w:after="0"/>
-              <w:jc w:val="center"/>
-            </w:pPr>
-            <w:r>
-              <w:rPr>
-                <w:sz w:val="19"/>
-              </w:rPr>
-              <w:t>1.1445</w:t>
-            </w:r>
-          </w:p>
-        </w:tc>
-        <w:tc>
-          <w:tcPr>
-            <w:tcW w:type="dxa" w:w="2304"/>
-            <w:tcMar>
-              <w:top w:w="50" w:type="dxa"/>
-              <w:bottom w:w="50" w:type="dxa"/>
-            </w:tcMar>
-          </w:tcPr>
-          <w:p>
-            <w:pPr>
-              <w:spacing w:after="0"/>
-              <w:jc w:val="center"/>
-            </w:pPr>
-            <w:r>
-              <w:rPr>
-                <w:sz w:val="19"/>
-              </w:rPr>
-              <w:t>0.4184</w:t>
-            </w:r>
-          </w:p>
-        </w:tc>
-        <w:tc>
-          <w:tcPr>
-            <w:tcW w:type="dxa" w:w="1584"/>
-            <w:tcMar>
-              <w:top w:w="50" w:type="dxa"/>
-              <w:bottom w:w="50" w:type="dxa"/>
-            </w:tcMar>
-          </w:tcPr>
-          <w:p>
-            <w:pPr>
-              <w:spacing w:after="0"/>
-              <w:jc w:val="center"/>
-            </w:pPr>
-            <w:r>
-              <w:rPr>
-                <w:sz w:val="19"/>
-              </w:rPr>
-              <w:t>63%</w:t>
-            </w:r>
-          </w:p>
-        </w:tc>
-      </w:tr>
-      <w:tr>
-        <w:tc>
-          <w:tcPr>
-            <w:tcW w:type="dxa" w:w="1584"/>
-            <w:tcMar>
-              <w:top w:w="50" w:type="dxa"/>
-              <w:bottom w:w="50" w:type="dxa"/>
-            </w:tcMar>
-          </w:tcPr>
-          <w:p>
-            <w:pPr>
-              <w:spacing w:after="0"/>
-              <w:jc w:val="left"/>
-            </w:pPr>
-            <w:r>
-              <w:rPr>
-                <w:sz w:val="19"/>
-              </w:rPr>
-              <w:t>X6</w:t>
-            </w:r>
-          </w:p>
-        </w:tc>
-        <w:tc>
-          <w:tcPr>
-            <w:tcW w:type="dxa" w:w="2160"/>
-            <w:tcMar>
-              <w:top w:w="50" w:type="dxa"/>
-              <w:bottom w:w="50" w:type="dxa"/>
-            </w:tcMar>
-          </w:tcPr>
-          <w:p>
-            <w:pPr>
-              <w:spacing w:after="0"/>
-              <w:jc w:val="center"/>
-            </w:pPr>
-            <w:r>
-              <w:rPr>
-                <w:sz w:val="19"/>
-              </w:rPr>
-              <w:t>0.9065</w:t>
-            </w:r>
-          </w:p>
-        </w:tc>
-        <w:tc>
-          <w:tcPr>
-            <w:tcW w:type="dxa" w:w="2304"/>
-            <w:tcMar>
-              <w:top w:w="50" w:type="dxa"/>
-              <w:bottom w:w="50" w:type="dxa"/>
-            </w:tcMar>
-          </w:tcPr>
-          <w:p>
-            <w:pPr>
-              <w:spacing w:after="0"/>
-              <w:jc w:val="center"/>
-            </w:pPr>
-            <w:r>
-              <w:rPr>
-                <w:sz w:val="19"/>
-              </w:rPr>
-              <w:t>0.0682</w:t>
-            </w:r>
-          </w:p>
-        </w:tc>
-        <w:tc>
-          <w:tcPr>
-            <w:tcW w:type="dxa" w:w="1584"/>
-            <w:tcMar>
-              <w:top w:w="50" w:type="dxa"/>
-              <w:bottom w:w="50" w:type="dxa"/>
-            </w:tcMar>
-          </w:tcPr>
-          <w:p>
-            <w:pPr>
-              <w:spacing w:after="0"/>
-              <w:jc w:val="center"/>
-            </w:pPr>
-            <w:r>
-              <w:rPr>
-                <w:sz w:val="19"/>
-              </w:rPr>
-              <w:t>92%</w:t>
-            </w:r>
-          </w:p>
-        </w:tc>
-      </w:tr>
-      <w:tr>
-        <w:tc>
-          <w:tcPr>
-            <w:tcW w:type="dxa" w:w="1584"/>
-            <w:tcMar>
-              <w:top w:w="50" w:type="dxa"/>
-              <w:bottom w:w="50" w:type="dxa"/>
-            </w:tcMar>
-          </w:tcPr>
-          <w:p>
-            <w:pPr>
-              <w:spacing w:after="0"/>
-              <w:jc w:val="left"/>
-            </w:pPr>
-            <w:r>
-              <w:rPr>
-                <w:sz w:val="19"/>
-              </w:rPr>
-              <w:t>X7</w:t>
-            </w:r>
-          </w:p>
-        </w:tc>
-        <w:tc>
-          <w:tcPr>
-            <w:tcW w:type="dxa" w:w="2160"/>
-            <w:tcMar>
-              <w:top w:w="50" w:type="dxa"/>
-              <w:bottom w:w="50" w:type="dxa"/>
-            </w:tcMar>
-          </w:tcPr>
-          <w:p>
-            <w:pPr>
-              <w:spacing w:after="0"/>
-              <w:jc w:val="center"/>
-            </w:pPr>
-            <w:r>
-              <w:rPr>
-                <w:sz w:val="19"/>
-              </w:rPr>
-              <w:t>1.2767</w:t>
-            </w:r>
-          </w:p>
-        </w:tc>
-        <w:tc>
-          <w:tcPr>
-            <w:tcW w:type="dxa" w:w="2304"/>
-            <w:tcMar>
-              <w:top w:w="50" w:type="dxa"/>
-              <w:bottom w:w="50" w:type="dxa"/>
-            </w:tcMar>
-          </w:tcPr>
-          <w:p>
-            <w:pPr>
-              <w:spacing w:after="0"/>
-              <w:jc w:val="center"/>
-            </w:pPr>
-            <w:r>
-              <w:rPr>
-                <w:sz w:val="19"/>
-              </w:rPr>
-              <w:t>0.8993</w:t>
-            </w:r>
-          </w:p>
-        </w:tc>
-        <w:tc>
-          <w:tcPr>
-            <w:tcW w:type="dxa" w:w="1584"/>
-            <w:tcMar>
-              <w:top w:w="50" w:type="dxa"/>
-              <w:bottom w:w="50" w:type="dxa"/>
-            </w:tcMar>
-          </w:tcPr>
-          <w:p>
-            <w:pPr>
-              <w:spacing w:after="0"/>
-              <w:jc w:val="center"/>
-            </w:pPr>
-            <w:r>
-              <w:rPr>
-                <w:sz w:val="19"/>
-              </w:rPr>
-              <w:t>30%</w:t>
-            </w:r>
-          </w:p>
-        </w:tc>
-      </w:tr>
-      <w:tr>
-        <w:tc>
-          <w:tcPr>
-            <w:tcW w:type="dxa" w:w="1584"/>
-            <w:tcMar>
-              <w:top w:w="50" w:type="dxa"/>
-              <w:bottom w:w="50" w:type="dxa"/>
-            </w:tcMar>
-          </w:tcPr>
-          <w:p>
-            <w:pPr>
-              <w:spacing w:after="0"/>
-              <w:jc w:val="left"/>
-            </w:pPr>
-            <w:r>
-              <w:rPr>
-                <w:sz w:val="19"/>
-              </w:rPr>
-              <w:t>X10</w:t>
-            </w:r>
-          </w:p>
-        </w:tc>
-        <w:tc>
-          <w:tcPr>
-            <w:tcW w:type="dxa" w:w="2160"/>
-            <w:tcMar>
-              <w:top w:w="50" w:type="dxa"/>
-              <w:bottom w:w="50" w:type="dxa"/>
-            </w:tcMar>
-          </w:tcPr>
-          <w:p>
-            <w:pPr>
-              <w:spacing w:after="0"/>
-              <w:jc w:val="center"/>
-            </w:pPr>
-            <w:r>
-              <w:rPr>
-                <w:sz w:val="19"/>
-              </w:rPr>
-              <w:t>7.2157</w:t>
-            </w:r>
-          </w:p>
-        </w:tc>
-        <w:tc>
-          <w:tcPr>
-            <w:tcW w:type="dxa" w:w="2304"/>
-            <w:tcMar>
-              <w:top w:w="50" w:type="dxa"/>
-              <w:bottom w:w="50" w:type="dxa"/>
-            </w:tcMar>
-          </w:tcPr>
-          <w:p>
-            <w:pPr>
-              <w:spacing w:after="0"/>
-              <w:jc w:val="center"/>
-            </w:pPr>
-            <w:r>
-              <w:rPr>
-                <w:sz w:val="19"/>
-              </w:rPr>
-              <w:t>6.6284</w:t>
-            </w:r>
-          </w:p>
-        </w:tc>
-        <w:tc>
-          <w:tcPr>
-            <w:tcW w:type="dxa" w:w="1584"/>
-            <w:tcMar>
-              <w:top w:w="50" w:type="dxa"/>
-              <w:bottom w:w="50" w:type="dxa"/>
-            </w:tcMar>
-          </w:tcPr>
-          <w:p>
-            <w:pPr>
-              <w:spacing w:after="0"/>
-              <w:jc w:val="center"/>
-            </w:pPr>
-            <w:r>
-              <w:rPr>
-                <w:sz w:val="19"/>
-              </w:rPr>
-              <w:t>8%</w:t>
-            </w:r>
-          </w:p>
-        </w:tc>
-      </w:tr>
-      <w:tr>
-        <w:tc>
-          <w:tcPr>
-            <w:tcW w:type="dxa" w:w="1584"/>
-            <w:tcMar>
-              <w:top w:w="50" w:type="dxa"/>
-              <w:bottom w:w="50" w:type="dxa"/>
-            </w:tcMar>
-          </w:tcPr>
-          <w:p>
-            <w:pPr>
-              <w:spacing w:after="0"/>
-              <w:jc w:val="left"/>
-            </w:pPr>
-            <w:r>
-              <w:rPr>
-                <w:sz w:val="19"/>
-              </w:rPr>
-              <w:t>X13</w:t>
-            </w:r>
-          </w:p>
-        </w:tc>
-        <w:tc>
-          <w:tcPr>
-            <w:tcW w:type="dxa" w:w="2160"/>
-            <w:tcMar>
-              <w:top w:w="50" w:type="dxa"/>
-              <w:bottom w:w="50" w:type="dxa"/>
-            </w:tcMar>
-          </w:tcPr>
-          <w:p>
-            <w:pPr>
-              <w:spacing w:after="0"/>
-              <w:jc w:val="center"/>
-            </w:pPr>
-            <w:r>
-              <w:rPr>
-                <w:sz w:val="19"/>
-              </w:rPr>
-              <w:t>-2.6675</w:t>
-            </w:r>
-          </w:p>
-        </w:tc>
-        <w:tc>
-          <w:tcPr>
-            <w:tcW w:type="dxa" w:w="2304"/>
-            <w:tcMar>
-              <w:top w:w="50" w:type="dxa"/>
-              <w:bottom w:w="50" w:type="dxa"/>
-            </w:tcMar>
-          </w:tcPr>
-          <w:p>
-            <w:pPr>
-              <w:spacing w:after="0"/>
-              <w:jc w:val="center"/>
-            </w:pPr>
-            <w:r>
-              <w:rPr>
-                <w:sz w:val="19"/>
-              </w:rPr>
-              <w:t>-1.6222</w:t>
-            </w:r>
-          </w:p>
-        </w:tc>
-        <w:tc>
-          <w:tcPr>
-            <w:tcW w:type="dxa" w:w="1584"/>
-            <w:tcMar>
-              <w:top w:w="50" w:type="dxa"/>
-              <w:bottom w:w="50" w:type="dxa"/>
-            </w:tcMar>
-          </w:tcPr>
-          <w:p>
-            <w:pPr>
-              <w:spacing w:after="0"/>
-              <w:jc w:val="center"/>
-            </w:pPr>
-            <w:r>
-              <w:rPr>
-                <w:sz w:val="19"/>
-              </w:rPr>
-              <w:t>39%</w:t>
-            </w:r>
-          </w:p>
-        </w:tc>
-      </w:tr>
-      <w:tr>
-        <w:tc>
-          <w:tcPr>
-            <w:tcW w:type="dxa" w:w="1584"/>
-            <w:tcMar>
-              <w:top w:w="50" w:type="dxa"/>
-              <w:bottom w:w="50" w:type="dxa"/>
-            </w:tcMar>
-          </w:tcPr>
-          <w:p>
-            <w:pPr>
-              <w:spacing w:after="0"/>
-              <w:jc w:val="left"/>
-            </w:pPr>
-            <w:r>
-              <w:rPr>
-                <w:sz w:val="19"/>
-              </w:rPr>
-              <w:t>X14</w:t>
-            </w:r>
-          </w:p>
-        </w:tc>
-        <w:tc>
-          <w:tcPr>
-            <w:tcW w:type="dxa" w:w="2160"/>
-            <w:tcMar>
-              <w:top w:w="50" w:type="dxa"/>
-              <w:bottom w:w="50" w:type="dxa"/>
-            </w:tcMar>
-          </w:tcPr>
-          <w:p>
-            <w:pPr>
-              <w:spacing w:after="0"/>
-              <w:jc w:val="center"/>
-            </w:pPr>
-            <w:r>
-              <w:rPr>
-                <w:sz w:val="19"/>
-              </w:rPr>
-              <w:t>-1.6059</w:t>
-            </w:r>
-          </w:p>
-        </w:tc>
-        <w:tc>
-          <w:tcPr>
-            <w:tcW w:type="dxa" w:w="2304"/>
-            <w:tcMar>
-              <w:top w:w="50" w:type="dxa"/>
-              <w:bottom w:w="50" w:type="dxa"/>
-            </w:tcMar>
-          </w:tcPr>
-          <w:p>
-            <w:pPr>
-              <w:spacing w:after="0"/>
-              <w:jc w:val="center"/>
-            </w:pPr>
-            <w:r>
-              <w:rPr>
-                <w:sz w:val="19"/>
-              </w:rPr>
-              <w:t>-1.1693</w:t>
-            </w:r>
-          </w:p>
-        </w:tc>
-        <w:tc>
-          <w:tcPr>
-            <w:tcW w:type="dxa" w:w="1584"/>
-            <w:tcMar>
-              <w:top w:w="50" w:type="dxa"/>
-              <w:bottom w:w="50" w:type="dxa"/>
-            </w:tcMar>
-          </w:tcPr>
-          <w:p>
-            <w:pPr>
-              <w:spacing w:after="0"/>
-              <w:jc w:val="center"/>
-            </w:pPr>
-            <w:r>
-              <w:rPr>
-                <w:sz w:val="19"/>
-              </w:rPr>
-              <w:t>27%</w:t>
-            </w:r>
-          </w:p>
-        </w:tc>
-      </w:tr>
-    </w:tbl>
     <w:p>
       <w:pPr>
         <w:pBdr>
@@ -8929,11 +6870,11 @@
         <w:rPr>
           <w:b/>
         </w:rPr>
-        <w:t>Why some predictors are excluded.</w:t>
+        <w:t>Why some are excluded:</w:t>
       </w:r>
       <w:r>
         <w:rPr/>
-        <w:t xml:space="preserve"> A predictor is dropped when its contribution to reducing the squared error does not outweigh the penalty λ|βⱼ|; soft-thresholding then sets its estimate to exactly 0. The seven excluded predictors all had small, clearly non-significant OLS estimates (|t| &lt; 0.75), and X6 only barely survives (0.068).</w:t>
+        <w:t xml:space="preserve"> a predictor whose contribution to reducing the squared error is smaller than the penalty is set exactly to zero. Here X2, X3, X8, X9, X11, X12 and X15 were excluded; they were all far from significant in the full model.</w:t>
       </w:r>
     </w:p>
     <w:p>
@@ -8948,11 +6889,11 @@
         <w:rPr>
           <w:b/>
         </w:rPr>
-        <w:t>λ and sparsity.</w:t>
+        <w:t>λ and sparsity:</w:t>
       </w:r>
       <w:r>
         <w:rPr/>
-        <w:t xml:space="preserve"> Larger λ gives a sparser model. The top axis of Figure 2 shows the number of nonzero coefficients falling from 15 at small λ to 8 at lambda.min, 6 at lambda.1se, 1 (X10 only) for log λ between about 1 and 1.8, and 0 at λ_max ≈ 6.86.</w:t>
+        <w:t xml:space="preserve"> the larger λ is, the sparser the model. The numbers on top of Figure 2 show the number of nonzero coefficients falling from 15 at small λ, to 8 at lambda.min, 6 at lambda.1se, and 0 at the largest λ.</w:t>
       </w:r>
     </w:p>
     <w:p>
@@ -9762,7 +7703,7 @@
       </w:r>
       <w:r>
         <w:rPr/>
-        <w:t xml:space="preserve"> Classical selection (stepwise BIC): </w:t>
+        <w:t xml:space="preserve"> Classical selection (stepwise BIC) selected </w:t>
       </w:r>
       <w:r>
         <w:rPr>
@@ -9772,7 +7713,7 @@
       </w:r>
       <w:r>
         <w:rPr/>
-        <w:t xml:space="preserve"> predictors. LASSO (lambda.min): </w:t>
+        <w:t xml:space="preserve"> predictors; LASSO selected </w:t>
       </w:r>
       <w:r>
         <w:rPr>
@@ -9840,7 +7781,7 @@
       </w:r>
       <w:r>
         <w:rPr/>
-        <w:t>, all by LASSO only. No predictor is chosen by the classical method alone, so the classical set is a subset of the LASSO set.</w:t>
+        <w:t xml:space="preserve"> (LASSO only). No predictor was selected only by the classical method.</w:t>
       </w:r>
     </w:p>
     <w:p>
@@ -9874,17 +7815,17 @@
       </w:r>
       <w:r>
         <w:rPr/>
-        <w:t xml:space="preserve"> Both methods keep the same five core predictors, but LASSO adds X5, X6 and X7, so the </w:t>
+        <w:t xml:space="preserve"> Both methods select X1, X4, X10, X13 and X14, but LASSO also selects X5, X6 and X7. The </w:t>
       </w:r>
       <w:r>
         <w:rPr>
           <w:b/>
         </w:rPr>
-        <w:t>classical BIC model is smaller</w:t>
+        <w:t>classical method (BIC) selects fewer</w:t>
       </w:r>
       <w:r>
         <w:rPr/>
-        <w:t xml:space="preserve"> (5 vs 8). Reasons:</w:t>
+        <w:t xml:space="preserve"> predictors (5 vs 8). Reasons the sets differ:</w:t>
       </w:r>
     </w:p>
     <w:p>
@@ -9900,11 +7841,11 @@
         <w:rPr>
           <w:b/>
         </w:rPr>
-        <w:t>Different criteria.</w:t>
+        <w:t>Different criteria:</w:t>
       </w:r>
       <w:r>
         <w:rPr/>
-        <w:t xml:space="preserve"> BIC charges log(100) ≈ 4.61 per parameter and aims at the true sparse model. lambda.min instead minimizes prediction error, which tends to keep weak predictors that lower MSE slightly. The same pattern appears within the classical methods: AIC and Cp keep 7 predictors, and adjusted R² keeps 8, exactly the LASSO set (Table A).</w:t>
+        <w:t xml:space="preserve"> BIC has a heavy penalty for each extra predictor and aims for a simple model, whereas lambda.min minimizes cross-validation prediction error, which often keeps a few weak predictors. In the code, AIC and Cp also kept 7 predictors and adjusted R² kept the same 8 as LASSO.</w:t>
       </w:r>
     </w:p>
     <w:p>
@@ -9920,11 +7861,11 @@
         <w:rPr>
           <w:b/>
         </w:rPr>
-        <w:t>Coefficient shrinkage.</w:t>
+        <w:t>Coefficient shrinkage:</w:t>
       </w:r>
       <w:r>
         <w:rPr/>
-        <w:t xml:space="preserve"> LASSO lets a weak predictor in cheaply, with a tiny coefficient (X6 = 0.068, X5 = 0.418). Because lambda.min also shrinks the strong effects (X13: −2.67 → −1.62), the extra small terms partly make up for that. In subset selection a predictor is either out or in at its full OLS size, paying the full BIC penalty.</w:t>
+        <w:t xml:space="preserve"> LASSO can keep a weak predictor with a very small coefficient (e.g., X6 = 0.068), while classical selection must include a predictor at its full OLS estimate or drop it completely.</w:t>
       </w:r>
     </w:p>
     <w:p>
@@ -9940,11 +7881,42 @@
         <w:rPr>
           <w:b/>
         </w:rPr>
-        <w:t>Correlation among predictors.</w:t>
+        <w:t>Correlation among predictors:</w:t>
       </w:r>
       <w:r>
         <w:rPr/>
-        <w:t xml:space="preserve"> Correlations here are weak (largest |r| = 0.295, X5 with X13; VIFs 1.05–1.24), so this is a minor factor. Still, X5 overlaps with X13 and X14 (r = 0.295, −0.211): once those are in, X5 adds little and greedy stepwise never adds it, whereas LASSO spreads the effect and keeps X5 with a small coefficient.</w:t>
+        <w:t xml:space="preserve"> when predictors are correlated, they share information. Stepwise selection may keep one and drop the other, while LASSO may keep both with smaller coefficients, which leads to different selected sets.</w:t>
+      </w:r>
+    </w:p>
+    <w:p>
+      <w:pPr>
+        <w:keepNext/>
+        <w:spacing w:before="280"/>
+      </w:pPr>
+      <w:r>
+        <w:rPr>
+          <w:b/>
+        </w:rPr>
+        <w:lastRenderedPageBreak/>
+        <w:t xml:space="preserve">Question 15. Final discussion (5 points). </w:t>
+      </w:r>
+      <w:r>
+        <w:t>State which method you prefer for this dataset and justify your choice using model simplicity, the selected predictors, and the results of your analysis. Do not assume that a selected predictor is necessarily a true predictor: the identities of the 5 nonzero population coefficients are unknown to you.</w:t>
+      </w:r>
+    </w:p>
+    <w:p>
+      <w:pPr>
+        <w:pBdr>
+          <w:left w:val="single" w:sz="18" w:space="8" w:color="2F5496"/>
+        </w:pBdr>
+        <w:spacing w:after="100" w:before="0"/>
+        <w:ind w:left="288"/>
+      </w:pPr>
+      <w:r>
+        <w:rPr>
+          <w:b/>
+        </w:rPr>
+        <w:t>I prefer the classical bidirectional stepwise model with BIC (X1, X4, X10, X13, X14).</w:t>
       </w:r>
     </w:p>
     <w:p>
@@ -9960,444 +7932,11 @@
         <w:rPr>
           <w:b/>
         </w:rPr>
-        <w:t>Search and randomness.</w:t>
+        <w:t>Model simplicity:</w:t>
       </w:r>
       <w:r>
         <w:rPr/>
-        <w:t xml:space="preserve"> Stepwise selection is a greedy, discrete search, while LASSO follows a continuous path. lambda.min also depends on the random fold split.</w:t>
-      </w:r>
-    </w:p>
-    <w:p>
-      <w:pPr>
-        <w:keepNext/>
-        <w:spacing w:before="280"/>
-      </w:pPr>
-      <w:r>
-        <w:rPr>
-          <w:b/>
-        </w:rPr>
-        <w:lastRenderedPageBreak/>
-        <w:t xml:space="preserve">Question 15. Final discussion (5 points). </w:t>
-      </w:r>
-      <w:r>
-        <w:t>State which method you prefer for this dataset and justify your choice using model simplicity, the selected predictors, and the results of your analysis. Do not assume that a selected predictor is necessarily a true predictor: the identities of the 5 nonzero population coefficients are unknown to you.</w:t>
-      </w:r>
-    </w:p>
-    <w:p>
-      <w:pPr>
-        <w:pBdr>
-          <w:left w:val="single" w:sz="18" w:space="8" w:color="2F5496"/>
-        </w:pBdr>
-        <w:spacing w:after="100" w:before="0"/>
-        <w:ind w:left="288"/>
-      </w:pPr>
-      <w:r>
-        <w:rPr>
-          <w:b/>
-        </w:rPr>
-        <w:t>Preferred: the classical bidirectional stepwise model with BIC (X1, X4, X10, X13, X14).</w:t>
-      </w:r>
-    </w:p>
-    <w:p>
-      <w:pPr>
-        <w:keepNext/>
-        <w:spacing w:before="120" w:after="60"/>
-      </w:pPr>
-      <w:r>
-        <w:rPr>
-          <w:i/>
-          <w:sz w:val="19"/>
-        </w:rPr>
-        <w:t>Table D. Summary of the three models.</w:t>
-      </w:r>
-    </w:p>
-    <w:tbl>
-      <w:tblPr>
-        <w:tblStyle w:val="TableGrid"/>
-        <w:tblW w:type="auto" w:w="0"/>
-        <w:jc w:val="center"/>
-        <w:tblLayout w:type="fixed"/>
-        <w:tblLook w:firstColumn="1" w:firstRow="1" w:lastColumn="0" w:lastRow="0" w:noHBand="0" w:noVBand="1" w:val="04A0"/>
-      </w:tblPr>
-      <w:tblGrid>
-        <w:gridCol w:w="2736"/>
-        <w:gridCol w:w="1440"/>
-        <w:gridCol w:w="1728"/>
-        <w:gridCol w:w="2016"/>
-      </w:tblGrid>
-      <w:tr>
-        <w:tc>
-          <w:tcPr>
-            <w:tcW w:type="dxa" w:w="2736"/>
-            <w:shd w:val="clear" w:color="auto" w:fill="EAF0F7"/>
-            <w:tcMar>
-              <w:top w:w="50" w:type="dxa"/>
-              <w:bottom w:w="50" w:type="dxa"/>
-            </w:tcMar>
-          </w:tcPr>
-          <w:p>
-            <w:pPr>
-              <w:spacing w:after="0"/>
-              <w:jc w:val="center"/>
-            </w:pPr>
-            <w:r>
-              <w:rPr>
-                <w:b/>
-                <w:sz w:val="19"/>
-              </w:rPr>
-              <w:t>Model</w:t>
-            </w:r>
-          </w:p>
-        </w:tc>
-        <w:tc>
-          <w:tcPr>
-            <w:tcW w:type="dxa" w:w="1440"/>
-            <w:shd w:val="clear" w:color="auto" w:fill="EAF0F7"/>
-            <w:tcMar>
-              <w:top w:w="50" w:type="dxa"/>
-              <w:bottom w:w="50" w:type="dxa"/>
-            </w:tcMar>
-          </w:tcPr>
-          <w:p>
-            <w:pPr>
-              <w:spacing w:after="0"/>
-              <w:jc w:val="center"/>
-            </w:pPr>
-            <w:r>
-              <w:rPr>
-                <w:b/>
-                <w:sz w:val="19"/>
-              </w:rPr>
-              <w:t>Predictors</w:t>
-            </w:r>
-          </w:p>
-        </w:tc>
-        <w:tc>
-          <w:tcPr>
-            <w:tcW w:type="dxa" w:w="1728"/>
-            <w:shd w:val="clear" w:color="auto" w:fill="EAF0F7"/>
-            <w:tcMar>
-              <w:top w:w="50" w:type="dxa"/>
-              <w:bottom w:w="50" w:type="dxa"/>
-            </w:tcMar>
-          </w:tcPr>
-          <w:p>
-            <w:pPr>
-              <w:spacing w:after="0"/>
-              <w:jc w:val="center"/>
-            </w:pPr>
-            <w:r>
-              <w:rPr>
-                <w:b/>
-                <w:sz w:val="19"/>
-              </w:rPr>
-              <w:t>Adjusted R²</w:t>
-            </w:r>
-          </w:p>
-        </w:tc>
-        <w:tc>
-          <w:tcPr>
-            <w:tcW w:type="dxa" w:w="2016"/>
-            <w:shd w:val="clear" w:color="auto" w:fill="EAF0F7"/>
-            <w:tcMar>
-              <w:top w:w="50" w:type="dxa"/>
-              <w:bottom w:w="50" w:type="dxa"/>
-            </w:tcMar>
-          </w:tcPr>
-          <w:p>
-            <w:pPr>
-              <w:spacing w:after="0"/>
-              <w:jc w:val="center"/>
-            </w:pPr>
-            <w:r>
-              <w:rPr>
-                <w:b/>
-                <w:sz w:val="19"/>
-              </w:rPr>
-              <w:t>10-fold CV MSE</w:t>
-            </w:r>
-            <w:r>
-              <w:rPr>
-                <w:sz w:val="19"/>
-              </w:rPr>
-              <w:t>*</w:t>
-            </w:r>
-          </w:p>
-        </w:tc>
-      </w:tr>
-      <w:tr>
-        <w:tc>
-          <w:tcPr>
-            <w:tcW w:type="dxa" w:w="2736"/>
-            <w:tcMar>
-              <w:top w:w="50" w:type="dxa"/>
-              <w:bottom w:w="50" w:type="dxa"/>
-            </w:tcMar>
-          </w:tcPr>
-          <w:p>
-            <w:pPr>
-              <w:spacing w:after="0"/>
-              <w:jc w:val="left"/>
-            </w:pPr>
-            <w:r>
-              <w:rPr>
-                <w:sz w:val="19"/>
-              </w:rPr>
-              <w:t>Full OLS</w:t>
-            </w:r>
-          </w:p>
-        </w:tc>
-        <w:tc>
-          <w:tcPr>
-            <w:tcW w:type="dxa" w:w="1440"/>
-            <w:tcMar>
-              <w:top w:w="50" w:type="dxa"/>
-              <w:bottom w:w="50" w:type="dxa"/>
-            </w:tcMar>
-          </w:tcPr>
-          <w:p>
-            <w:pPr>
-              <w:spacing w:after="0"/>
-              <w:jc w:val="center"/>
-            </w:pPr>
-            <w:r>
-              <w:rPr>
-                <w:sz w:val="19"/>
-              </w:rPr>
-              <w:t>15</w:t>
-            </w:r>
-          </w:p>
-        </w:tc>
-        <w:tc>
-          <w:tcPr>
-            <w:tcW w:type="dxa" w:w="1728"/>
-            <w:tcMar>
-              <w:top w:w="50" w:type="dxa"/>
-              <w:bottom w:w="50" w:type="dxa"/>
-            </w:tcMar>
-          </w:tcPr>
-          <w:p>
-            <w:pPr>
-              <w:spacing w:after="0"/>
-              <w:jc w:val="center"/>
-            </w:pPr>
-            <w:r>
-              <w:rPr>
-                <w:sz w:val="19"/>
-              </w:rPr>
-              <w:t>0.5882</w:t>
-            </w:r>
-          </w:p>
-        </w:tc>
-        <w:tc>
-          <w:tcPr>
-            <w:tcW w:type="dxa" w:w="2016"/>
-            <w:tcMar>
-              <w:top w:w="50" w:type="dxa"/>
-              <w:bottom w:w="50" w:type="dxa"/>
-            </w:tcMar>
-          </w:tcPr>
-          <w:p>
-            <w:pPr>
-              <w:spacing w:after="0"/>
-              <w:jc w:val="center"/>
-            </w:pPr>
-            <w:r>
-              <w:rPr>
-                <w:sz w:val="19"/>
-              </w:rPr>
-              <w:t>49.92</w:t>
-            </w:r>
-          </w:p>
-        </w:tc>
-      </w:tr>
-      <w:tr>
-        <w:tc>
-          <w:tcPr>
-            <w:tcW w:type="dxa" w:w="2736"/>
-            <w:tcMar>
-              <w:top w:w="50" w:type="dxa"/>
-              <w:bottom w:w="50" w:type="dxa"/>
-            </w:tcMar>
-          </w:tcPr>
-          <w:p>
-            <w:pPr>
-              <w:spacing w:after="0"/>
-              <w:jc w:val="left"/>
-            </w:pPr>
-            <w:r>
-              <w:rPr>
-                <w:b/>
-                <w:sz w:val="19"/>
-              </w:rPr>
-              <w:t>Stepwise BIC (OLS)</w:t>
-            </w:r>
-          </w:p>
-        </w:tc>
-        <w:tc>
-          <w:tcPr>
-            <w:tcW w:type="dxa" w:w="1440"/>
-            <w:tcMar>
-              <w:top w:w="50" w:type="dxa"/>
-              <w:bottom w:w="50" w:type="dxa"/>
-            </w:tcMar>
-          </w:tcPr>
-          <w:p>
-            <w:pPr>
-              <w:spacing w:after="0"/>
-              <w:jc w:val="center"/>
-            </w:pPr>
-            <w:r>
-              <w:rPr>
-                <w:b/>
-                <w:sz w:val="19"/>
-              </w:rPr>
-              <w:t>5</w:t>
-            </w:r>
-          </w:p>
-        </w:tc>
-        <w:tc>
-          <w:tcPr>
-            <w:tcW w:type="dxa" w:w="1728"/>
-            <w:tcMar>
-              <w:top w:w="50" w:type="dxa"/>
-              <w:bottom w:w="50" w:type="dxa"/>
-            </w:tcMar>
-          </w:tcPr>
-          <w:p>
-            <w:pPr>
-              <w:spacing w:after="0"/>
-              <w:jc w:val="center"/>
-            </w:pPr>
-            <w:r>
-              <w:rPr>
-                <w:b/>
-                <w:sz w:val="19"/>
-              </w:rPr>
-              <w:t>0.5925</w:t>
-            </w:r>
-          </w:p>
-        </w:tc>
-        <w:tc>
-          <w:tcPr>
-            <w:tcW w:type="dxa" w:w="2016"/>
-            <w:tcMar>
-              <w:top w:w="50" w:type="dxa"/>
-              <w:bottom w:w="50" w:type="dxa"/>
-            </w:tcMar>
-          </w:tcPr>
-          <w:p>
-            <w:pPr>
-              <w:spacing w:after="0"/>
-              <w:jc w:val="center"/>
-            </w:pPr>
-            <w:r>
-              <w:rPr>
-                <w:b/>
-                <w:sz w:val="19"/>
-              </w:rPr>
-              <w:t>42.32</w:t>
-            </w:r>
-          </w:p>
-        </w:tc>
-      </w:tr>
-      <w:tr>
-        <w:tc>
-          <w:tcPr>
-            <w:tcW w:type="dxa" w:w="2736"/>
-            <w:tcMar>
-              <w:top w:w="50" w:type="dxa"/>
-              <w:bottom w:w="50" w:type="dxa"/>
-            </w:tcMar>
-          </w:tcPr>
-          <w:p>
-            <w:pPr>
-              <w:spacing w:after="0"/>
-              <w:jc w:val="left"/>
-            </w:pPr>
-            <w:r>
-              <w:rPr>
-                <w:sz w:val="19"/>
-              </w:rPr>
-              <w:t>LASSO (lambda.min)</w:t>
-            </w:r>
-          </w:p>
-        </w:tc>
-        <w:tc>
-          <w:tcPr>
-            <w:tcW w:type="dxa" w:w="1440"/>
-            <w:tcMar>
-              <w:top w:w="50" w:type="dxa"/>
-              <w:bottom w:w="50" w:type="dxa"/>
-            </w:tcMar>
-          </w:tcPr>
-          <w:p>
-            <w:pPr>
-              <w:spacing w:after="0"/>
-              <w:jc w:val="center"/>
-            </w:pPr>
-            <w:r>
-              <w:rPr>
-                <w:sz w:val="19"/>
-              </w:rPr>
-              <w:t>8</w:t>
-            </w:r>
-          </w:p>
-        </w:tc>
-        <w:tc>
-          <w:tcPr>
-            <w:tcW w:type="dxa" w:w="1728"/>
-            <w:tcMar>
-              <w:top w:w="50" w:type="dxa"/>
-              <w:bottom w:w="50" w:type="dxa"/>
-            </w:tcMar>
-          </w:tcPr>
-          <w:p>
-            <w:pPr>
-              <w:spacing w:after="0"/>
-              <w:jc w:val="center"/>
-            </w:pPr>
-            <w:r>
-              <w:rPr>
-                <w:sz w:val="19"/>
-              </w:rPr>
-              <w:t>—</w:t>
-            </w:r>
-          </w:p>
-        </w:tc>
-        <w:tc>
-          <w:tcPr>
-            <w:tcW w:type="dxa" w:w="2016"/>
-            <w:tcMar>
-              <w:top w:w="50" w:type="dxa"/>
-              <w:bottom w:w="50" w:type="dxa"/>
-            </w:tcMar>
-          </w:tcPr>
-          <w:p>
-            <w:pPr>
-              <w:spacing w:after="0"/>
-              <w:jc w:val="center"/>
-            </w:pPr>
-            <w:r>
-              <w:rPr>
-                <w:sz w:val="19"/>
-              </w:rPr>
-              <w:t>44.27</w:t>
-            </w:r>
-          </w:p>
-        </w:tc>
-      </w:tr>
-    </w:tbl>
-    <w:p>
-      <w:pPr>
-        <w:spacing w:before="60" w:after="120"/>
-      </w:pPr>
-      <w:r>
-        <w:rPr>
-          <w:i/>
-          <w:sz w:val="19"/>
-        </w:rPr>
-        <w:t>*Same 10 folds as cv.glmnet (seed 6166). The BIC figure is somewhat optimistic because its predictors were chosen on the full data.</w:t>
+        <w:t xml:space="preserve"> it uses 5 predictors instead of 8, and all five are significant at the 5% level.</w:t>
       </w:r>
     </w:p>
     <w:p>
@@ -10413,11 +7952,11 @@
         <w:rPr>
           <w:b/>
         </w:rPr>
-        <w:t>Simplicity:</w:t>
+        <w:t>Selected predictors:</w:t>
       </w:r>
       <w:r>
         <w:rPr/>
-        <w:t xml:space="preserve"> 5 predictors instead of 8, all significant (p ≤ 0.018), so the model is easy to interpret.</w:t>
+        <w:t xml:space="preserve"> its five predictors are exactly the ones both methods agree on. The three extra LASSO predictors have small coefficients (X5 = 0.418, X6 = 0.068, X7 = 0.899) and were not significant in the full model.</w:t>
       </w:r>
     </w:p>
     <w:p>
@@ -10433,51 +7972,11 @@
         <w:rPr>
           <w:b/>
         </w:rPr>
-        <w:t>Fit:</w:t>
+        <w:t>Results of the analysis:</w:t>
       </w:r>
       <w:r>
         <w:rPr/>
-        <w:t xml:space="preserve"> higher adjusted R² than the full model, and the dropped predictors are jointly non-significant (partial F p = 0.53).</w:t>
-      </w:r>
-    </w:p>
-    <w:p>
-      <w:pPr>
-        <w:pStyle w:val="ListBullet"/>
-        <w:pBdr>
-          <w:left w:val="single" w:sz="18" w:space="8" w:color="2F5496"/>
-        </w:pBdr>
-        <w:spacing w:after="100" w:before="0"/>
-        <w:ind w:left="648" w:hanging="288"/>
-      </w:pPr>
-      <w:r>
-        <w:rPr>
-          <w:b/>
-        </w:rPr>
-        <w:t>Selected predictors:</w:t>
-      </w:r>
-      <w:r>
-        <w:rPr/>
-        <w:t xml:space="preserve"> its five predictors are exactly the ones both methods agree on. The three LASSO-only predictors have small shrunken coefficients and were not significant in the full model (p = 0.131, 0.221, 0.057).</w:t>
-      </w:r>
-    </w:p>
-    <w:p>
-      <w:pPr>
-        <w:pStyle w:val="ListBullet"/>
-        <w:pBdr>
-          <w:left w:val="single" w:sz="18" w:space="8" w:color="2F5496"/>
-        </w:pBdr>
-        <w:spacing w:after="100" w:before="0"/>
-        <w:ind w:left="648" w:hanging="288"/>
-      </w:pPr>
-      <w:r>
-        <w:rPr>
-          <w:b/>
-        </w:rPr>
-        <w:t>Results:</w:t>
-      </w:r>
-      <w:r>
-        <w:rPr/>
-        <w:t xml:space="preserve"> it predicts at least as well as LASSO (CV MSE 42.3 vs 44.3), and forward, backward and bidirectional BIC searches all reach it. LASSO's set is less stable: lambda.1se would keep only 6 predictors.</w:t>
+        <w:t xml:space="preserve"> its adjusted R² (0.5925) is higher than the full model's (0.5882), the forward, backward and stepwise BIC searches all gave the same model, and print(cv_lasso) shows that the more conservative lambda.1se would keep only 6 predictors.</w:t>
       </w:r>
     </w:p>
     <w:p>
@@ -10489,14 +7988,8 @@
         <w:ind w:left="288"/>
       </w:pPr>
       <w:r>
-        <w:rPr>
-          <w:b/>
-        </w:rPr>
-        <w:t>Caveat:</w:t>
-      </w:r>
-      <w:r>
         <w:rPr/>
-        <w:t xml:space="preserve"> being selected does not prove a predictor is truly nonzero. X7 is borderline (the next variable stepwise BIC would add, and kept by AIC and Cp), so it may be a real but weak effect. If pure prediction were the goal, LASSO would be a sound alternative. For a small, interpretable set of predictors, the BIC model is the better choice.</w:t>
+        <w:t>However, a selected predictor is not necessarily a true predictor, since the 5 true predictors are unknown. X7 is borderline and could be a weak real effect.</w:t>
       </w:r>
     </w:p>
     <w:p>

</xml_diff>

<commit_message>
Type the report's equations as native Word equations
Hypotheses, test statistics, the BIC formula, the fitted model, the LASSO
penalty and soft-thresholding rule, and the cross-validation criterion are
now Word (OMML) equations instead of plain text.

Co-Authored-By: Claude Opus 5.5 <noreply@anthropic.com>
Claude-Session: https://claude.ai/code/session_01FKnFsXW2bsaJK9HyqPLTfn
</commit_message>
<xml_diff>
--- a/output/Final_Project_STA6166_Completed.docx
+++ b/output/Final_Project_STA6166_Completed.docx
@@ -2163,25 +2163,146 @@
         <w:spacing w:after="100" w:before="0"/>
         <w:ind w:left="288"/>
       </w:pPr>
-      <w:r>
-        <w:rPr>
-          <w:b/>
-        </w:rPr>
-        <w:t>R² = 0.6506</w:t>
-      </w:r>
+      <m:oMath>
+        <m:sSup>
+          <m:e>
+            <m:r>
+              <m:t>R</m:t>
+            </m:r>
+          </m:e>
+          <m:sup>
+            <m:r>
+              <m:t>2</m:t>
+            </m:r>
+          </m:sup>
+        </m:sSup>
+        <m:r>
+          <m:rPr>
+            <m:sty m:val="p"/>
+          </m:rPr>
+          <m:t>=</m:t>
+        </m:r>
+        <m:r>
+          <m:t>0.6506</m:t>
+        </m:r>
+      </m:oMath>
       <w:r>
         <w:rPr/>
         <w:t xml:space="preserve"> and </w:t>
       </w:r>
-      <w:r>
-        <w:rPr>
-          <w:b/>
-        </w:rPr>
-        <w:t>adjusted R² = 0.5882</w:t>
-      </w:r>
+      <m:oMath>
+        <m:sSubSup>
+          <m:e>
+            <m:r>
+              <m:t>R</m:t>
+            </m:r>
+          </m:e>
+          <m:sub>
+            <m:r>
+              <m:rPr>
+                <m:nor/>
+                <m:sty m:val="p"/>
+              </m:rPr>
+              <m:t>adj</m:t>
+            </m:r>
+          </m:sub>
+          <m:sup>
+            <m:r>
+              <m:t>2</m:t>
+            </m:r>
+          </m:sup>
+        </m:sSubSup>
+        <m:r>
+          <m:rPr>
+            <m:sty m:val="p"/>
+          </m:rPr>
+          <m:t>=</m:t>
+        </m:r>
+        <m:r>
+          <m:t>0.5882</m:t>
+        </m:r>
+      </m:oMath>
       <w:r>
         <w:rPr/>
-        <w:t>. The overall F-test is highly significant (F = 10.43 on 15 and 84 DF, p-value = 1.442e-13). At the 5% level, X1, X4, X10, X13 and X14 are significant predictors; X7 is borderline (p = 0.057121).</w:t>
+        <w:t>. The overall F-test is highly significant (</w:t>
+      </w:r>
+      <m:oMath>
+        <m:r>
+          <m:t>F</m:t>
+        </m:r>
+        <m:r>
+          <m:rPr>
+            <m:sty m:val="p"/>
+          </m:rPr>
+          <m:t>=</m:t>
+        </m:r>
+        <m:r>
+          <m:t>10.43</m:t>
+        </m:r>
+      </m:oMath>
+      <w:r>
+        <w:rPr/>
+        <w:t xml:space="preserve"> on 15 and 84 DF, </w:t>
+      </w:r>
+      <m:oMath>
+        <m:r>
+          <m:t>p</m:t>
+        </m:r>
+        <m:r>
+          <m:rPr>
+            <m:sty m:val="p"/>
+          </m:rPr>
+          <m:t>=</m:t>
+        </m:r>
+        <m:r>
+          <m:t>1.442</m:t>
+        </m:r>
+        <m:r>
+          <m:rPr>
+            <m:sty m:val="p"/>
+          </m:rPr>
+          <m:t>×</m:t>
+        </m:r>
+        <m:sSup>
+          <m:e>
+            <m:r>
+              <m:t>10</m:t>
+            </m:r>
+          </m:e>
+          <m:sup>
+            <m:r>
+              <m:rPr>
+                <m:sty m:val="p"/>
+              </m:rPr>
+              <m:t>−</m:t>
+            </m:r>
+            <m:r>
+              <m:t>13</m:t>
+            </m:r>
+          </m:sup>
+        </m:sSup>
+      </m:oMath>
+      <w:r>
+        <w:rPr/>
+        <w:t>). At the 5% level, X1, X4, X10, X13 and X14 are significant predictors; X7 is borderline (</w:t>
+      </w:r>
+      <m:oMath>
+        <m:r>
+          <m:t>p</m:t>
+        </m:r>
+        <m:r>
+          <m:rPr>
+            <m:sty m:val="p"/>
+          </m:rPr>
+          <m:t>=</m:t>
+        </m:r>
+        <m:r>
+          <m:t>0.057121</m:t>
+        </m:r>
+      </m:oMath>
+      <w:r>
+        <w:rPr/>
+        <w:t>).</w:t>
       </w:r>
     </w:p>
     <w:p>
@@ -2278,15 +2399,85 @@
         <w:spacing w:after="100" w:before="0"/>
         <w:ind w:left="288"/>
       </w:pPr>
-      <w:r>
-        <w:rPr>
-          <w:b/>
-        </w:rPr>
-        <w:t>H₀:</w:t>
-      </w:r>
+      <m:oMath>
+        <m:sSub>
+          <m:e>
+            <m:r>
+              <m:t>H</m:t>
+            </m:r>
+          </m:e>
+          <m:sub>
+            <m:r>
+              <m:t>0</m:t>
+            </m:r>
+          </m:sub>
+        </m:sSub>
+        <m:r>
+          <m:rPr>
+            <m:sty m:val="p"/>
+          </m:rPr>
+          <m:t>:</m:t>
+        </m:r>
+        <m:r>
+          <m:rPr>
+            <m:nor/>
+            <m:sty m:val="p"/>
+          </m:rPr>
+          <m:t>Var</m:t>
+        </m:r>
+        <m:d>
+          <m:dPr>
+            <m:begChr m:val="("/>
+            <m:endChr m:val=")"/>
+            <m:sepChr m:val=""/>
+            <m:grow/>
+          </m:dPr>
+          <m:e>
+            <m:sSub>
+              <m:e>
+                <m:r>
+                  <m:t>ε</m:t>
+                </m:r>
+              </m:e>
+              <m:sub>
+                <m:r>
+                  <m:t>i</m:t>
+                </m:r>
+              </m:sub>
+            </m:sSub>
+          </m:e>
+        </m:d>
+        <m:r>
+          <m:rPr>
+            <m:sty m:val="p"/>
+          </m:rPr>
+          <m:t>=</m:t>
+        </m:r>
+        <m:sSup>
+          <m:e>
+            <m:r>
+              <m:t>σ</m:t>
+            </m:r>
+          </m:e>
+          <m:sup>
+            <m:r>
+              <m:t>2</m:t>
+            </m:r>
+          </m:sup>
+        </m:sSup>
+      </m:oMath>
       <w:r>
         <w:rPr/>
-        <w:t xml:space="preserve"> the error variance is constant (homoscedasticity), Var(εᵢ) = σ² for all i.</w:t>
+        <w:t xml:space="preserve"> for all </w:t>
+      </w:r>
+      <m:oMath>
+        <m:r>
+          <m:t>i</m:t>
+        </m:r>
+      </m:oMath>
+      <w:r>
+        <w:rPr/>
+        <w:t xml:space="preserve"> (constant error variance, homoscedasticity).</w:t>
       </w:r>
     </w:p>
     <w:p>
@@ -2297,15 +2488,106 @@
         <w:spacing w:after="100" w:before="0"/>
         <w:ind w:left="288"/>
       </w:pPr>
-      <w:r>
-        <w:rPr>
-          <w:b/>
-        </w:rPr>
-        <w:t>H₁:</w:t>
-      </w:r>
+      <m:oMath>
+        <m:sSub>
+          <m:e>
+            <m:r>
+              <m:t>H</m:t>
+            </m:r>
+          </m:e>
+          <m:sub>
+            <m:r>
+              <m:t>1</m:t>
+            </m:r>
+          </m:sub>
+        </m:sSub>
+        <m:r>
+          <m:rPr>
+            <m:sty m:val="p"/>
+          </m:rPr>
+          <m:t>:</m:t>
+        </m:r>
+        <m:r>
+          <m:rPr>
+            <m:nor/>
+            <m:sty m:val="p"/>
+          </m:rPr>
+          <m:t>Var</m:t>
+        </m:r>
+        <m:d>
+          <m:dPr>
+            <m:begChr m:val="("/>
+            <m:endChr m:val=")"/>
+            <m:sepChr m:val=""/>
+            <m:grow/>
+          </m:dPr>
+          <m:e>
+            <m:sSub>
+              <m:e>
+                <m:r>
+                  <m:t>ε</m:t>
+                </m:r>
+              </m:e>
+              <m:sub>
+                <m:r>
+                  <m:t>i</m:t>
+                </m:r>
+              </m:sub>
+            </m:sSub>
+          </m:e>
+        </m:d>
+      </m:oMath>
       <w:r>
         <w:rPr/>
-        <w:t xml:space="preserve"> the error variance is not constant; it depends on the predictors (heteroscedasticity).</w:t>
+        <w:t xml:space="preserve"> is not constant; it depends on the predictors </w:t>
+      </w:r>
+      <m:oMath>
+        <m:sSub>
+          <m:e>
+            <m:r>
+              <m:t>X</m:t>
+            </m:r>
+          </m:e>
+          <m:sub>
+            <m:r>
+              <m:t>1</m:t>
+            </m:r>
+          </m:sub>
+        </m:sSub>
+        <m:r>
+          <m:rPr>
+            <m:sty m:val="p"/>
+          </m:rPr>
+          <m:t>,</m:t>
+        </m:r>
+        <m:r>
+          <m:rPr>
+            <m:sty m:val="p"/>
+          </m:rPr>
+          <m:t>…</m:t>
+        </m:r>
+        <m:r>
+          <m:rPr>
+            <m:sty m:val="p"/>
+          </m:rPr>
+          <m:t>,</m:t>
+        </m:r>
+        <m:sSub>
+          <m:e>
+            <m:r>
+              <m:t>X</m:t>
+            </m:r>
+          </m:e>
+          <m:sub>
+            <m:r>
+              <m:t>15</m:t>
+            </m:r>
+          </m:sub>
+        </m:sSub>
+      </m:oMath>
+      <w:r>
+        <w:rPr/>
+        <w:t xml:space="preserve"> (heteroscedasticity).</w:t>
       </w:r>
     </w:p>
     <w:p>
@@ -2330,22 +2612,71 @@
         <w:rPr/>
         <w:t xml:space="preserve">Test statistic </w:t>
       </w:r>
-      <w:r>
-        <w:rPr>
-          <w:b/>
-        </w:rPr>
-        <w:t>BP = 17.673</w:t>
-      </w:r>
+      <m:oMath>
+        <m:r>
+          <m:rPr>
+            <m:nor/>
+            <m:sty m:val="p"/>
+          </m:rPr>
+          <m:t>BP</m:t>
+        </m:r>
+        <m:r>
+          <m:rPr>
+            <m:sty m:val="p"/>
+          </m:rPr>
+          <m:t>=</m:t>
+        </m:r>
+        <m:r>
+          <m:t>17.673</m:t>
+        </m:r>
+      </m:oMath>
       <w:r>
         <w:rPr/>
-        <w:t xml:space="preserve"> (df = 15); </w:t>
-      </w:r>
-      <w:r>
-        <w:rPr>
-          <w:b/>
-        </w:rPr>
-        <w:t>p-value = 0.2802</w:t>
-      </w:r>
+        <w:t xml:space="preserve"> with </w:t>
+      </w:r>
+      <m:oMath>
+        <m:r>
+          <m:rPr>
+            <m:nor/>
+            <m:sty m:val="p"/>
+          </m:rPr>
+          <m:t>df</m:t>
+        </m:r>
+        <m:r>
+          <m:rPr>
+            <m:sty m:val="p"/>
+          </m:rPr>
+          <m:t>=</m:t>
+        </m:r>
+        <m:r>
+          <m:t>15</m:t>
+        </m:r>
+      </m:oMath>
+      <w:r>
+        <w:rPr/>
+        <w:t xml:space="preserve">; </w:t>
+      </w:r>
+      <m:oMath>
+        <m:r>
+          <m:t>p</m:t>
+        </m:r>
+        <m:r>
+          <m:rPr>
+            <m:nor/>
+            <m:sty m:val="p"/>
+          </m:rPr>
+          <m:t>-value</m:t>
+        </m:r>
+        <m:r>
+          <m:rPr>
+            <m:sty m:val="p"/>
+          </m:rPr>
+          <m:t>=</m:t>
+        </m:r>
+        <m:r>
+          <m:t>0.2802</m:t>
+        </m:r>
+      </m:oMath>
       <w:r>
         <w:rPr/>
         <w:t>.</w:t>
@@ -2453,7 +2784,61 @@
       </w:r>
       <w:r>
         <w:rPr/>
-        <w:t xml:space="preserve"> Since p-value = 0.2802 &gt; 0.05, we fail to reject H₀. There is not enough evidence of unequal error variances.</w:t>
+        <w:t xml:space="preserve"> Since </w:t>
+      </w:r>
+      <m:oMath>
+        <m:r>
+          <m:t>p</m:t>
+        </m:r>
+        <m:r>
+          <m:rPr>
+            <m:sty m:val="p"/>
+          </m:rPr>
+          <m:t>=</m:t>
+        </m:r>
+        <m:r>
+          <m:t>0.2802</m:t>
+        </m:r>
+        <m:r>
+          <m:rPr>
+            <m:sty m:val="p"/>
+          </m:rPr>
+          <m:t>&gt;</m:t>
+        </m:r>
+        <m:r>
+          <m:t>α</m:t>
+        </m:r>
+        <m:r>
+          <m:rPr>
+            <m:sty m:val="p"/>
+          </m:rPr>
+          <m:t>=</m:t>
+        </m:r>
+        <m:r>
+          <m:t>0.05</m:t>
+        </m:r>
+      </m:oMath>
+      <w:r>
+        <w:rPr/>
+        <w:t xml:space="preserve">, we fail to reject </w:t>
+      </w:r>
+      <m:oMath>
+        <m:sSub>
+          <m:e>
+            <m:r>
+              <m:t>H</m:t>
+            </m:r>
+          </m:e>
+          <m:sub>
+            <m:r>
+              <m:t>0</m:t>
+            </m:r>
+          </m:sub>
+        </m:sSub>
+      </m:oMath>
+      <w:r>
+        <w:rPr/>
+        <w:t>. There is not enough evidence of unequal error variances.</w:t>
       </w:r>
     </w:p>
     <w:p>
@@ -2489,15 +2874,23 @@
         <w:spacing w:after="100" w:before="0"/>
         <w:ind w:left="288"/>
       </w:pPr>
-      <w:r>
-        <w:rPr>
-          <w:b/>
-        </w:rPr>
-        <w:t>H₀:</w:t>
-      </w:r>
+      <m:oMath>
+        <m:sSub>
+          <m:e>
+            <m:r>
+              <m:t>H</m:t>
+            </m:r>
+          </m:e>
+          <m:sub>
+            <m:r>
+              <m:t>0</m:t>
+            </m:r>
+          </m:sub>
+        </m:sSub>
+      </m:oMath>
       <w:r>
         <w:rPr/>
-        <w:t xml:space="preserve"> the residuals come from a normal distribution.</w:t>
+        <w:t>: the residuals come from a normal distribution.</w:t>
       </w:r>
     </w:p>
     <w:p>
@@ -2508,15 +2901,23 @@
         <w:spacing w:after="100" w:before="0"/>
         <w:ind w:left="288"/>
       </w:pPr>
-      <w:r>
-        <w:rPr>
-          <w:b/>
-        </w:rPr>
-        <w:t>H₁:</w:t>
-      </w:r>
+      <m:oMath>
+        <m:sSub>
+          <m:e>
+            <m:r>
+              <m:t>H</m:t>
+            </m:r>
+          </m:e>
+          <m:sub>
+            <m:r>
+              <m:t>1</m:t>
+            </m:r>
+          </m:sub>
+        </m:sSub>
+      </m:oMath>
       <w:r>
         <w:rPr/>
-        <w:t xml:space="preserve"> the residuals do not come from a normal distribution.</w:t>
+        <w:t>: the residuals do not come from a normal distribution.</w:t>
       </w:r>
     </w:p>
     <w:p>
@@ -2541,22 +2942,45 @@
         <w:rPr/>
         <w:t xml:space="preserve">Test statistic </w:t>
       </w:r>
-      <w:r>
-        <w:rPr>
-          <w:b/>
-        </w:rPr>
-        <w:t>W = 0.99144</w:t>
-      </w:r>
+      <m:oMath>
+        <m:r>
+          <m:t>W</m:t>
+        </m:r>
+        <m:r>
+          <m:rPr>
+            <m:sty m:val="p"/>
+          </m:rPr>
+          <m:t>=</m:t>
+        </m:r>
+        <m:r>
+          <m:t>0.99144</m:t>
+        </m:r>
+      </m:oMath>
       <w:r>
         <w:rPr/>
         <w:t xml:space="preserve">; </w:t>
       </w:r>
-      <w:r>
-        <w:rPr>
-          <w:b/>
-        </w:rPr>
-        <w:t>p-value = 0.7795</w:t>
-      </w:r>
+      <m:oMath>
+        <m:r>
+          <m:t>p</m:t>
+        </m:r>
+        <m:r>
+          <m:rPr>
+            <m:nor/>
+            <m:sty m:val="p"/>
+          </m:rPr>
+          <m:t>-value</m:t>
+        </m:r>
+        <m:r>
+          <m:rPr>
+            <m:sty m:val="p"/>
+          </m:rPr>
+          <m:t>=</m:t>
+        </m:r>
+        <m:r>
+          <m:t>0.7795</m:t>
+        </m:r>
+      </m:oMath>
       <w:r>
         <w:rPr/>
         <w:t>.</w:t>
@@ -2664,7 +3088,61 @@
       </w:r>
       <w:r>
         <w:rPr/>
-        <w:t xml:space="preserve"> Since p-value = 0.7795 &gt; 0.05, we fail to reject H₀. There is not enough evidence that the residuals depart from normality.</w:t>
+        <w:t xml:space="preserve"> Since </w:t>
+      </w:r>
+      <m:oMath>
+        <m:r>
+          <m:t>p</m:t>
+        </m:r>
+        <m:r>
+          <m:rPr>
+            <m:sty m:val="p"/>
+          </m:rPr>
+          <m:t>=</m:t>
+        </m:r>
+        <m:r>
+          <m:t>0.7795</m:t>
+        </m:r>
+        <m:r>
+          <m:rPr>
+            <m:sty m:val="p"/>
+          </m:rPr>
+          <m:t>&gt;</m:t>
+        </m:r>
+        <m:r>
+          <m:t>α</m:t>
+        </m:r>
+        <m:r>
+          <m:rPr>
+            <m:sty m:val="p"/>
+          </m:rPr>
+          <m:t>=</m:t>
+        </m:r>
+        <m:r>
+          <m:t>0.05</m:t>
+        </m:r>
+      </m:oMath>
+      <w:r>
+        <w:rPr/>
+        <w:t xml:space="preserve">, we fail to reject </w:t>
+      </w:r>
+      <m:oMath>
+        <m:sSub>
+          <m:e>
+            <m:r>
+              <m:t>H</m:t>
+            </m:r>
+          </m:e>
+          <m:sub>
+            <m:r>
+              <m:t>0</m:t>
+            </m:r>
+          </m:sub>
+        </m:sSub>
+      </m:oMath>
+      <w:r>
+        <w:rPr/>
+        <w:t>. There is not enough evidence that the residuals depart from normality.</w:t>
       </w:r>
     </w:p>
     <w:p>
@@ -2869,7 +3347,43 @@
       </w:pPr>
       <w:r>
         <w:rPr/>
-        <w:t>It starts from the intercept-only model (Y ~ 1).</w:t>
+        <w:t xml:space="preserve">It starts from the intercept-only model, </w:t>
+      </w:r>
+      <m:oMath>
+        <m:r>
+          <m:t>Y</m:t>
+        </m:r>
+        <m:r>
+          <m:rPr>
+            <m:sty m:val="p"/>
+          </m:rPr>
+          <m:t>=</m:t>
+        </m:r>
+        <m:sSub>
+          <m:e>
+            <m:r>
+              <m:t>β</m:t>
+            </m:r>
+          </m:e>
+          <m:sub>
+            <m:r>
+              <m:t>0</m:t>
+            </m:r>
+          </m:sub>
+        </m:sSub>
+        <m:r>
+          <m:rPr>
+            <m:sty m:val="p"/>
+          </m:rPr>
+          <m:t>+</m:t>
+        </m:r>
+        <m:r>
+          <m:t>ε</m:t>
+        </m:r>
+      </m:oMath>
+      <w:r>
+        <w:rPr/>
+        <w:t>.</w:t>
       </w:r>
     </w:p>
     <w:p>
@@ -2954,23 +3468,141 @@
         <w:pBdr>
           <w:left w:val="single" w:sz="18" w:space="8" w:color="2F5496"/>
         </w:pBdr>
-        <w:spacing w:after="100" w:before="0"/>
+        <w:spacing w:before="40" w:after="120"/>
         <w:ind w:left="288"/>
       </w:pPr>
-      <w:r>
-        <w:rPr/>
-        <w:t xml:space="preserve">BIC = −2 log L + p·log(N), where L is the maximized likelihood, p the number of parameters and N the sample size. It measures how well the model fits, with a penalty for every extra parameter; the model with the </w:t>
-      </w:r>
-      <w:r>
-        <w:rPr>
-          <w:b/>
-        </w:rPr>
-        <w:t>smallest BIC</w:t>
-      </w:r>
-      <w:r>
-        <w:rPr/>
-        <w:t xml:space="preserve"> is preferred.</w:t>
-      </w:r>
+      <m:oMathPara>
+        <m:oMath>
+          <m:r>
+            <m:rPr>
+              <m:nor/>
+              <m:sty m:val="p"/>
+            </m:rPr>
+            <m:t>BIC</m:t>
+          </m:r>
+          <m:r>
+            <m:rPr>
+              <m:sty m:val="p"/>
+            </m:rPr>
+            <m:t>=</m:t>
+          </m:r>
+          <m:r>
+            <m:rPr>
+              <m:sty m:val="p"/>
+            </m:rPr>
+            <m:t>−</m:t>
+          </m:r>
+          <m:r>
+            <m:t>2</m:t>
+          </m:r>
+          <m:r>
+            <m:rPr>
+              <m:nor/>
+              <m:sty m:val="p"/>
+            </m:rPr>
+            <m:t>log</m:t>
+          </m:r>
+          <m:r>
+            <m:t>L</m:t>
+          </m:r>
+          <m:r>
+            <m:rPr>
+              <m:sty m:val="p"/>
+            </m:rPr>
+            <m:t>+</m:t>
+          </m:r>
+          <m:r>
+            <m:t>p</m:t>
+          </m:r>
+          <m:r>
+            <m:rPr>
+              <m:nor/>
+              <m:sty m:val="p"/>
+            </m:rPr>
+            <m:t>log</m:t>
+          </m:r>
+          <m:r>
+            <m:t>N</m:t>
+          </m:r>
+          <m:r>
+            <m:rPr>
+              <m:sty m:val="p"/>
+            </m:rPr>
+            <m:t>=</m:t>
+          </m:r>
+          <m:r>
+            <m:t>N</m:t>
+          </m:r>
+          <m:r>
+            <m:rPr>
+              <m:nor/>
+              <m:sty m:val="p"/>
+            </m:rPr>
+            <m:t>log</m:t>
+          </m:r>
+          <m:d>
+            <m:dPr>
+              <m:begChr m:val="("/>
+              <m:endChr m:val=")"/>
+              <m:sepChr m:val=""/>
+              <m:grow/>
+            </m:dPr>
+            <m:e>
+              <m:f>
+                <m:fPr>
+                  <m:type m:val="bar"/>
+                </m:fPr>
+                <m:num>
+                  <m:r>
+                    <m:rPr>
+                      <m:nor/>
+                      <m:sty m:val="p"/>
+                    </m:rPr>
+                    <m:t>RSS</m:t>
+                  </m:r>
+                </m:num>
+                <m:den>
+                  <m:r>
+                    <m:t>N</m:t>
+                  </m:r>
+                </m:den>
+              </m:f>
+            </m:e>
+          </m:d>
+          <m:r>
+            <m:rPr>
+              <m:sty m:val="p"/>
+            </m:rPr>
+            <m:t>+</m:t>
+          </m:r>
+          <m:r>
+            <m:t>p</m:t>
+          </m:r>
+          <m:r>
+            <m:rPr>
+              <m:nor/>
+              <m:sty m:val="p"/>
+            </m:rPr>
+            <m:t>log</m:t>
+          </m:r>
+          <m:r>
+            <m:t>N</m:t>
+          </m:r>
+          <m:r>
+            <m:rPr>
+              <m:sty m:val="p"/>
+            </m:rPr>
+            <m:t>+</m:t>
+          </m:r>
+          <m:r>
+            <m:rPr>
+              <m:nor/>
+              <m:sty m:val="p"/>
+            </m:rPr>
+            <m:t>constant</m:t>
+          </m:r>
+        </m:oMath>
+      </m:oMathPara>
     </w:p>
     <w:p>
       <w:pPr>
@@ -2982,7 +3614,126 @@
       </w:pPr>
       <w:r>
         <w:rPr/>
-        <w:t>I chose BIC because its penalty, log(100) ≈ 4.61 per parameter, is heavier than AIC's 2, so it favours simpler models. This suits the project, where only 5 of the 15 predictors are truly nonzero. BIC with bidirectional search is supported by stats::step(), using k = log(N).</w:t>
+        <w:t xml:space="preserve">where </w:t>
+      </w:r>
+      <m:oMath>
+        <m:r>
+          <m:t>L</m:t>
+        </m:r>
+      </m:oMath>
+      <w:r>
+        <w:rPr/>
+        <w:t xml:space="preserve"> is the maximized likelihood, </w:t>
+      </w:r>
+      <m:oMath>
+        <m:r>
+          <m:t>p</m:t>
+        </m:r>
+      </m:oMath>
+      <w:r>
+        <w:rPr/>
+        <w:t xml:space="preserve"> is the number of estimated parameters and </w:t>
+      </w:r>
+      <m:oMath>
+        <m:r>
+          <m:t>N</m:t>
+        </m:r>
+        <m:r>
+          <m:rPr>
+            <m:sty m:val="p"/>
+          </m:rPr>
+          <m:t>=</m:t>
+        </m:r>
+        <m:r>
+          <m:t>100</m:t>
+        </m:r>
+      </m:oMath>
+      <w:r>
+        <w:rPr/>
+        <w:t xml:space="preserve"> is the sample size. The first term measures lack of fit and the second penalizes model complexity; the model with the </w:t>
+      </w:r>
+      <w:r>
+        <w:rPr>
+          <w:b/>
+        </w:rPr>
+        <w:t>smallest BIC</w:t>
+      </w:r>
+      <w:r>
+        <w:rPr/>
+        <w:t xml:space="preserve"> is preferred.</w:t>
+      </w:r>
+    </w:p>
+    <w:p>
+      <w:pPr>
+        <w:pBdr>
+          <w:left w:val="single" w:sz="18" w:space="8" w:color="2F5496"/>
+        </w:pBdr>
+        <w:spacing w:after="100" w:before="0"/>
+        <w:ind w:left="288"/>
+      </w:pPr>
+      <w:r>
+        <w:rPr/>
+        <w:t xml:space="preserve">I chose BIC because its penalty per parameter, </w:t>
+      </w:r>
+      <m:oMath>
+        <m:r>
+          <m:rPr>
+            <m:nor/>
+            <m:sty m:val="p"/>
+          </m:rPr>
+          <m:t>log</m:t>
+        </m:r>
+        <m:d>
+          <m:dPr>
+            <m:begChr m:val="("/>
+            <m:endChr m:val=")"/>
+            <m:sepChr m:val=""/>
+            <m:grow/>
+          </m:dPr>
+          <m:e>
+            <m:r>
+              <m:t>100</m:t>
+            </m:r>
+          </m:e>
+        </m:d>
+        <m:r>
+          <m:rPr>
+            <m:sty m:val="p"/>
+          </m:rPr>
+          <m:t>≈</m:t>
+        </m:r>
+        <m:r>
+          <m:t>4.61</m:t>
+        </m:r>
+      </m:oMath>
+      <w:r>
+        <w:rPr/>
+        <w:t xml:space="preserve">, is heavier than the AIC penalty of 2, so it favours simpler models. This suits the project, where only 5 of the 15 predictors are truly nonzero. BIC with bidirectional search is supported by stats::step(), using </w:t>
+      </w:r>
+      <m:oMath>
+        <m:r>
+          <m:t>k</m:t>
+        </m:r>
+        <m:r>
+          <m:rPr>
+            <m:sty m:val="p"/>
+          </m:rPr>
+          <m:t>=</m:t>
+        </m:r>
+        <m:r>
+          <m:rPr>
+            <m:nor/>
+            <m:sty m:val="p"/>
+          </m:rPr>
+          <m:t>log</m:t>
+        </m:r>
+        <m:r>
+          <m:t>N</m:t>
+        </m:r>
+      </m:oMath>
+      <w:r>
+        <w:rPr/>
+        <w:t>.</w:t>
       </w:r>
     </w:p>
     <w:p>
@@ -3110,19 +3861,147 @@
         </w:rPr>
         <w:t>Y ~ X10 + X4 + X13 + X14 + X1</w:t>
       </w:r>
+      <w:r>
+        <w:rPr/>
+        <w:t>, that is,</w:t>
+      </w:r>
     </w:p>
     <w:p>
       <w:pPr>
         <w:pBdr>
           <w:left w:val="single" w:sz="18" w:space="8" w:color="2F5496"/>
         </w:pBdr>
-        <w:spacing w:after="100" w:before="0"/>
+        <w:spacing w:before="40" w:after="120"/>
         <w:ind w:left="288"/>
       </w:pPr>
-      <w:r>
-        <w:rPr/>
-        <w:t>Ŷ = 1.9307 + 1.6604·X1 − 2.6507·X4 + 7.2586·X10 − 2.3389·X13 − 1.8656·X14</w:t>
-      </w:r>
+      <m:oMathPara>
+        <m:oMath>
+          <m:acc>
+            <m:accPr>
+              <m:chr m:val="̂"/>
+            </m:accPr>
+            <m:e>
+              <m:r>
+                <m:t>Y</m:t>
+              </m:r>
+            </m:e>
+          </m:acc>
+          <m:r>
+            <m:rPr>
+              <m:sty m:val="p"/>
+            </m:rPr>
+            <m:t>=</m:t>
+          </m:r>
+          <m:r>
+            <m:t>1.9307</m:t>
+          </m:r>
+          <m:r>
+            <m:rPr>
+              <m:sty m:val="p"/>
+            </m:rPr>
+            <m:t>+</m:t>
+          </m:r>
+          <m:r>
+            <m:t>1.6604</m:t>
+          </m:r>
+          <m:sSub>
+            <m:e>
+              <m:r>
+                <m:t>X</m:t>
+              </m:r>
+            </m:e>
+            <m:sub>
+              <m:r>
+                <m:t>1</m:t>
+              </m:r>
+            </m:sub>
+          </m:sSub>
+          <m:r>
+            <m:rPr>
+              <m:sty m:val="p"/>
+            </m:rPr>
+            <m:t>−</m:t>
+          </m:r>
+          <m:r>
+            <m:t>2.6507</m:t>
+          </m:r>
+          <m:sSub>
+            <m:e>
+              <m:r>
+                <m:t>X</m:t>
+              </m:r>
+            </m:e>
+            <m:sub>
+              <m:r>
+                <m:t>4</m:t>
+              </m:r>
+            </m:sub>
+          </m:sSub>
+          <m:r>
+            <m:rPr>
+              <m:sty m:val="p"/>
+            </m:rPr>
+            <m:t>+</m:t>
+          </m:r>
+          <m:r>
+            <m:t>7.2586</m:t>
+          </m:r>
+          <m:sSub>
+            <m:e>
+              <m:r>
+                <m:t>X</m:t>
+              </m:r>
+            </m:e>
+            <m:sub>
+              <m:r>
+                <m:t>10</m:t>
+              </m:r>
+            </m:sub>
+          </m:sSub>
+          <m:r>
+            <m:rPr>
+              <m:sty m:val="p"/>
+            </m:rPr>
+            <m:t>−</m:t>
+          </m:r>
+          <m:r>
+            <m:t>2.3389</m:t>
+          </m:r>
+          <m:sSub>
+            <m:e>
+              <m:r>
+                <m:t>X</m:t>
+              </m:r>
+            </m:e>
+            <m:sub>
+              <m:r>
+                <m:t>13</m:t>
+              </m:r>
+            </m:sub>
+          </m:sSub>
+          <m:r>
+            <m:rPr>
+              <m:sty m:val="p"/>
+            </m:rPr>
+            <m:t>−</m:t>
+          </m:r>
+          <m:r>
+            <m:t>1.8656</m:t>
+          </m:r>
+          <m:sSub>
+            <m:e>
+              <m:r>
+                <m:t>X</m:t>
+              </m:r>
+            </m:e>
+            <m:sub>
+              <m:r>
+                <m:t>14</m:t>
+              </m:r>
+            </m:sub>
+          </m:sSub>
+        </m:oMath>
+      </m:oMathPara>
     </w:p>
     <w:p>
       <w:pPr>
@@ -3173,12 +4052,24 @@
         <w:spacing w:after="100" w:before="0"/>
         <w:ind w:left="288"/>
       </w:pPr>
-      <w:r>
-        <w:rPr>
-          <w:b/>
-        </w:rPr>
-        <w:t>BIC = 680.8865</w:t>
-      </w:r>
+      <m:oMath>
+        <m:r>
+          <m:rPr>
+            <m:nor/>
+            <m:sty m:val="p"/>
+          </m:rPr>
+          <m:t>BIC</m:t>
+        </m:r>
+        <m:r>
+          <m:rPr>
+            <m:sty m:val="p"/>
+          </m:rPr>
+          <m:t>=</m:t>
+        </m:r>
+        <m:r>
+          <m:t>680.8865</m:t>
+        </m:r>
+      </m:oMath>
     </w:p>
     <w:p>
       <w:pPr>
@@ -4723,12 +5614,38 @@
         <w:spacing w:after="100" w:before="0"/>
         <w:ind w:left="288"/>
       </w:pPr>
-      <w:r>
-        <w:rPr>
-          <w:b/>
-        </w:rPr>
-        <w:t>Adjusted R² = 0.5925</w:t>
-      </w:r>
+      <m:oMath>
+        <m:sSubSup>
+          <m:e>
+            <m:r>
+              <m:t>R</m:t>
+            </m:r>
+          </m:e>
+          <m:sub>
+            <m:r>
+              <m:rPr>
+                <m:nor/>
+                <m:sty m:val="p"/>
+              </m:rPr>
+              <m:t>adj</m:t>
+            </m:r>
+          </m:sub>
+          <m:sup>
+            <m:r>
+              <m:t>2</m:t>
+            </m:r>
+          </m:sup>
+        </m:sSubSup>
+        <m:r>
+          <m:rPr>
+            <m:sty m:val="p"/>
+          </m:rPr>
+          <m:t>=</m:t>
+        </m:r>
+        <m:r>
+          <m:t>0.5925</m:t>
+        </m:r>
+      </m:oMath>
     </w:p>
     <w:p>
       <w:pPr>
@@ -4812,17 +5729,43 @@
       </w:pPr>
       <w:r>
         <w:rPr/>
-        <w:t>The selected model's adjusted R² (</w:t>
-      </w:r>
-      <w:r>
-        <w:rPr>
-          <w:b/>
-        </w:rPr>
-        <w:t>0.5925</w:t>
-      </w:r>
+        <w:t xml:space="preserve">The selected model has </w:t>
+      </w:r>
+      <m:oMath>
+        <m:sSubSup>
+          <m:e>
+            <m:r>
+              <m:t>R</m:t>
+            </m:r>
+          </m:e>
+          <m:sub>
+            <m:r>
+              <m:rPr>
+                <m:nor/>
+                <m:sty m:val="p"/>
+              </m:rPr>
+              <m:t>adj</m:t>
+            </m:r>
+          </m:sub>
+          <m:sup>
+            <m:r>
+              <m:t>2</m:t>
+            </m:r>
+          </m:sup>
+        </m:sSubSup>
+        <m:r>
+          <m:rPr>
+            <m:sty m:val="p"/>
+          </m:rPr>
+          <m:t>=</m:t>
+        </m:r>
+        <m:r>
+          <m:t>0.5925</m:t>
+        </m:r>
+      </m:oMath>
       <w:r>
         <w:rPr/>
-        <w:t xml:space="preserve">) is slightly </w:t>
+        <w:t xml:space="preserve">, slightly </w:t>
       </w:r>
       <w:r>
         <w:rPr>
@@ -4832,17 +5775,43 @@
       </w:r>
       <w:r>
         <w:rPr/>
-        <w:t xml:space="preserve"> than the full model's (</w:t>
-      </w:r>
-      <w:r>
-        <w:rPr>
-          <w:b/>
-        </w:rPr>
-        <w:t>0.5882</w:t>
-      </w:r>
+        <w:t xml:space="preserve"> than the full model's </w:t>
+      </w:r>
+      <m:oMath>
+        <m:sSubSup>
+          <m:e>
+            <m:r>
+              <m:t>R</m:t>
+            </m:r>
+          </m:e>
+          <m:sub>
+            <m:r>
+              <m:rPr>
+                <m:nor/>
+                <m:sty m:val="p"/>
+              </m:rPr>
+              <m:t>adj</m:t>
+            </m:r>
+          </m:sub>
+          <m:sup>
+            <m:r>
+              <m:t>2</m:t>
+            </m:r>
+          </m:sup>
+        </m:sSubSup>
+        <m:r>
+          <m:rPr>
+            <m:sty m:val="p"/>
+          </m:rPr>
+          <m:t>=</m:t>
+        </m:r>
+        <m:r>
+          <m:t>0.5882</m:t>
+        </m:r>
+      </m:oMath>
       <w:r>
         <w:rPr/>
-        <w:t>), even though it uses 10 fewer predictors. The extra predictors in the full model did not improve the fit enough to justify their cost.</w:t>
+        <w:t>, even though it uses 10 fewer predictors. The extra predictors in the full model did not improve the fit enough to justify their cost.</w:t>
       </w:r>
     </w:p>
     <w:p>
@@ -4871,7 +5840,25 @@
       </w:r>
       <w:r>
         <w:rPr/>
-        <w:t xml:space="preserve"> 5 predictors instead of 15, and all five are significant at the 5% level (largest p-value = 0.017936).</w:t>
+        <w:t xml:space="preserve"> 5 predictors instead of 15, and all five are significant at the 5% level (largest </w:t>
+      </w:r>
+      <m:oMath>
+        <m:r>
+          <m:t>p</m:t>
+        </m:r>
+        <m:r>
+          <m:rPr>
+            <m:sty m:val="p"/>
+          </m:rPr>
+          <m:t>=</m:t>
+        </m:r>
+        <m:r>
+          <m:t>0.017936</m:t>
+        </m:r>
+      </m:oMath>
+      <w:r>
+        <w:rPr/>
+        <w:t>).</w:t>
       </w:r>
     </w:p>
     <w:p>
@@ -4890,7 +5877,88 @@
       </w:r>
       <w:r>
         <w:rPr/>
-        <w:t xml:space="preserve"> R² falls from 0.6506 to 0.6131, so the excluded predictors explained about 3.75% of the variation in Y. If any of them has a small real effect, it is no longer in the model. X7 (p = 0.057 in the full model) and X5 are the most likely examples, since AIC and Mallows' Cp kept both.</w:t>
+        <w:t xml:space="preserve"> </w:t>
+      </w:r>
+      <m:oMath>
+        <m:sSup>
+          <m:e>
+            <m:r>
+              <m:t>R</m:t>
+            </m:r>
+          </m:e>
+          <m:sup>
+            <m:r>
+              <m:t>2</m:t>
+            </m:r>
+          </m:sup>
+        </m:sSup>
+      </m:oMath>
+      <w:r>
+        <w:rPr/>
+        <w:t xml:space="preserve"> falls from </w:t>
+      </w:r>
+      <m:oMath>
+        <m:r>
+          <m:t>0.6506</m:t>
+        </m:r>
+      </m:oMath>
+      <w:r>
+        <w:rPr/>
+        <w:t xml:space="preserve"> to </w:t>
+      </w:r>
+      <m:oMath>
+        <m:r>
+          <m:t>0.6131</m:t>
+        </m:r>
+      </m:oMath>
+      <w:r>
+        <w:rPr/>
+        <w:t xml:space="preserve">, so the excluded predictors explained about 3.75% of the variation in </w:t>
+      </w:r>
+      <m:oMath>
+        <m:r>
+          <m:t>Y</m:t>
+        </m:r>
+      </m:oMath>
+      <w:r>
+        <w:rPr/>
+        <w:t>. If any of them has a small real effect, it is no longer in the model. X7 (</w:t>
+      </w:r>
+      <m:oMath>
+        <m:r>
+          <m:t>p</m:t>
+        </m:r>
+        <m:r>
+          <m:rPr>
+            <m:sty m:val="p"/>
+          </m:rPr>
+          <m:t>=</m:t>
+        </m:r>
+        <m:r>
+          <m:t>0.057</m:t>
+        </m:r>
+      </m:oMath>
+      <w:r>
+        <w:rPr/>
+        <w:t xml:space="preserve"> in the full model) and X5 are the most likely examples, since AIC and Mallows' </w:t>
+      </w:r>
+      <m:oMath>
+        <m:sSub>
+          <m:e>
+            <m:r>
+              <m:t>C</m:t>
+            </m:r>
+          </m:e>
+          <m:sub>
+            <m:r>
+              <m:t>p</m:t>
+            </m:r>
+          </m:sub>
+        </m:sSub>
+      </m:oMath>
+      <w:r>
+        <w:rPr/>
+        <w:t xml:space="preserve"> kept both.</w:t>
       </w:r>
     </w:p>
     <w:p>
@@ -5375,9 +6443,23 @@
         <w:spacing w:after="100" w:before="0"/>
         <w:ind w:left="288"/>
       </w:pPr>
+      <m:oMath>
+        <m:r>
+          <m:t>λ</m:t>
+        </m:r>
+        <m:r>
+          <m:rPr>
+            <m:sty m:val="p"/>
+          </m:rPr>
+          <m:t>≥</m:t>
+        </m:r>
+        <m:r>
+          <m:t>0</m:t>
+        </m:r>
+      </m:oMath>
       <w:r>
         <w:rPr/>
-        <w:t xml:space="preserve">λ is the </w:t>
+        <w:t xml:space="preserve"> is the </w:t>
       </w:r>
       <w:r>
         <w:rPr>
@@ -5387,7 +6469,67 @@
       </w:r>
       <w:r>
         <w:rPr/>
-        <w:t xml:space="preserve"> that controls the strength of the penalty λ·Σ|βⱼ|.</w:t>
+        <w:t xml:space="preserve"> that controls the strength of the penalty </w:t>
+      </w:r>
+      <m:oMath>
+        <m:r>
+          <m:t>λ</m:t>
+        </m:r>
+        <m:nary>
+          <m:naryPr>
+            <m:chr m:val="∑"/>
+            <m:limLoc m:val="undOvr"/>
+            <m:subHide m:val="off"/>
+            <m:supHide m:val="off"/>
+          </m:naryPr>
+          <m:sub>
+            <m:r>
+              <m:t>j</m:t>
+            </m:r>
+            <m:r>
+              <m:rPr>
+                <m:sty m:val="p"/>
+              </m:rPr>
+              <m:t>=</m:t>
+            </m:r>
+            <m:r>
+              <m:t>1</m:t>
+            </m:r>
+          </m:sub>
+          <m:sup>
+            <m:r>
+              <m:t>15</m:t>
+            </m:r>
+          </m:sup>
+          <m:e>
+            <m:d>
+              <m:dPr>
+                <m:begChr m:val="|"/>
+                <m:endChr m:val="|"/>
+                <m:sepChr m:val=""/>
+                <m:grow/>
+              </m:dPr>
+              <m:e>
+                <m:sSub>
+                  <m:e>
+                    <m:r>
+                      <m:t>β</m:t>
+                    </m:r>
+                  </m:e>
+                  <m:sub>
+                    <m:r>
+                      <m:t>j</m:t>
+                    </m:r>
+                  </m:sub>
+                </m:sSub>
+              </m:e>
+            </m:d>
+          </m:e>
+        </m:nary>
+      </m:oMath>
+      <w:r>
+        <w:rPr/>
+        <w:t>.</w:t>
       </w:r>
     </w:p>
     <w:p>
@@ -5401,7 +6543,25 @@
       </w:pPr>
       <w:r>
         <w:rPr/>
-        <w:t>When λ = 0 there is no penalty and LASSO gives the ordinary least-squares estimates.</w:t>
+        <w:t xml:space="preserve">When </w:t>
+      </w:r>
+      <m:oMath>
+        <m:r>
+          <m:t>λ</m:t>
+        </m:r>
+        <m:r>
+          <m:rPr>
+            <m:sty m:val="p"/>
+          </m:rPr>
+          <m:t>=</m:t>
+        </m:r>
+        <m:r>
+          <m:t>0</m:t>
+        </m:r>
+      </m:oMath>
+      <w:r>
+        <w:rPr/>
+        <w:t xml:space="preserve"> there is no penalty and LASSO gives the ordinary least-squares estimates.</w:t>
       </w:r>
     </w:p>
     <w:p>
@@ -5415,7 +6575,16 @@
       </w:pPr>
       <w:r>
         <w:rPr/>
-        <w:t>As λ increases, the coefficients are shrunk more toward zero and more of them become exactly zero.</w:t>
+        <w:t xml:space="preserve">As </w:t>
+      </w:r>
+      <m:oMath>
+        <m:r>
+          <m:t>λ</m:t>
+        </m:r>
+      </m:oMath>
+      <w:r>
+        <w:rPr/>
+        <w:t xml:space="preserve"> increases, the coefficients are shrunk more toward zero and more of them become exactly zero.</w:t>
       </w:r>
     </w:p>
     <w:p>
@@ -5429,7 +6598,64 @@
       </w:pPr>
       <w:r>
         <w:rPr/>
-        <w:t>When λ is very large, all slope coefficients are zero.</w:t>
+        <w:t xml:space="preserve">When </w:t>
+      </w:r>
+      <m:oMath>
+        <m:r>
+          <m:t>λ</m:t>
+        </m:r>
+      </m:oMath>
+      <w:r>
+        <w:rPr/>
+        <w:t xml:space="preserve"> is very large, all slope coefficients </w:t>
+      </w:r>
+      <m:oMath>
+        <m:sSub>
+          <m:e>
+            <m:r>
+              <m:t>β</m:t>
+            </m:r>
+          </m:e>
+          <m:sub>
+            <m:r>
+              <m:t>1</m:t>
+            </m:r>
+          </m:sub>
+        </m:sSub>
+        <m:r>
+          <m:rPr>
+            <m:sty m:val="p"/>
+          </m:rPr>
+          <m:t>,</m:t>
+        </m:r>
+        <m:r>
+          <m:rPr>
+            <m:sty m:val="p"/>
+          </m:rPr>
+          <m:t>…</m:t>
+        </m:r>
+        <m:r>
+          <m:rPr>
+            <m:sty m:val="p"/>
+          </m:rPr>
+          <m:t>,</m:t>
+        </m:r>
+        <m:sSub>
+          <m:e>
+            <m:r>
+              <m:t>β</m:t>
+            </m:r>
+          </m:e>
+          <m:sub>
+            <m:r>
+              <m:t>15</m:t>
+            </m:r>
+          </m:sub>
+        </m:sSub>
+      </m:oMath>
+      <w:r>
+        <w:rPr/>
+        <w:t xml:space="preserve"> are zero.</w:t>
       </w:r>
     </w:p>
     <w:p>
@@ -5442,7 +6668,16 @@
       </w:pPr>
       <w:r>
         <w:rPr/>
-        <w:t>So λ balances fitting the data well against keeping the model simple.</w:t>
+        <w:t xml:space="preserve">So </w:t>
+      </w:r>
+      <m:oMath>
+        <m:r>
+          <m:t>λ</m:t>
+        </m:r>
+      </m:oMath>
+      <w:r>
+        <w:rPr/>
+        <w:t xml:space="preserve"> balances fitting the data well against keeping the model simple.</w:t>
       </w:r>
     </w:p>
     <w:p>
@@ -5465,7 +6700,369 @@
       </w:pPr>
       <w:r>
         <w:rPr/>
-        <w:t>The penalty uses absolute values |βⱼ|, which have a sharp corner at zero. Because of this corner, the best solution for a weak predictor is often exactly βⱼ = 0: if a predictor does not reduce the squared error by more than λ, its coefficient is set to zero rather than just made small. Geometrically, the LASSO constraint Σ|βⱼ| ≤ t is a diamond with corners on the axes, and the solution often falls on a corner, where some coefficients are zero. The intercept β₀ is not penalized, so it is never shrunk.</w:t>
+        <w:t xml:space="preserve">The penalty uses absolute values </w:t>
+      </w:r>
+      <m:oMath>
+        <m:d>
+          <m:dPr>
+            <m:begChr m:val="|"/>
+            <m:endChr m:val="|"/>
+            <m:sepChr m:val=""/>
+            <m:grow/>
+          </m:dPr>
+          <m:e>
+            <m:sSub>
+              <m:e>
+                <m:r>
+                  <m:t>β</m:t>
+                </m:r>
+              </m:e>
+              <m:sub>
+                <m:r>
+                  <m:t>j</m:t>
+                </m:r>
+              </m:sub>
+            </m:sSub>
+          </m:e>
+        </m:d>
+      </m:oMath>
+      <w:r>
+        <w:rPr/>
+        <w:t xml:space="preserve">, which have a sharp corner at zero. Because of this corner, the best solution for a weak predictor is often exactly </w:t>
+      </w:r>
+      <m:oMath>
+        <m:sSub>
+          <m:e>
+            <m:acc>
+              <m:accPr>
+                <m:chr m:val="̂"/>
+              </m:accPr>
+              <m:e>
+                <m:r>
+                  <m:t>β</m:t>
+                </m:r>
+              </m:e>
+            </m:acc>
+          </m:e>
+          <m:sub>
+            <m:r>
+              <m:t>j</m:t>
+            </m:r>
+          </m:sub>
+        </m:sSub>
+        <m:r>
+          <m:rPr>
+            <m:sty m:val="p"/>
+          </m:rPr>
+          <m:t>=</m:t>
+        </m:r>
+        <m:r>
+          <m:t>0</m:t>
+        </m:r>
+      </m:oMath>
+      <w:r>
+        <w:rPr/>
+        <w:t>. With standardized predictors, each LASSO estimate is a soft-thresholded value:</w:t>
+      </w:r>
+    </w:p>
+    <w:p>
+      <w:pPr>
+        <w:pBdr>
+          <w:left w:val="single" w:sz="18" w:space="8" w:color="2F5496"/>
+        </w:pBdr>
+        <w:spacing w:before="40" w:after="120"/>
+        <w:ind w:left="288"/>
+      </w:pPr>
+      <m:oMathPara>
+        <m:oMath>
+          <m:sSub>
+            <m:e>
+              <m:acc>
+                <m:accPr>
+                  <m:chr m:val="̂"/>
+                </m:accPr>
+                <m:e>
+                  <m:r>
+                    <m:t>β</m:t>
+                  </m:r>
+                </m:e>
+              </m:acc>
+            </m:e>
+            <m:sub>
+              <m:r>
+                <m:t>j</m:t>
+              </m:r>
+            </m:sub>
+          </m:sSub>
+          <m:r>
+            <m:rPr>
+              <m:sty m:val="p"/>
+            </m:rPr>
+            <m:t>=</m:t>
+          </m:r>
+          <m:r>
+            <m:rPr>
+              <m:nor/>
+              <m:sty m:val="p"/>
+            </m:rPr>
+            <m:t>sign</m:t>
+          </m:r>
+          <m:d>
+            <m:dPr>
+              <m:begChr m:val="("/>
+              <m:endChr m:val=")"/>
+              <m:sepChr m:val=""/>
+              <m:grow/>
+            </m:dPr>
+            <m:e>
+              <m:sSub>
+                <m:e>
+                  <m:r>
+                    <m:t>z</m:t>
+                  </m:r>
+                </m:e>
+                <m:sub>
+                  <m:r>
+                    <m:t>j</m:t>
+                  </m:r>
+                </m:sub>
+              </m:sSub>
+            </m:e>
+          </m:d>
+          <m:r>
+            <m:t> </m:t>
+          </m:r>
+          <m:r>
+            <m:rPr>
+              <m:nor/>
+              <m:sty m:val="p"/>
+            </m:rPr>
+            <m:t>max</m:t>
+          </m:r>
+          <m:d>
+            <m:dPr>
+              <m:begChr m:val="("/>
+              <m:endChr m:val=")"/>
+              <m:sepChr m:val=""/>
+              <m:grow/>
+            </m:dPr>
+            <m:e>
+              <m:d>
+                <m:dPr>
+                  <m:begChr m:val="|"/>
+                  <m:endChr m:val="|"/>
+                  <m:sepChr m:val=""/>
+                  <m:grow/>
+                </m:dPr>
+                <m:e>
+                  <m:sSub>
+                    <m:e>
+                      <m:r>
+                        <m:t>z</m:t>
+                      </m:r>
+                    </m:e>
+                    <m:sub>
+                      <m:r>
+                        <m:t>j</m:t>
+                      </m:r>
+                    </m:sub>
+                  </m:sSub>
+                </m:e>
+              </m:d>
+              <m:r>
+                <m:rPr>
+                  <m:sty m:val="p"/>
+                </m:rPr>
+                <m:t>−</m:t>
+              </m:r>
+              <m:r>
+                <m:t>λ</m:t>
+              </m:r>
+              <m:r>
+                <m:rPr>
+                  <m:sty m:val="p"/>
+                </m:rPr>
+                <m:t>,</m:t>
+              </m:r>
+              <m:r>
+                <m:t> </m:t>
+              </m:r>
+              <m:r>
+                <m:t>0</m:t>
+              </m:r>
+            </m:e>
+          </m:d>
+        </m:oMath>
+      </m:oMathPara>
+    </w:p>
+    <w:p>
+      <w:pPr>
+        <w:pBdr>
+          <w:left w:val="single" w:sz="18" w:space="8" w:color="2F5496"/>
+        </w:pBdr>
+        <w:spacing w:after="100" w:before="0"/>
+        <w:ind w:left="288"/>
+      </w:pPr>
+      <w:r>
+        <w:rPr/>
+        <w:t xml:space="preserve">where </w:t>
+      </w:r>
+      <m:oMath>
+        <m:sSub>
+          <m:e>
+            <m:r>
+              <m:t>z</m:t>
+            </m:r>
+          </m:e>
+          <m:sub>
+            <m:r>
+              <m:t>j</m:t>
+            </m:r>
+          </m:sub>
+        </m:sSub>
+      </m:oMath>
+      <w:r>
+        <w:rPr/>
+        <w:t xml:space="preserve"> measures the association between </w:t>
+      </w:r>
+      <m:oMath>
+        <m:sSub>
+          <m:e>
+            <m:r>
+              <m:t>X</m:t>
+            </m:r>
+          </m:e>
+          <m:sub>
+            <m:r>
+              <m:t>j</m:t>
+            </m:r>
+          </m:sub>
+        </m:sSub>
+      </m:oMath>
+      <w:r>
+        <w:rPr/>
+        <w:t xml:space="preserve"> and the current residuals. Whenever </w:t>
+      </w:r>
+      <m:oMath>
+        <m:d>
+          <m:dPr>
+            <m:begChr m:val="|"/>
+            <m:endChr m:val="|"/>
+            <m:sepChr m:val=""/>
+            <m:grow/>
+          </m:dPr>
+          <m:e>
+            <m:sSub>
+              <m:e>
+                <m:r>
+                  <m:t>z</m:t>
+                </m:r>
+              </m:e>
+              <m:sub>
+                <m:r>
+                  <m:t>j</m:t>
+                </m:r>
+              </m:sub>
+            </m:sSub>
+          </m:e>
+        </m:d>
+        <m:r>
+          <m:rPr>
+            <m:sty m:val="p"/>
+          </m:rPr>
+          <m:t>≤</m:t>
+        </m:r>
+        <m:r>
+          <m:t>λ</m:t>
+        </m:r>
+      </m:oMath>
+      <w:r>
+        <w:rPr/>
+        <w:t xml:space="preserve">, the estimate is set exactly to zero rather than just made small. Geometrically, the constraint region </w:t>
+      </w:r>
+      <m:oMath>
+        <m:nary>
+          <m:naryPr>
+            <m:chr m:val="∑"/>
+            <m:limLoc m:val="undOvr"/>
+            <m:subHide m:val="off"/>
+            <m:supHide m:val="off"/>
+          </m:naryPr>
+          <m:sub>
+            <m:r>
+              <m:t>j</m:t>
+            </m:r>
+            <m:r>
+              <m:rPr>
+                <m:sty m:val="p"/>
+              </m:rPr>
+              <m:t>=</m:t>
+            </m:r>
+            <m:r>
+              <m:t>1</m:t>
+            </m:r>
+          </m:sub>
+          <m:sup>
+            <m:r>
+              <m:t>15</m:t>
+            </m:r>
+          </m:sup>
+          <m:e>
+            <m:d>
+              <m:dPr>
+                <m:begChr m:val="|"/>
+                <m:endChr m:val="|"/>
+                <m:sepChr m:val=""/>
+                <m:grow/>
+              </m:dPr>
+              <m:e>
+                <m:sSub>
+                  <m:e>
+                    <m:r>
+                      <m:t>β</m:t>
+                    </m:r>
+                  </m:e>
+                  <m:sub>
+                    <m:r>
+                      <m:t>j</m:t>
+                    </m:r>
+                  </m:sub>
+                </m:sSub>
+              </m:e>
+            </m:d>
+          </m:e>
+        </m:nary>
+        <m:r>
+          <m:rPr>
+            <m:sty m:val="p"/>
+          </m:rPr>
+          <m:t>≤</m:t>
+        </m:r>
+        <m:r>
+          <m:t>t</m:t>
+        </m:r>
+      </m:oMath>
+      <w:r>
+        <w:rPr/>
+        <w:t xml:space="preserve"> is a diamond with corners on the axes, and the solution often falls on a corner, where some coefficients are zero. The intercept </w:t>
+      </w:r>
+      <m:oMath>
+        <m:sSub>
+          <m:e>
+            <m:r>
+              <m:t>β</m:t>
+            </m:r>
+          </m:e>
+          <m:sub>
+            <m:r>
+              <m:t>0</m:t>
+            </m:r>
+          </m:sub>
+        </m:sSub>
+      </m:oMath>
+      <w:r>
+        <w:rPr/>
+        <w:t xml:space="preserve"> is not penalized, so it is never shrunk.</w:t>
       </w:r>
     </w:p>
     <w:p>
@@ -5565,22 +7162,42 @@
         <w:spacing w:after="100" w:before="0"/>
         <w:ind w:left="288"/>
       </w:pPr>
-      <w:r>
-        <w:rPr>
-          <w:b/>
-        </w:rPr>
-        <w:t>lambda.min = 0.5070394</w:t>
-      </w:r>
+      <m:oMath>
+        <m:sSub>
+          <m:e>
+            <m:r>
+              <m:t>λ</m:t>
+            </m:r>
+          </m:e>
+          <m:sub>
+            <m:r>
+              <m:rPr>
+                <m:nor/>
+                <m:sty m:val="p"/>
+              </m:rPr>
+              <m:t>min</m:t>
+            </m:r>
+          </m:sub>
+        </m:sSub>
+        <m:r>
+          <m:rPr>
+            <m:sty m:val="p"/>
+          </m:rPr>
+          <m:t>=</m:t>
+        </m:r>
+        <m:r>
+          <m:t>0.5070394</m:t>
+        </m:r>
+      </m:oMath>
       <w:r>
         <w:rPr/>
-        <w:t xml:space="preserve">, giving the smallest cross-validation MSE of </w:t>
-      </w:r>
-      <w:r>
-        <w:rPr>
-          <w:b/>
-        </w:rPr>
-        <w:t>44.2725</w:t>
-      </w:r>
+        <w:t xml:space="preserve"> (lambda.min), giving the smallest cross-validation MSE of </w:t>
+      </w:r>
+      <m:oMath>
+        <m:r>
+          <m:t>44.2725</m:t>
+        </m:r>
+      </m:oMath>
       <w:r>
         <w:rPr/>
         <w:t>.</w:t>
@@ -5788,7 +7405,271 @@
       </w:pPr>
       <w:r>
         <w:rPr/>
-        <w:t xml:space="preserve">The data are randomly split into 10 folds (seed 6166). For each value of λ, the LASSO model is fitted on 9 folds and its mean squared error is computed on the remaining fold. This is repeated so that each fold is left out once, and the 10 errors are averaged to give the cross-validation MSE for that λ. The λ with the </w:t>
+        <w:t xml:space="preserve">The data are randomly split into 10 folds (seed 6166). For each value of </w:t>
+      </w:r>
+      <m:oMath>
+        <m:r>
+          <m:t>λ</m:t>
+        </m:r>
+      </m:oMath>
+      <w:r>
+        <w:rPr/>
+        <w:t xml:space="preserve">, the LASSO model is fitted on 9 folds and its mean squared error </w:t>
+      </w:r>
+      <m:oMath>
+        <m:sSub>
+          <m:e>
+            <m:r>
+              <m:rPr>
+                <m:nor/>
+                <m:sty m:val="p"/>
+              </m:rPr>
+              <m:t>MSE</m:t>
+            </m:r>
+          </m:e>
+          <m:sub>
+            <m:r>
+              <m:t>k</m:t>
+            </m:r>
+          </m:sub>
+        </m:sSub>
+        <m:d>
+          <m:dPr>
+            <m:begChr m:val="("/>
+            <m:endChr m:val=")"/>
+            <m:sepChr m:val=""/>
+            <m:grow/>
+          </m:dPr>
+          <m:e>
+            <m:r>
+              <m:t>λ</m:t>
+            </m:r>
+          </m:e>
+        </m:d>
+      </m:oMath>
+      <w:r>
+        <w:rPr/>
+        <w:t xml:space="preserve"> is computed on the left-out fold </w:t>
+      </w:r>
+      <m:oMath>
+        <m:r>
+          <m:t>k</m:t>
+        </m:r>
+      </m:oMath>
+      <w:r>
+        <w:rPr/>
+        <w:t>. Repeating this so that each fold is left out once and averaging gives the cross-validation error:</w:t>
+      </w:r>
+    </w:p>
+    <w:p>
+      <w:pPr>
+        <w:pBdr>
+          <w:left w:val="single" w:sz="18" w:space="8" w:color="2F5496"/>
+        </w:pBdr>
+        <w:spacing w:before="40" w:after="120"/>
+        <w:ind w:left="288"/>
+      </w:pPr>
+      <m:oMathPara>
+        <m:oMath>
+          <m:r>
+            <m:rPr>
+              <m:nor/>
+              <m:sty m:val="p"/>
+            </m:rPr>
+            <m:t>CV</m:t>
+          </m:r>
+          <m:d>
+            <m:dPr>
+              <m:begChr m:val="("/>
+              <m:endChr m:val=")"/>
+              <m:sepChr m:val=""/>
+              <m:grow/>
+            </m:dPr>
+            <m:e>
+              <m:r>
+                <m:t>λ</m:t>
+              </m:r>
+            </m:e>
+          </m:d>
+          <m:r>
+            <m:rPr>
+              <m:sty m:val="p"/>
+            </m:rPr>
+            <m:t>=</m:t>
+          </m:r>
+          <m:f>
+            <m:fPr>
+              <m:type m:val="bar"/>
+            </m:fPr>
+            <m:num>
+              <m:r>
+                <m:t>1</m:t>
+              </m:r>
+            </m:num>
+            <m:den>
+              <m:r>
+                <m:t>10</m:t>
+              </m:r>
+            </m:den>
+          </m:f>
+          <m:nary>
+            <m:naryPr>
+              <m:chr m:val="∑"/>
+              <m:limLoc m:val="undOvr"/>
+              <m:subHide m:val="off"/>
+              <m:supHide m:val="off"/>
+            </m:naryPr>
+            <m:sub>
+              <m:r>
+                <m:t>k</m:t>
+              </m:r>
+              <m:r>
+                <m:rPr>
+                  <m:sty m:val="p"/>
+                </m:rPr>
+                <m:t>=</m:t>
+              </m:r>
+              <m:r>
+                <m:t>1</m:t>
+              </m:r>
+            </m:sub>
+            <m:sup>
+              <m:r>
+                <m:t>10</m:t>
+              </m:r>
+            </m:sup>
+            <m:e>
+              <m:sSub>
+                <m:e>
+                  <m:r>
+                    <m:rPr>
+                      <m:nor/>
+                      <m:sty m:val="p"/>
+                    </m:rPr>
+                    <m:t>MSE</m:t>
+                  </m:r>
+                </m:e>
+                <m:sub>
+                  <m:r>
+                    <m:t>k</m:t>
+                  </m:r>
+                </m:sub>
+              </m:sSub>
+            </m:e>
+          </m:nary>
+          <m:d>
+            <m:dPr>
+              <m:begChr m:val="("/>
+              <m:endChr m:val=")"/>
+              <m:sepChr m:val=""/>
+              <m:grow/>
+            </m:dPr>
+            <m:e>
+              <m:r>
+                <m:t>λ</m:t>
+              </m:r>
+            </m:e>
+          </m:d>
+          <m:r>
+            <m:rPr>
+              <m:sty m:val="p"/>
+            </m:rPr>
+            <m:t>,</m:t>
+          </m:r>
+          <m:r>
+            <m:t>  </m:t>
+          </m:r>
+          <m:sSub>
+            <m:e>
+              <m:r>
+                <m:t>λ</m:t>
+              </m:r>
+            </m:e>
+            <m:sub>
+              <m:r>
+                <m:rPr>
+                  <m:nor/>
+                  <m:sty m:val="p"/>
+                </m:rPr>
+                <m:t>min</m:t>
+              </m:r>
+            </m:sub>
+          </m:sSub>
+          <m:r>
+            <m:rPr>
+              <m:sty m:val="p"/>
+            </m:rPr>
+            <m:t>=</m:t>
+          </m:r>
+          <m:r>
+            <m:rPr>
+              <m:nor/>
+              <m:sty m:val="p"/>
+            </m:rPr>
+            <m:t>arg</m:t>
+          </m:r>
+          <m:sSub>
+            <m:e>
+              <m:r>
+                <m:rPr>
+                  <m:nor/>
+                  <m:sty m:val="p"/>
+                </m:rPr>
+                <m:t>min</m:t>
+              </m:r>
+            </m:e>
+            <m:sub>
+              <m:r>
+                <m:t>λ</m:t>
+              </m:r>
+            </m:sub>
+          </m:sSub>
+          <m:r>
+            <m:t> </m:t>
+          </m:r>
+          <m:r>
+            <m:rPr>
+              <m:nor/>
+              <m:sty m:val="p"/>
+            </m:rPr>
+            <m:t>CV</m:t>
+          </m:r>
+          <m:d>
+            <m:dPr>
+              <m:begChr m:val="("/>
+              <m:endChr m:val=")"/>
+              <m:sepChr m:val=""/>
+              <m:grow/>
+            </m:dPr>
+            <m:e>
+              <m:r>
+                <m:t>λ</m:t>
+              </m:r>
+            </m:e>
+          </m:d>
+        </m:oMath>
+      </m:oMathPara>
+    </w:p>
+    <w:p>
+      <w:pPr>
+        <w:pBdr>
+          <w:left w:val="single" w:sz="18" w:space="8" w:color="2F5496"/>
+        </w:pBdr>
+        <w:spacing w:after="100" w:before="0"/>
+        <w:ind w:left="288"/>
+      </w:pPr>
+      <w:r>
+        <w:rPr/>
+        <w:t xml:space="preserve">The </w:t>
+      </w:r>
+      <m:oMath>
+        <m:r>
+          <m:t>λ</m:t>
+        </m:r>
+      </m:oMath>
+      <w:r>
+        <w:rPr/>
+        <w:t xml:space="preserve"> with the </w:t>
       </w:r>
       <w:r>
         <w:rPr>
@@ -5798,7 +7679,16 @@
       </w:r>
       <w:r>
         <w:rPr/>
-        <w:t xml:space="preserve"> is lambda.min. A λ that is too small overfits the data, and one that is too large shrinks the coefficients too much, so the minimum lies in between. lambda.min is used for the rest of the analysis.</w:t>
+        <w:t xml:space="preserve"> is lambda.min. A </w:t>
+      </w:r>
+      <m:oMath>
+        <m:r>
+          <m:t>λ</m:t>
+        </m:r>
+      </m:oMath>
+      <w:r>
+        <w:rPr/>
+        <w:t xml:space="preserve"> that is too small overfits the data, and one that is too large shrinks the coefficients too much, so the minimum lies in between. lambda.min is used for the rest of the analysis.</w:t>
       </w:r>
     </w:p>
     <w:p>
@@ -6855,7 +8745,148 @@
       </w:r>
       <w:r>
         <w:rPr/>
-        <w:t xml:space="preserve"> the penalty shrinks the coefficients toward zero compared with ordinary least squares. For example, the estimate for X10 drops from 7.2157 (full model) to 6.6284, and X13 from −2.6675 to −1.6222. Weak predictors shrink the most: X6 drops from 0.9065 to only 0.0682.</w:t>
+        <w:t xml:space="preserve"> the penalty shrinks the coefficients toward zero compared with ordinary least squares. For example, </w:t>
+      </w:r>
+      <m:oMath>
+        <m:sSub>
+          <m:e>
+            <m:acc>
+              <m:accPr>
+                <m:chr m:val="̂"/>
+              </m:accPr>
+              <m:e>
+                <m:r>
+                  <m:t>β</m:t>
+                </m:r>
+              </m:e>
+            </m:acc>
+          </m:e>
+          <m:sub>
+            <m:r>
+              <m:t>10</m:t>
+            </m:r>
+          </m:sub>
+        </m:sSub>
+      </m:oMath>
+      <w:r>
+        <w:rPr/>
+        <w:t xml:space="preserve"> drops from </w:t>
+      </w:r>
+      <m:oMath>
+        <m:r>
+          <m:t>7.2157</m:t>
+        </m:r>
+      </m:oMath>
+      <w:r>
+        <w:rPr/>
+        <w:t xml:space="preserve"> (full model) to </w:t>
+      </w:r>
+      <m:oMath>
+        <m:r>
+          <m:t>6.6284</m:t>
+        </m:r>
+      </m:oMath>
+      <w:r>
+        <w:rPr/>
+        <w:t xml:space="preserve">, and </w:t>
+      </w:r>
+      <m:oMath>
+        <m:sSub>
+          <m:e>
+            <m:acc>
+              <m:accPr>
+                <m:chr m:val="̂"/>
+              </m:accPr>
+              <m:e>
+                <m:r>
+                  <m:t>β</m:t>
+                </m:r>
+              </m:e>
+            </m:acc>
+          </m:e>
+          <m:sub>
+            <m:r>
+              <m:t>13</m:t>
+            </m:r>
+          </m:sub>
+        </m:sSub>
+      </m:oMath>
+      <w:r>
+        <w:rPr/>
+        <w:t xml:space="preserve"> from </w:t>
+      </w:r>
+      <m:oMath>
+        <m:r>
+          <m:rPr>
+            <m:sty m:val="p"/>
+          </m:rPr>
+          <m:t>−</m:t>
+        </m:r>
+        <m:r>
+          <m:t>2.6675</m:t>
+        </m:r>
+      </m:oMath>
+      <w:r>
+        <w:rPr/>
+        <w:t xml:space="preserve"> to </w:t>
+      </w:r>
+      <m:oMath>
+        <m:r>
+          <m:rPr>
+            <m:sty m:val="p"/>
+          </m:rPr>
+          <m:t>−</m:t>
+        </m:r>
+        <m:r>
+          <m:t>1.6222</m:t>
+        </m:r>
+      </m:oMath>
+      <w:r>
+        <w:rPr/>
+        <w:t xml:space="preserve">. Weak predictors shrink the most: </w:t>
+      </w:r>
+      <m:oMath>
+        <m:sSub>
+          <m:e>
+            <m:acc>
+              <m:accPr>
+                <m:chr m:val="̂"/>
+              </m:accPr>
+              <m:e>
+                <m:r>
+                  <m:t>β</m:t>
+                </m:r>
+              </m:e>
+            </m:acc>
+          </m:e>
+          <m:sub>
+            <m:r>
+              <m:t>6</m:t>
+            </m:r>
+          </m:sub>
+        </m:sSub>
+      </m:oMath>
+      <w:r>
+        <w:rPr/>
+        <w:t xml:space="preserve"> drops from </w:t>
+      </w:r>
+      <m:oMath>
+        <m:r>
+          <m:t>0.9065</m:t>
+        </m:r>
+      </m:oMath>
+      <w:r>
+        <w:rPr/>
+        <w:t xml:space="preserve"> to only </w:t>
+      </w:r>
+      <m:oMath>
+        <m:r>
+          <m:t>0.0682</m:t>
+        </m:r>
+      </m:oMath>
+      <w:r>
+        <w:rPr/>
+        <w:t>.</w:t>
       </w:r>
     </w:p>
     <w:p>
@@ -6874,7 +8905,41 @@
       </w:r>
       <w:r>
         <w:rPr/>
-        <w:t xml:space="preserve"> a predictor whose contribution to reducing the squared error is smaller than the penalty is set exactly to zero. Here X2, X3, X8, X9, X11, X12 and X15 were excluded; they were all far from significant in the full model.</w:t>
+        <w:t xml:space="preserve"> a predictor whose contribution to reducing the squared error is smaller than the penalty is set exactly to zero (</w:t>
+      </w:r>
+      <m:oMath>
+        <m:sSub>
+          <m:e>
+            <m:acc>
+              <m:accPr>
+                <m:chr m:val="̂"/>
+              </m:accPr>
+              <m:e>
+                <m:r>
+                  <m:t>β</m:t>
+                </m:r>
+              </m:e>
+            </m:acc>
+          </m:e>
+          <m:sub>
+            <m:r>
+              <m:t>j</m:t>
+            </m:r>
+          </m:sub>
+        </m:sSub>
+        <m:r>
+          <m:rPr>
+            <m:sty m:val="p"/>
+          </m:rPr>
+          <m:t>=</m:t>
+        </m:r>
+        <m:r>
+          <m:t>0</m:t>
+        </m:r>
+      </m:oMath>
+      <w:r>
+        <w:rPr/>
+        <w:t>). Here X2, X3, X8, X9, X11, X12 and X15 were excluded; they were all far from significant in the full model.</w:t>
       </w:r>
     </w:p>
     <w:p>
@@ -6893,7 +8958,34 @@
       </w:r>
       <w:r>
         <w:rPr/>
-        <w:t xml:space="preserve"> the larger λ is, the sparser the model. The numbers on top of Figure 2 show the number of nonzero coefficients falling from 15 at small λ, to 8 at lambda.min, 6 at lambda.1se, and 0 at the largest λ.</w:t>
+        <w:t xml:space="preserve"> the larger </w:t>
+      </w:r>
+      <m:oMath>
+        <m:r>
+          <m:t>λ</m:t>
+        </m:r>
+      </m:oMath>
+      <w:r>
+        <w:rPr/>
+        <w:t xml:space="preserve"> is, the sparser the model. The numbers on top of Figure 2 show the number of nonzero coefficients falling from 15 at small </w:t>
+      </w:r>
+      <m:oMath>
+        <m:r>
+          <m:t>λ</m:t>
+        </m:r>
+      </m:oMath>
+      <w:r>
+        <w:rPr/>
+        <w:t xml:space="preserve">, to 8 at lambda.min, 6 at lambda.1se, and 0 at the largest </w:t>
+      </w:r>
+      <m:oMath>
+        <m:r>
+          <m:t>λ</m:t>
+        </m:r>
+      </m:oMath>
+      <w:r>
+        <w:rPr/>
+        <w:t>.</w:t>
       </w:r>
     </w:p>
     <w:p>
@@ -7845,7 +9937,43 @@
       </w:r>
       <w:r>
         <w:rPr/>
-        <w:t xml:space="preserve"> BIC has a heavy penalty for each extra predictor and aims for a simple model, whereas lambda.min minimizes cross-validation prediction error, which often keeps a few weak predictors. In the code, AIC and Cp also kept 7 predictors and adjusted R² kept the same 8 as LASSO.</w:t>
+        <w:t xml:space="preserve"> BIC has a heavy penalty for each extra predictor and aims for a simple model, whereas lambda.min minimizes cross-validation prediction error, which often keeps a few weak predictors. In the code, AIC and </w:t>
+      </w:r>
+      <m:oMath>
+        <m:sSub>
+          <m:e>
+            <m:r>
+              <m:t>C</m:t>
+            </m:r>
+          </m:e>
+          <m:sub>
+            <m:r>
+              <m:t>p</m:t>
+            </m:r>
+          </m:sub>
+        </m:sSub>
+      </m:oMath>
+      <w:r>
+        <w:rPr/>
+        <w:t xml:space="preserve"> also kept 7 predictors and adjusted </w:t>
+      </w:r>
+      <m:oMath>
+        <m:sSup>
+          <m:e>
+            <m:r>
+              <m:t>R</m:t>
+            </m:r>
+          </m:e>
+          <m:sup>
+            <m:r>
+              <m:t>2</m:t>
+            </m:r>
+          </m:sup>
+        </m:sSup>
+      </m:oMath>
+      <w:r>
+        <w:rPr/>
+        <w:t xml:space="preserve"> kept the same 8 as LASSO.</w:t>
       </w:r>
     </w:p>
     <w:p>
@@ -7865,7 +9993,41 @@
       </w:r>
       <w:r>
         <w:rPr/>
-        <w:t xml:space="preserve"> LASSO can keep a weak predictor with a very small coefficient (e.g., X6 = 0.068), while classical selection must include a predictor at its full OLS estimate or drop it completely.</w:t>
+        <w:t xml:space="preserve"> LASSO can keep a weak predictor with a very small coefficient (e.g., </w:t>
+      </w:r>
+      <m:oMath>
+        <m:sSub>
+          <m:e>
+            <m:acc>
+              <m:accPr>
+                <m:chr m:val="̂"/>
+              </m:accPr>
+              <m:e>
+                <m:r>
+                  <m:t>β</m:t>
+                </m:r>
+              </m:e>
+            </m:acc>
+          </m:e>
+          <m:sub>
+            <m:r>
+              <m:t>6</m:t>
+            </m:r>
+          </m:sub>
+        </m:sSub>
+        <m:r>
+          <m:rPr>
+            <m:sty m:val="p"/>
+          </m:rPr>
+          <m:t>=</m:t>
+        </m:r>
+        <m:r>
+          <m:t>0.068</m:t>
+        </m:r>
+      </m:oMath>
+      <w:r>
+        <w:rPr/>
+        <w:t>), while classical selection must include a predictor at its full OLS estimate or drop it completely.</w:t>
       </w:r>
     </w:p>
     <w:p>
@@ -7956,7 +10118,109 @@
       </w:r>
       <w:r>
         <w:rPr/>
-        <w:t xml:space="preserve"> its five predictors are exactly the ones both methods agree on. The three extra LASSO predictors have small coefficients (X5 = 0.418, X6 = 0.068, X7 = 0.899) and were not significant in the full model.</w:t>
+        <w:t xml:space="preserve"> its five predictors are exactly the ones both methods agree on. The three extra LASSO predictors have small coefficients (</w:t>
+      </w:r>
+      <m:oMath>
+        <m:sSub>
+          <m:e>
+            <m:acc>
+              <m:accPr>
+                <m:chr m:val="̂"/>
+              </m:accPr>
+              <m:e>
+                <m:r>
+                  <m:t>β</m:t>
+                </m:r>
+              </m:e>
+            </m:acc>
+          </m:e>
+          <m:sub>
+            <m:r>
+              <m:t>5</m:t>
+            </m:r>
+          </m:sub>
+        </m:sSub>
+        <m:r>
+          <m:rPr>
+            <m:sty m:val="p"/>
+          </m:rPr>
+          <m:t>=</m:t>
+        </m:r>
+        <m:r>
+          <m:t>0.418</m:t>
+        </m:r>
+      </m:oMath>
+      <w:r>
+        <w:rPr/>
+        <w:t xml:space="preserve">, </w:t>
+      </w:r>
+      <m:oMath>
+        <m:sSub>
+          <m:e>
+            <m:acc>
+              <m:accPr>
+                <m:chr m:val="̂"/>
+              </m:accPr>
+              <m:e>
+                <m:r>
+                  <m:t>β</m:t>
+                </m:r>
+              </m:e>
+            </m:acc>
+          </m:e>
+          <m:sub>
+            <m:r>
+              <m:t>6</m:t>
+            </m:r>
+          </m:sub>
+        </m:sSub>
+        <m:r>
+          <m:rPr>
+            <m:sty m:val="p"/>
+          </m:rPr>
+          <m:t>=</m:t>
+        </m:r>
+        <m:r>
+          <m:t>0.068</m:t>
+        </m:r>
+      </m:oMath>
+      <w:r>
+        <w:rPr/>
+        <w:t xml:space="preserve">, </w:t>
+      </w:r>
+      <m:oMath>
+        <m:sSub>
+          <m:e>
+            <m:acc>
+              <m:accPr>
+                <m:chr m:val="̂"/>
+              </m:accPr>
+              <m:e>
+                <m:r>
+                  <m:t>β</m:t>
+                </m:r>
+              </m:e>
+            </m:acc>
+          </m:e>
+          <m:sub>
+            <m:r>
+              <m:t>7</m:t>
+            </m:r>
+          </m:sub>
+        </m:sSub>
+        <m:r>
+          <m:rPr>
+            <m:sty m:val="p"/>
+          </m:rPr>
+          <m:t>=</m:t>
+        </m:r>
+        <m:r>
+          <m:t>0.899</m:t>
+        </m:r>
+      </m:oMath>
+      <w:r>
+        <w:rPr/>
+        <w:t>) and were not significant in the full model.</w:t>
       </w:r>
     </w:p>
     <w:p>
@@ -7976,7 +10240,52 @@
       </w:r>
       <w:r>
         <w:rPr/>
-        <w:t xml:space="preserve"> its adjusted R² (0.5925) is higher than the full model's (0.5882), the forward, backward and stepwise BIC searches all gave the same model, and print(cv_lasso) shows that the more conservative lambda.1se would keep only 6 predictors.</w:t>
+        <w:t xml:space="preserve"> its </w:t>
+      </w:r>
+      <m:oMath>
+        <m:sSubSup>
+          <m:e>
+            <m:r>
+              <m:t>R</m:t>
+            </m:r>
+          </m:e>
+          <m:sub>
+            <m:r>
+              <m:rPr>
+                <m:nor/>
+                <m:sty m:val="p"/>
+              </m:rPr>
+              <m:t>adj</m:t>
+            </m:r>
+          </m:sub>
+          <m:sup>
+            <m:r>
+              <m:t>2</m:t>
+            </m:r>
+          </m:sup>
+        </m:sSubSup>
+        <m:r>
+          <m:rPr>
+            <m:sty m:val="p"/>
+          </m:rPr>
+          <m:t>=</m:t>
+        </m:r>
+        <m:r>
+          <m:t>0.5925</m:t>
+        </m:r>
+      </m:oMath>
+      <w:r>
+        <w:rPr/>
+        <w:t xml:space="preserve"> is higher than the full model's </w:t>
+      </w:r>
+      <m:oMath>
+        <m:r>
+          <m:t>0.5882</m:t>
+        </m:r>
+      </m:oMath>
+      <w:r>
+        <w:rPr/>
+        <w:t>, the forward, backward and stepwise BIC searches all gave the same model, and print(cv_lasso) shows that the more conservative lambda.1se would keep only 6 predictors.</w:t>
       </w:r>
     </w:p>
     <w:p>

</xml_diff>